<commit_message>
Deployed 6ff7e83 with MkDocs version: 1.6.1
</commit_message>
<xml_diff>
--- a/Buch Camille Chronicles/Character-Bios.docx
+++ b/Buch Camille Chronicles/Character-Bios.docx
@@ -132,12 +132,14 @@
           <w:lang w:val="en-US"/>
         </w:rPr>
       </w:pPr>
+      <w:proofErr w:type="spellStart"/>
       <w:r>
         <w:rPr>
           <w:lang w:val="en-US"/>
         </w:rPr>
         <w:t>Bodyform</w:t>
       </w:r>
+      <w:proofErr w:type="spellEnd"/>
       <w:r>
         <w:rPr>
           <w:lang w:val="en-US"/>
@@ -390,11 +392,19 @@
           <w:lang w:val="en-US"/>
         </w:rPr>
       </w:pPr>
-      <w:r>
-        <w:rPr>
-          <w:lang w:val="en-US"/>
-        </w:rPr>
-        <w:t>Bodyform:</w:t>
+      <w:proofErr w:type="spellStart"/>
+      <w:r>
+        <w:rPr>
+          <w:lang w:val="en-US"/>
+        </w:rPr>
+        <w:t>Bodyform</w:t>
+      </w:r>
+      <w:proofErr w:type="spellEnd"/>
+      <w:r>
+        <w:rPr>
+          <w:lang w:val="en-US"/>
+        </w:rPr>
+        <w:t>:</w:t>
       </w:r>
       <w:r>
         <w:rPr>
@@ -455,15 +465,18 @@
       <w:r>
         <w:rPr>
           <w:rFonts w:hint="eastAsia"/>
+          <w:lang w:val="en-US"/>
         </w:rPr>
         <w:t xml:space="preserve"> </w:t>
       </w:r>
+      <w:proofErr w:type="spellStart"/>
       <w:r>
         <w:rPr>
           <w:lang w:val="en-US"/>
         </w:rPr>
         <w:t>Rintreahr</w:t>
       </w:r>
+      <w:proofErr w:type="spellEnd"/>
     </w:p>
     <w:p>
       <w:pPr>
@@ -513,8 +526,16 @@
         <w:rPr>
           <w:lang w:val="en-US"/>
         </w:rPr>
-        <w:t xml:space="preserve"> Bodymagic</w:t>
-      </w:r>
+        <w:t xml:space="preserve"> </w:t>
+      </w:r>
+      <w:proofErr w:type="spellStart"/>
+      <w:r>
+        <w:rPr>
+          <w:lang w:val="en-US"/>
+        </w:rPr>
+        <w:t>Bodymagic</w:t>
+      </w:r>
+      <w:proofErr w:type="spellEnd"/>
     </w:p>
     <w:p>
       <w:pPr>
@@ -628,12 +649,28 @@
           </mc:Fallback>
         </mc:AlternateContent>
       </w:r>
-      <w:r>
-        <w:rPr>
-          <w:lang w:val="en-US"/>
-        </w:rPr>
-        <w:t>Herriar Ormarill</w:t>
-      </w:r>
+      <w:proofErr w:type="spellStart"/>
+      <w:r>
+        <w:rPr>
+          <w:lang w:val="en-US"/>
+        </w:rPr>
+        <w:t>Herriar</w:t>
+      </w:r>
+      <w:proofErr w:type="spellEnd"/>
+      <w:r>
+        <w:rPr>
+          <w:lang w:val="en-US"/>
+        </w:rPr>
+        <w:t xml:space="preserve"> </w:t>
+      </w:r>
+      <w:proofErr w:type="spellStart"/>
+      <w:r>
+        <w:rPr>
+          <w:lang w:val="en-US"/>
+        </w:rPr>
+        <w:t>Ormarill</w:t>
+      </w:r>
+      <w:proofErr w:type="spellEnd"/>
     </w:p>
     <w:p>
       <w:pPr>
@@ -654,11 +691,19 @@
           <w:lang w:val="en-US"/>
         </w:rPr>
       </w:pPr>
-      <w:r>
-        <w:rPr>
-          <w:lang w:val="en-US"/>
-        </w:rPr>
-        <w:t>Bodyform:</w:t>
+      <w:proofErr w:type="spellStart"/>
+      <w:r>
+        <w:rPr>
+          <w:lang w:val="en-US"/>
+        </w:rPr>
+        <w:t>Bodyform</w:t>
+      </w:r>
+      <w:proofErr w:type="spellEnd"/>
+      <w:r>
+        <w:rPr>
+          <w:lang w:val="en-US"/>
+        </w:rPr>
+        <w:t>:</w:t>
       </w:r>
       <w:r>
         <w:rPr>
@@ -741,8 +786,16 @@
         <w:rPr>
           <w:lang w:val="en-US"/>
         </w:rPr>
-        <w:t xml:space="preserve"> Bodymagic</w:t>
-      </w:r>
+        <w:t xml:space="preserve"> </w:t>
+      </w:r>
+      <w:proofErr w:type="spellStart"/>
+      <w:r>
+        <w:rPr>
+          <w:lang w:val="en-US"/>
+        </w:rPr>
+        <w:t>Bodymagic</w:t>
+      </w:r>
+      <w:proofErr w:type="spellEnd"/>
     </w:p>
     <w:p>
       <w:pPr>
@@ -774,7 +827,21 @@
         <w:rPr>
           <w:lang w:val="en-US"/>
         </w:rPr>
-        <w:t xml:space="preserve"> The Soul that is bound to Camille, tells that he had died of old age so Camille could acquire Bodymagic (instead he had a heart attack while having sex with a prostitute)</w:t>
+        <w:t xml:space="preserve"> The Soul that is bound to Camille, tells that he had died of old age so Camille could acquire </w:t>
+      </w:r>
+      <w:proofErr w:type="spellStart"/>
+      <w:r>
+        <w:rPr>
+          <w:lang w:val="en-US"/>
+        </w:rPr>
+        <w:t>Bodymagic</w:t>
+      </w:r>
+      <w:proofErr w:type="spellEnd"/>
+      <w:r>
+        <w:rPr>
+          <w:lang w:val="en-US"/>
+        </w:rPr>
+        <w:t xml:space="preserve"> (instead he had a heart attack while having sex with a prostitute)</w:t>
       </w:r>
     </w:p>
     <w:p>
@@ -882,12 +949,14 @@
           </mc:Fallback>
         </mc:AlternateContent>
       </w:r>
+      <w:proofErr w:type="spellStart"/>
       <w:r>
         <w:rPr>
           <w:lang w:val="en-US"/>
         </w:rPr>
         <w:t>Darior</w:t>
       </w:r>
+      <w:proofErr w:type="spellEnd"/>
     </w:p>
     <w:p>
       <w:pPr>
@@ -914,11 +983,19 @@
           <w:lang w:val="en-US"/>
         </w:rPr>
       </w:pPr>
-      <w:r>
-        <w:rPr>
-          <w:lang w:val="en-US"/>
-        </w:rPr>
-        <w:t>Bodyform:</w:t>
+      <w:proofErr w:type="spellStart"/>
+      <w:r>
+        <w:rPr>
+          <w:lang w:val="en-US"/>
+        </w:rPr>
+        <w:t>Bodyform</w:t>
+      </w:r>
+      <w:proofErr w:type="spellEnd"/>
+      <w:r>
+        <w:rPr>
+          <w:lang w:val="en-US"/>
+        </w:rPr>
+        <w:t>:</w:t>
       </w:r>
       <w:r>
         <w:rPr>
@@ -1001,8 +1078,16 @@
         <w:rPr>
           <w:lang w:val="en-US"/>
         </w:rPr>
-        <w:t xml:space="preserve"> Swordslinger</w:t>
-      </w:r>
+        <w:t xml:space="preserve"> </w:t>
+      </w:r>
+      <w:proofErr w:type="spellStart"/>
+      <w:r>
+        <w:rPr>
+          <w:lang w:val="en-US"/>
+        </w:rPr>
+        <w:t>Swordslinger</w:t>
+      </w:r>
+      <w:proofErr w:type="spellEnd"/>
     </w:p>
     <w:p>
       <w:pPr>
@@ -1122,12 +1207,14 @@
           </mc:Fallback>
         </mc:AlternateContent>
       </w:r>
+      <w:proofErr w:type="spellStart"/>
       <w:r>
         <w:rPr>
           <w:lang w:val="en-US"/>
         </w:rPr>
         <w:t>Clevar</w:t>
       </w:r>
+      <w:proofErr w:type="spellEnd"/>
     </w:p>
     <w:p>
       <w:pPr>
@@ -1154,11 +1241,19 @@
           <w:lang w:val="en-US"/>
         </w:rPr>
       </w:pPr>
-      <w:r>
-        <w:rPr>
-          <w:lang w:val="en-US"/>
-        </w:rPr>
-        <w:t>Bodyform:</w:t>
+      <w:proofErr w:type="spellStart"/>
+      <w:r>
+        <w:rPr>
+          <w:lang w:val="en-US"/>
+        </w:rPr>
+        <w:t>Bodyform</w:t>
+      </w:r>
+      <w:proofErr w:type="spellEnd"/>
+      <w:r>
+        <w:rPr>
+          <w:lang w:val="en-US"/>
+        </w:rPr>
+        <w:t>:</w:t>
       </w:r>
       <w:r>
         <w:rPr>
@@ -1241,8 +1336,16 @@
         <w:rPr>
           <w:lang w:val="en-US"/>
         </w:rPr>
-        <w:t xml:space="preserve"> Swordslinger</w:t>
-      </w:r>
+        <w:t xml:space="preserve"> </w:t>
+      </w:r>
+      <w:proofErr w:type="spellStart"/>
+      <w:r>
+        <w:rPr>
+          <w:lang w:val="en-US"/>
+        </w:rPr>
+        <w:t>Swordslinger</w:t>
+      </w:r>
+      <w:proofErr w:type="spellEnd"/>
     </w:p>
     <w:p>
       <w:pPr>
@@ -1276,6 +1379,20 @@
         </w:rPr>
         <w:t xml:space="preserve"> leader of the mercenary band Camille was in, throws her out after another job gone wrong</w:t>
       </w:r>
+    </w:p>
+    <w:p>
+      <w:pPr>
+        <w:rPr>
+          <w:lang w:val="en-US"/>
+        </w:rPr>
+      </w:pPr>
+    </w:p>
+    <w:p>
+      <w:pPr>
+        <w:rPr>
+          <w:lang w:val="en-US"/>
+        </w:rPr>
+      </w:pPr>
     </w:p>
     <w:p>
       <w:pPr>
@@ -1386,7 +1503,21 @@
         <w:rPr>
           <w:lang w:val="en-US"/>
         </w:rPr>
-        <w:t xml:space="preserve"> Bureaucratess Nalli</w:t>
+        <w:t xml:space="preserve"> </w:t>
+      </w:r>
+      <w:proofErr w:type="spellStart"/>
+      <w:r>
+        <w:rPr>
+          <w:lang w:val="en-US"/>
+        </w:rPr>
+        <w:t>Bureaucratess</w:t>
+      </w:r>
+      <w:proofErr w:type="spellEnd"/>
+      <w:r>
+        <w:rPr>
+          <w:lang w:val="en-US"/>
+        </w:rPr>
+        <w:t xml:space="preserve"> Nalli</w:t>
       </w:r>
     </w:p>
     <w:p>
@@ -1414,11 +1545,19 @@
           <w:lang w:val="en-US"/>
         </w:rPr>
       </w:pPr>
-      <w:r>
-        <w:rPr>
-          <w:lang w:val="en-US"/>
-        </w:rPr>
-        <w:t>Bodyform:</w:t>
+      <w:proofErr w:type="spellStart"/>
+      <w:r>
+        <w:rPr>
+          <w:lang w:val="en-US"/>
+        </w:rPr>
+        <w:t>Bodyform</w:t>
+      </w:r>
+      <w:proofErr w:type="spellEnd"/>
+      <w:r>
+        <w:rPr>
+          <w:lang w:val="en-US"/>
+        </w:rPr>
+        <w:t>:</w:t>
       </w:r>
       <w:r>
         <w:rPr>
@@ -1666,11 +1805,19 @@
           <w:lang w:val="en-US"/>
         </w:rPr>
       </w:pPr>
-      <w:r>
-        <w:rPr>
-          <w:lang w:val="en-US"/>
-        </w:rPr>
-        <w:t>Bodyform:</w:t>
+      <w:proofErr w:type="spellStart"/>
+      <w:r>
+        <w:rPr>
+          <w:lang w:val="en-US"/>
+        </w:rPr>
+        <w:t>Bodyform</w:t>
+      </w:r>
+      <w:proofErr w:type="spellEnd"/>
+      <w:r>
+        <w:rPr>
+          <w:lang w:val="en-US"/>
+        </w:rPr>
+        <w:t>:</w:t>
       </w:r>
       <w:r>
         <w:rPr>
@@ -1802,6 +1949,1639 @@
           <w:lang w:val="en-US"/>
         </w:rPr>
       </w:pPr>
+    </w:p>
+    <w:p>
+      <w:pPr>
+        <w:rPr>
+          <w:lang w:val="en-US"/>
+        </w:rPr>
+      </w:pPr>
+    </w:p>
+    <w:p>
+      <w:pPr>
+        <w:rPr>
+          <w:lang w:val="en-US"/>
+        </w:rPr>
+      </w:pPr>
+    </w:p>
+    <w:p>
+      <w:pPr>
+        <w:pStyle w:val="berschrift2"/>
+        <w:rPr>
+          <w:lang w:val="en-US"/>
+        </w:rPr>
+      </w:pPr>
+      <w:r>
+        <w:rPr>
+          <w:noProof/>
+        </w:rPr>
+        <mc:AlternateContent>
+          <mc:Choice Requires="wps">
+            <w:drawing>
+              <wp:anchor distT="0" distB="0" distL="114300" distR="114300" simplePos="0" relativeHeight="251677696" behindDoc="0" locked="0" layoutInCell="1" allowOverlap="1" wp14:anchorId="5188E750" wp14:editId="0C1ED829">
+                <wp:simplePos x="0" y="0"/>
+                <wp:positionH relativeFrom="column">
+                  <wp:posOffset>0</wp:posOffset>
+                </wp:positionH>
+                <wp:positionV relativeFrom="paragraph">
+                  <wp:posOffset>386715</wp:posOffset>
+                </wp:positionV>
+                <wp:extent cx="2063750" cy="2679700"/>
+                <wp:effectExtent l="0" t="0" r="12700" b="25400"/>
+                <wp:wrapSquare wrapText="bothSides"/>
+                <wp:docPr id="1455436048" name="Rechteck 2"/>
+                <wp:cNvGraphicFramePr/>
+                <a:graphic xmlns:a="http://schemas.openxmlformats.org/drawingml/2006/main">
+                  <a:graphicData uri="http://schemas.microsoft.com/office/word/2010/wordprocessingShape">
+                    <wps:wsp>
+                      <wps:cNvSpPr/>
+                      <wps:spPr>
+                        <a:xfrm>
+                          <a:off x="0" y="0"/>
+                          <a:ext cx="2063750" cy="2679700"/>
+                        </a:xfrm>
+                        <a:prstGeom prst="rect">
+                          <a:avLst/>
+                        </a:prstGeom>
+                      </wps:spPr>
+                      <wps:style>
+                        <a:lnRef idx="2">
+                          <a:schemeClr val="accent1">
+                            <a:shade val="15000"/>
+                          </a:schemeClr>
+                        </a:lnRef>
+                        <a:fillRef idx="1">
+                          <a:schemeClr val="accent1"/>
+                        </a:fillRef>
+                        <a:effectRef idx="0">
+                          <a:schemeClr val="accent1"/>
+                        </a:effectRef>
+                        <a:fontRef idx="minor">
+                          <a:schemeClr val="lt1"/>
+                        </a:fontRef>
+                      </wps:style>
+                      <wps:bodyPr rot="0" spcFirstLastPara="0" vertOverflow="overflow" horzOverflow="overflow" vert="horz" wrap="square" lIns="91440" tIns="45720" rIns="91440" bIns="45720" numCol="1" spcCol="0" rtlCol="0" fromWordArt="0" anchor="ctr" anchorCtr="0" forceAA="0" compatLnSpc="1">
+                        <a:prstTxWarp prst="textNoShape">
+                          <a:avLst/>
+                        </a:prstTxWarp>
+                        <a:noAutofit/>
+                      </wps:bodyPr>
+                    </wps:wsp>
+                  </a:graphicData>
+                </a:graphic>
+                <wp14:sizeRelH relativeFrom="margin">
+                  <wp14:pctWidth>0</wp14:pctWidth>
+                </wp14:sizeRelH>
+                <wp14:sizeRelV relativeFrom="margin">
+                  <wp14:pctHeight>0</wp14:pctHeight>
+                </wp14:sizeRelV>
+              </wp:anchor>
+            </w:drawing>
+          </mc:Choice>
+          <mc:Fallback>
+            <w:pict>
+              <v:rect w14:anchorId="432423E5" id="Rechteck 2" o:spid="_x0000_s1026" style="position:absolute;margin-left:0;margin-top:30.45pt;width:162.5pt;height:211pt;z-index:251677696;visibility:visible;mso-wrap-style:square;mso-width-percent:0;mso-height-percent:0;mso-wrap-distance-left:9pt;mso-wrap-distance-top:0;mso-wrap-distance-right:9pt;mso-wrap-distance-bottom:0;mso-position-horizontal:absolute;mso-position-horizontal-relative:text;mso-position-vertical:absolute;mso-position-vertical-relative:text;mso-width-percent:0;mso-height-percent:0;mso-width-relative:margin;mso-height-relative:margin;v-text-anchor:middle" o:gfxdata="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" fillcolor="#4472c4 [3204]" strokecolor="#09101d [484]" strokeweight="1pt">
+                <w10:wrap type="square"/>
+              </v:rect>
+            </w:pict>
+          </mc:Fallback>
+        </mc:AlternateContent>
+      </w:r>
+      <w:r>
+        <w:rPr>
+          <w:lang w:val="en-US"/>
+        </w:rPr>
+        <w:t xml:space="preserve"> </w:t>
+      </w:r>
+      <w:r>
+        <w:rPr>
+          <w:lang w:val="en-US"/>
+        </w:rPr>
+        <w:t>Jor Mar-</w:t>
+      </w:r>
+      <w:r>
+        <w:rPr>
+          <w:lang w:val="en-US"/>
+        </w:rPr>
+        <w:t>L</w:t>
+      </w:r>
+      <w:r>
+        <w:rPr>
+          <w:lang w:val="en-US"/>
+        </w:rPr>
+        <w:t>or</w:t>
+      </w:r>
+    </w:p>
+    <w:p>
+      <w:pPr>
+        <w:rPr>
+          <w:lang w:val="en-US"/>
+        </w:rPr>
+      </w:pPr>
+      <w:r>
+        <w:rPr>
+          <w:lang w:val="en-US"/>
+        </w:rPr>
+        <w:t>Age/Birthday:</w:t>
+      </w:r>
+    </w:p>
+    <w:p>
+      <w:pPr>
+        <w:rPr>
+          <w:lang w:val="en-US"/>
+        </w:rPr>
+      </w:pPr>
+      <w:proofErr w:type="spellStart"/>
+      <w:r>
+        <w:rPr>
+          <w:lang w:val="en-US"/>
+        </w:rPr>
+        <w:t>Bodyform</w:t>
+      </w:r>
+      <w:proofErr w:type="spellEnd"/>
+      <w:r>
+        <w:rPr>
+          <w:lang w:val="en-US"/>
+        </w:rPr>
+        <w:t>:</w:t>
+      </w:r>
+    </w:p>
+    <w:p>
+      <w:pPr>
+        <w:rPr>
+          <w:lang w:val="en-US"/>
+        </w:rPr>
+      </w:pPr>
+      <w:r>
+        <w:rPr>
+          <w:lang w:val="en-US"/>
+        </w:rPr>
+        <w:t>Heritage:</w:t>
+      </w:r>
+    </w:p>
+    <w:p>
+      <w:pPr>
+        <w:rPr>
+          <w:lang w:val="en-US"/>
+        </w:rPr>
+      </w:pPr>
+      <w:r>
+        <w:rPr>
+          <w:lang w:val="en-US"/>
+        </w:rPr>
+        <w:t>Domicile:</w:t>
+      </w:r>
+    </w:p>
+    <w:p>
+      <w:pPr>
+        <w:rPr>
+          <w:lang w:val="en-US"/>
+        </w:rPr>
+      </w:pPr>
+      <w:r>
+        <w:rPr>
+          <w:lang w:val="en-US"/>
+        </w:rPr>
+        <w:t>Clothing:</w:t>
+      </w:r>
+    </w:p>
+    <w:p>
+      <w:pPr>
+        <w:rPr>
+          <w:lang w:val="en-US"/>
+        </w:rPr>
+      </w:pPr>
+      <w:r>
+        <w:rPr>
+          <w:lang w:val="en-US"/>
+        </w:rPr>
+        <w:t>Affiliation:</w:t>
+      </w:r>
+    </w:p>
+    <w:p>
+      <w:pPr>
+        <w:rPr>
+          <w:lang w:val="en-US"/>
+        </w:rPr>
+      </w:pPr>
+      <w:r>
+        <w:rPr>
+          <w:lang w:val="en-US"/>
+        </w:rPr>
+        <w:t>Abilities:</w:t>
+      </w:r>
+    </w:p>
+    <w:p>
+      <w:pPr>
+        <w:rPr>
+          <w:lang w:val="en-US"/>
+        </w:rPr>
+      </w:pPr>
+      <w:r>
+        <w:rPr>
+          <w:lang w:val="en-US"/>
+        </w:rPr>
+        <w:t>Personality:</w:t>
+      </w:r>
+    </w:p>
+    <w:p>
+      <w:pPr>
+        <w:rPr>
+          <w:lang w:val="en-US"/>
+        </w:rPr>
+      </w:pPr>
+      <w:r>
+        <w:rPr>
+          <w:lang w:val="en-US"/>
+        </w:rPr>
+        <w:br/>
+        <w:t>Synopsis:</w:t>
+      </w:r>
+    </w:p>
+    <w:p>
+      <w:pPr>
+        <w:rPr>
+          <w:lang w:val="en-US"/>
+        </w:rPr>
+      </w:pPr>
+    </w:p>
+    <w:p>
+      <w:pPr>
+        <w:pStyle w:val="berschrift2"/>
+        <w:rPr>
+          <w:lang w:val="en-US"/>
+        </w:rPr>
+      </w:pPr>
+      <w:r>
+        <w:rPr>
+          <w:noProof/>
+        </w:rPr>
+        <w:lastRenderedPageBreak/>
+        <mc:AlternateContent>
+          <mc:Choice Requires="wps">
+            <w:drawing>
+              <wp:anchor distT="0" distB="0" distL="114300" distR="114300" simplePos="0" relativeHeight="251679744" behindDoc="0" locked="0" layoutInCell="1" allowOverlap="1" wp14:anchorId="74456F0E" wp14:editId="26C2524A">
+                <wp:simplePos x="0" y="0"/>
+                <wp:positionH relativeFrom="column">
+                  <wp:posOffset>0</wp:posOffset>
+                </wp:positionH>
+                <wp:positionV relativeFrom="paragraph">
+                  <wp:posOffset>386715</wp:posOffset>
+                </wp:positionV>
+                <wp:extent cx="2063750" cy="2679700"/>
+                <wp:effectExtent l="0" t="0" r="12700" b="25400"/>
+                <wp:wrapSquare wrapText="bothSides"/>
+                <wp:docPr id="705073177" name="Rechteck 2"/>
+                <wp:cNvGraphicFramePr/>
+                <a:graphic xmlns:a="http://schemas.openxmlformats.org/drawingml/2006/main">
+                  <a:graphicData uri="http://schemas.microsoft.com/office/word/2010/wordprocessingShape">
+                    <wps:wsp>
+                      <wps:cNvSpPr/>
+                      <wps:spPr>
+                        <a:xfrm>
+                          <a:off x="0" y="0"/>
+                          <a:ext cx="2063750" cy="2679700"/>
+                        </a:xfrm>
+                        <a:prstGeom prst="rect">
+                          <a:avLst/>
+                        </a:prstGeom>
+                      </wps:spPr>
+                      <wps:style>
+                        <a:lnRef idx="2">
+                          <a:schemeClr val="accent1">
+                            <a:shade val="15000"/>
+                          </a:schemeClr>
+                        </a:lnRef>
+                        <a:fillRef idx="1">
+                          <a:schemeClr val="accent1"/>
+                        </a:fillRef>
+                        <a:effectRef idx="0">
+                          <a:schemeClr val="accent1"/>
+                        </a:effectRef>
+                        <a:fontRef idx="minor">
+                          <a:schemeClr val="lt1"/>
+                        </a:fontRef>
+                      </wps:style>
+                      <wps:bodyPr rot="0" spcFirstLastPara="0" vertOverflow="overflow" horzOverflow="overflow" vert="horz" wrap="square" lIns="91440" tIns="45720" rIns="91440" bIns="45720" numCol="1" spcCol="0" rtlCol="0" fromWordArt="0" anchor="ctr" anchorCtr="0" forceAA="0" compatLnSpc="1">
+                        <a:prstTxWarp prst="textNoShape">
+                          <a:avLst/>
+                        </a:prstTxWarp>
+                        <a:noAutofit/>
+                      </wps:bodyPr>
+                    </wps:wsp>
+                  </a:graphicData>
+                </a:graphic>
+                <wp14:sizeRelH relativeFrom="margin">
+                  <wp14:pctWidth>0</wp14:pctWidth>
+                </wp14:sizeRelH>
+                <wp14:sizeRelV relativeFrom="margin">
+                  <wp14:pctHeight>0</wp14:pctHeight>
+                </wp14:sizeRelV>
+              </wp:anchor>
+            </w:drawing>
+          </mc:Choice>
+          <mc:Fallback>
+            <w:pict>
+              <v:rect w14:anchorId="67003883" id="Rechteck 2" o:spid="_x0000_s1026" style="position:absolute;margin-left:0;margin-top:30.45pt;width:162.5pt;height:211pt;z-index:251679744;visibility:visible;mso-wrap-style:square;mso-width-percent:0;mso-height-percent:0;mso-wrap-distance-left:9pt;mso-wrap-distance-top:0;mso-wrap-distance-right:9pt;mso-wrap-distance-bottom:0;mso-position-horizontal:absolute;mso-position-horizontal-relative:text;mso-position-vertical:absolute;mso-position-vertical-relative:text;mso-width-percent:0;mso-height-percent:0;mso-width-relative:margin;mso-height-relative:margin;v-text-anchor:middle" o:gfxdata="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" fillcolor="#4472c4 [3204]" strokecolor="#09101d [484]" strokeweight="1pt">
+                <w10:wrap type="square"/>
+              </v:rect>
+            </w:pict>
+          </mc:Fallback>
+        </mc:AlternateContent>
+      </w:r>
+      <w:r>
+        <w:rPr>
+          <w:lang w:val="en-US"/>
+        </w:rPr>
+        <w:t xml:space="preserve"> </w:t>
+      </w:r>
+      <w:r>
+        <w:rPr>
+          <w:lang w:val="en-US"/>
+        </w:rPr>
+        <w:t>Jevan Dra-Gen</w:t>
+      </w:r>
+    </w:p>
+    <w:p>
+      <w:pPr>
+        <w:rPr>
+          <w:lang w:val="en-US"/>
+        </w:rPr>
+      </w:pPr>
+      <w:r>
+        <w:rPr>
+          <w:lang w:val="en-US"/>
+        </w:rPr>
+        <w:t>Age/Birthday:</w:t>
+      </w:r>
+    </w:p>
+    <w:p>
+      <w:pPr>
+        <w:rPr>
+          <w:lang w:val="en-US"/>
+        </w:rPr>
+      </w:pPr>
+      <w:proofErr w:type="spellStart"/>
+      <w:r>
+        <w:rPr>
+          <w:lang w:val="en-US"/>
+        </w:rPr>
+        <w:t>Bodyform</w:t>
+      </w:r>
+      <w:proofErr w:type="spellEnd"/>
+      <w:r>
+        <w:rPr>
+          <w:lang w:val="en-US"/>
+        </w:rPr>
+        <w:t>:</w:t>
+      </w:r>
+    </w:p>
+    <w:p>
+      <w:pPr>
+        <w:rPr>
+          <w:lang w:val="en-US"/>
+        </w:rPr>
+      </w:pPr>
+      <w:r>
+        <w:rPr>
+          <w:lang w:val="en-US"/>
+        </w:rPr>
+        <w:t>Heritage:</w:t>
+      </w:r>
+    </w:p>
+    <w:p>
+      <w:pPr>
+        <w:rPr>
+          <w:lang w:val="en-US"/>
+        </w:rPr>
+      </w:pPr>
+      <w:r>
+        <w:rPr>
+          <w:lang w:val="en-US"/>
+        </w:rPr>
+        <w:t>Domicile:</w:t>
+      </w:r>
+    </w:p>
+    <w:p>
+      <w:pPr>
+        <w:rPr>
+          <w:lang w:val="en-US"/>
+        </w:rPr>
+      </w:pPr>
+      <w:r>
+        <w:rPr>
+          <w:lang w:val="en-US"/>
+        </w:rPr>
+        <w:t>Clothing:</w:t>
+      </w:r>
+    </w:p>
+    <w:p>
+      <w:pPr>
+        <w:rPr>
+          <w:lang w:val="en-US"/>
+        </w:rPr>
+      </w:pPr>
+      <w:r>
+        <w:rPr>
+          <w:lang w:val="en-US"/>
+        </w:rPr>
+        <w:t>Affiliation:</w:t>
+      </w:r>
+    </w:p>
+    <w:p>
+      <w:pPr>
+        <w:rPr>
+          <w:lang w:val="en-US"/>
+        </w:rPr>
+      </w:pPr>
+      <w:r>
+        <w:rPr>
+          <w:lang w:val="en-US"/>
+        </w:rPr>
+        <w:t>Abilities:</w:t>
+      </w:r>
+    </w:p>
+    <w:p>
+      <w:pPr>
+        <w:rPr>
+          <w:lang w:val="en-US"/>
+        </w:rPr>
+      </w:pPr>
+      <w:r>
+        <w:rPr>
+          <w:lang w:val="en-US"/>
+        </w:rPr>
+        <w:t>Personality:</w:t>
+      </w:r>
+    </w:p>
+    <w:p>
+      <w:pPr>
+        <w:rPr>
+          <w:lang w:val="en-US"/>
+        </w:rPr>
+      </w:pPr>
+      <w:r>
+        <w:rPr>
+          <w:lang w:val="en-US"/>
+        </w:rPr>
+        <w:br/>
+        <w:t>Synopsis:</w:t>
+      </w:r>
+    </w:p>
+    <w:p>
+      <w:pPr>
+        <w:rPr>
+          <w:lang w:val="en-US"/>
+        </w:rPr>
+      </w:pPr>
+    </w:p>
+    <w:p>
+      <w:pPr>
+        <w:pStyle w:val="berschrift2"/>
+        <w:rPr>
+          <w:lang w:val="en-US"/>
+        </w:rPr>
+      </w:pPr>
+      <w:r>
+        <w:rPr>
+          <w:noProof/>
+        </w:rPr>
+        <mc:AlternateContent>
+          <mc:Choice Requires="wps">
+            <w:drawing>
+              <wp:anchor distT="0" distB="0" distL="114300" distR="114300" simplePos="0" relativeHeight="251681792" behindDoc="0" locked="0" layoutInCell="1" allowOverlap="1" wp14:anchorId="7E929666" wp14:editId="58A0CB14">
+                <wp:simplePos x="0" y="0"/>
+                <wp:positionH relativeFrom="column">
+                  <wp:posOffset>0</wp:posOffset>
+                </wp:positionH>
+                <wp:positionV relativeFrom="paragraph">
+                  <wp:posOffset>386715</wp:posOffset>
+                </wp:positionV>
+                <wp:extent cx="2063750" cy="2679700"/>
+                <wp:effectExtent l="0" t="0" r="12700" b="25400"/>
+                <wp:wrapSquare wrapText="bothSides"/>
+                <wp:docPr id="1076628575" name="Rechteck 2"/>
+                <wp:cNvGraphicFramePr/>
+                <a:graphic xmlns:a="http://schemas.openxmlformats.org/drawingml/2006/main">
+                  <a:graphicData uri="http://schemas.microsoft.com/office/word/2010/wordprocessingShape">
+                    <wps:wsp>
+                      <wps:cNvSpPr/>
+                      <wps:spPr>
+                        <a:xfrm>
+                          <a:off x="0" y="0"/>
+                          <a:ext cx="2063750" cy="2679700"/>
+                        </a:xfrm>
+                        <a:prstGeom prst="rect">
+                          <a:avLst/>
+                        </a:prstGeom>
+                      </wps:spPr>
+                      <wps:style>
+                        <a:lnRef idx="2">
+                          <a:schemeClr val="accent1">
+                            <a:shade val="15000"/>
+                          </a:schemeClr>
+                        </a:lnRef>
+                        <a:fillRef idx="1">
+                          <a:schemeClr val="accent1"/>
+                        </a:fillRef>
+                        <a:effectRef idx="0">
+                          <a:schemeClr val="accent1"/>
+                        </a:effectRef>
+                        <a:fontRef idx="minor">
+                          <a:schemeClr val="lt1"/>
+                        </a:fontRef>
+                      </wps:style>
+                      <wps:bodyPr rot="0" spcFirstLastPara="0" vertOverflow="overflow" horzOverflow="overflow" vert="horz" wrap="square" lIns="91440" tIns="45720" rIns="91440" bIns="45720" numCol="1" spcCol="0" rtlCol="0" fromWordArt="0" anchor="ctr" anchorCtr="0" forceAA="0" compatLnSpc="1">
+                        <a:prstTxWarp prst="textNoShape">
+                          <a:avLst/>
+                        </a:prstTxWarp>
+                        <a:noAutofit/>
+                      </wps:bodyPr>
+                    </wps:wsp>
+                  </a:graphicData>
+                </a:graphic>
+                <wp14:sizeRelH relativeFrom="margin">
+                  <wp14:pctWidth>0</wp14:pctWidth>
+                </wp14:sizeRelH>
+                <wp14:sizeRelV relativeFrom="margin">
+                  <wp14:pctHeight>0</wp14:pctHeight>
+                </wp14:sizeRelV>
+              </wp:anchor>
+            </w:drawing>
+          </mc:Choice>
+          <mc:Fallback>
+            <w:pict>
+              <v:rect w14:anchorId="78DCB1CD" id="Rechteck 2" o:spid="_x0000_s1026" style="position:absolute;margin-left:0;margin-top:30.45pt;width:162.5pt;height:211pt;z-index:251681792;visibility:visible;mso-wrap-style:square;mso-width-percent:0;mso-height-percent:0;mso-wrap-distance-left:9pt;mso-wrap-distance-top:0;mso-wrap-distance-right:9pt;mso-wrap-distance-bottom:0;mso-position-horizontal:absolute;mso-position-horizontal-relative:text;mso-position-vertical:absolute;mso-position-vertical-relative:text;mso-width-percent:0;mso-height-percent:0;mso-width-relative:margin;mso-height-relative:margin;v-text-anchor:middle" o:gfxdata="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" fillcolor="#4472c4 [3204]" strokecolor="#09101d [484]" strokeweight="1pt">
+                <w10:wrap type="square"/>
+              </v:rect>
+            </w:pict>
+          </mc:Fallback>
+        </mc:AlternateContent>
+      </w:r>
+      <w:r>
+        <w:rPr>
+          <w:lang w:val="en-US"/>
+        </w:rPr>
+        <w:t xml:space="preserve"> </w:t>
+      </w:r>
+      <w:proofErr w:type="spellStart"/>
+      <w:r>
+        <w:rPr>
+          <w:lang w:val="en-US"/>
+        </w:rPr>
+        <w:t>Dormir</w:t>
+      </w:r>
+      <w:proofErr w:type="spellEnd"/>
+    </w:p>
+    <w:p>
+      <w:pPr>
+        <w:rPr>
+          <w:lang w:val="en-US"/>
+        </w:rPr>
+      </w:pPr>
+      <w:r>
+        <w:rPr>
+          <w:lang w:val="en-US"/>
+        </w:rPr>
+        <w:t>Age/Birthday:</w:t>
+      </w:r>
+    </w:p>
+    <w:p>
+      <w:pPr>
+        <w:rPr>
+          <w:lang w:val="en-US"/>
+        </w:rPr>
+      </w:pPr>
+      <w:proofErr w:type="spellStart"/>
+      <w:r>
+        <w:rPr>
+          <w:lang w:val="en-US"/>
+        </w:rPr>
+        <w:t>Bodyform</w:t>
+      </w:r>
+      <w:proofErr w:type="spellEnd"/>
+      <w:r>
+        <w:rPr>
+          <w:lang w:val="en-US"/>
+        </w:rPr>
+        <w:t>:</w:t>
+      </w:r>
+    </w:p>
+    <w:p>
+      <w:pPr>
+        <w:rPr>
+          <w:lang w:val="en-US"/>
+        </w:rPr>
+      </w:pPr>
+      <w:r>
+        <w:rPr>
+          <w:lang w:val="en-US"/>
+        </w:rPr>
+        <w:t>Heritage:</w:t>
+      </w:r>
+    </w:p>
+    <w:p>
+      <w:pPr>
+        <w:rPr>
+          <w:lang w:val="en-US"/>
+        </w:rPr>
+      </w:pPr>
+      <w:r>
+        <w:rPr>
+          <w:lang w:val="en-US"/>
+        </w:rPr>
+        <w:t>Domicile:</w:t>
+      </w:r>
+    </w:p>
+    <w:p>
+      <w:pPr>
+        <w:rPr>
+          <w:lang w:val="en-US"/>
+        </w:rPr>
+      </w:pPr>
+      <w:r>
+        <w:rPr>
+          <w:lang w:val="en-US"/>
+        </w:rPr>
+        <w:t>Clothing:</w:t>
+      </w:r>
+    </w:p>
+    <w:p>
+      <w:pPr>
+        <w:rPr>
+          <w:lang w:val="en-US"/>
+        </w:rPr>
+      </w:pPr>
+      <w:r>
+        <w:rPr>
+          <w:lang w:val="en-US"/>
+        </w:rPr>
+        <w:t>Affiliation:</w:t>
+      </w:r>
+    </w:p>
+    <w:p>
+      <w:pPr>
+        <w:rPr>
+          <w:lang w:val="en-US"/>
+        </w:rPr>
+      </w:pPr>
+      <w:r>
+        <w:rPr>
+          <w:lang w:val="en-US"/>
+        </w:rPr>
+        <w:t>Abilities:</w:t>
+      </w:r>
+    </w:p>
+    <w:p>
+      <w:pPr>
+        <w:rPr>
+          <w:lang w:val="en-US"/>
+        </w:rPr>
+      </w:pPr>
+      <w:r>
+        <w:rPr>
+          <w:lang w:val="en-US"/>
+        </w:rPr>
+        <w:t>Personality:</w:t>
+      </w:r>
+    </w:p>
+    <w:p>
+      <w:pPr>
+        <w:rPr>
+          <w:lang w:val="en-US"/>
+        </w:rPr>
+      </w:pPr>
+      <w:r>
+        <w:rPr>
+          <w:lang w:val="en-US"/>
+        </w:rPr>
+        <w:br/>
+        <w:t>Synopsis:</w:t>
+      </w:r>
+    </w:p>
+    <w:p>
+      <w:pPr>
+        <w:rPr>
+          <w:lang w:val="en-US"/>
+        </w:rPr>
+      </w:pPr>
+    </w:p>
+    <w:p>
+      <w:pPr>
+        <w:pStyle w:val="berschrift2"/>
+        <w:rPr>
+          <w:lang w:val="en-US"/>
+        </w:rPr>
+      </w:pPr>
+      <w:r>
+        <w:rPr>
+          <w:noProof/>
+        </w:rPr>
+        <w:lastRenderedPageBreak/>
+        <mc:AlternateContent>
+          <mc:Choice Requires="wps">
+            <w:drawing>
+              <wp:anchor distT="0" distB="0" distL="114300" distR="114300" simplePos="0" relativeHeight="251683840" behindDoc="0" locked="0" layoutInCell="1" allowOverlap="1" wp14:anchorId="6B6E1EFD" wp14:editId="7AA7CDB6">
+                <wp:simplePos x="0" y="0"/>
+                <wp:positionH relativeFrom="column">
+                  <wp:posOffset>0</wp:posOffset>
+                </wp:positionH>
+                <wp:positionV relativeFrom="paragraph">
+                  <wp:posOffset>386715</wp:posOffset>
+                </wp:positionV>
+                <wp:extent cx="2063750" cy="2679700"/>
+                <wp:effectExtent l="0" t="0" r="12700" b="25400"/>
+                <wp:wrapSquare wrapText="bothSides"/>
+                <wp:docPr id="1674997874" name="Rechteck 2"/>
+                <wp:cNvGraphicFramePr/>
+                <a:graphic xmlns:a="http://schemas.openxmlformats.org/drawingml/2006/main">
+                  <a:graphicData uri="http://schemas.microsoft.com/office/word/2010/wordprocessingShape">
+                    <wps:wsp>
+                      <wps:cNvSpPr/>
+                      <wps:spPr>
+                        <a:xfrm>
+                          <a:off x="0" y="0"/>
+                          <a:ext cx="2063750" cy="2679700"/>
+                        </a:xfrm>
+                        <a:prstGeom prst="rect">
+                          <a:avLst/>
+                        </a:prstGeom>
+                      </wps:spPr>
+                      <wps:style>
+                        <a:lnRef idx="2">
+                          <a:schemeClr val="accent1">
+                            <a:shade val="15000"/>
+                          </a:schemeClr>
+                        </a:lnRef>
+                        <a:fillRef idx="1">
+                          <a:schemeClr val="accent1"/>
+                        </a:fillRef>
+                        <a:effectRef idx="0">
+                          <a:schemeClr val="accent1"/>
+                        </a:effectRef>
+                        <a:fontRef idx="minor">
+                          <a:schemeClr val="lt1"/>
+                        </a:fontRef>
+                      </wps:style>
+                      <wps:bodyPr rot="0" spcFirstLastPara="0" vertOverflow="overflow" horzOverflow="overflow" vert="horz" wrap="square" lIns="91440" tIns="45720" rIns="91440" bIns="45720" numCol="1" spcCol="0" rtlCol="0" fromWordArt="0" anchor="ctr" anchorCtr="0" forceAA="0" compatLnSpc="1">
+                        <a:prstTxWarp prst="textNoShape">
+                          <a:avLst/>
+                        </a:prstTxWarp>
+                        <a:noAutofit/>
+                      </wps:bodyPr>
+                    </wps:wsp>
+                  </a:graphicData>
+                </a:graphic>
+                <wp14:sizeRelH relativeFrom="margin">
+                  <wp14:pctWidth>0</wp14:pctWidth>
+                </wp14:sizeRelH>
+                <wp14:sizeRelV relativeFrom="margin">
+                  <wp14:pctHeight>0</wp14:pctHeight>
+                </wp14:sizeRelV>
+              </wp:anchor>
+            </w:drawing>
+          </mc:Choice>
+          <mc:Fallback>
+            <w:pict>
+              <v:rect w14:anchorId="628E5F80" id="Rechteck 2" o:spid="_x0000_s1026" style="position:absolute;margin-left:0;margin-top:30.45pt;width:162.5pt;height:211pt;z-index:251683840;visibility:visible;mso-wrap-style:square;mso-width-percent:0;mso-height-percent:0;mso-wrap-distance-left:9pt;mso-wrap-distance-top:0;mso-wrap-distance-right:9pt;mso-wrap-distance-bottom:0;mso-position-horizontal:absolute;mso-position-horizontal-relative:text;mso-position-vertical:absolute;mso-position-vertical-relative:text;mso-width-percent:0;mso-height-percent:0;mso-width-relative:margin;mso-height-relative:margin;v-text-anchor:middle" o:gfxdata="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" fillcolor="#4472c4 [3204]" strokecolor="#09101d [484]" strokeweight="1pt">
+                <w10:wrap type="square"/>
+              </v:rect>
+            </w:pict>
+          </mc:Fallback>
+        </mc:AlternateContent>
+      </w:r>
+      <w:r>
+        <w:rPr>
+          <w:lang w:val="en-US"/>
+        </w:rPr>
+        <w:t xml:space="preserve"> </w:t>
+      </w:r>
+      <w:proofErr w:type="spellStart"/>
+      <w:r>
+        <w:rPr>
+          <w:lang w:val="en-US"/>
+        </w:rPr>
+        <w:t>Lanilor</w:t>
+      </w:r>
+      <w:proofErr w:type="spellEnd"/>
+    </w:p>
+    <w:p>
+      <w:pPr>
+        <w:rPr>
+          <w:lang w:val="en-US"/>
+        </w:rPr>
+      </w:pPr>
+      <w:r>
+        <w:rPr>
+          <w:lang w:val="en-US"/>
+        </w:rPr>
+        <w:t>Age/Birthday:</w:t>
+      </w:r>
+    </w:p>
+    <w:p>
+      <w:pPr>
+        <w:rPr>
+          <w:lang w:val="en-US"/>
+        </w:rPr>
+      </w:pPr>
+      <w:proofErr w:type="spellStart"/>
+      <w:r>
+        <w:rPr>
+          <w:lang w:val="en-US"/>
+        </w:rPr>
+        <w:t>Bodyform</w:t>
+      </w:r>
+      <w:proofErr w:type="spellEnd"/>
+      <w:r>
+        <w:rPr>
+          <w:lang w:val="en-US"/>
+        </w:rPr>
+        <w:t>:</w:t>
+      </w:r>
+    </w:p>
+    <w:p>
+      <w:pPr>
+        <w:rPr>
+          <w:lang w:val="en-US"/>
+        </w:rPr>
+      </w:pPr>
+      <w:r>
+        <w:rPr>
+          <w:lang w:val="en-US"/>
+        </w:rPr>
+        <w:t>Heritage:</w:t>
+      </w:r>
+    </w:p>
+    <w:p>
+      <w:pPr>
+        <w:rPr>
+          <w:lang w:val="en-US"/>
+        </w:rPr>
+      </w:pPr>
+      <w:r>
+        <w:rPr>
+          <w:lang w:val="en-US"/>
+        </w:rPr>
+        <w:t>Domicile:</w:t>
+      </w:r>
+    </w:p>
+    <w:p>
+      <w:pPr>
+        <w:rPr>
+          <w:lang w:val="en-US"/>
+        </w:rPr>
+      </w:pPr>
+      <w:r>
+        <w:rPr>
+          <w:lang w:val="en-US"/>
+        </w:rPr>
+        <w:t>Clothing:</w:t>
+      </w:r>
+    </w:p>
+    <w:p>
+      <w:pPr>
+        <w:rPr>
+          <w:lang w:val="en-US"/>
+        </w:rPr>
+      </w:pPr>
+      <w:r>
+        <w:rPr>
+          <w:lang w:val="en-US"/>
+        </w:rPr>
+        <w:t>Affiliation:</w:t>
+      </w:r>
+    </w:p>
+    <w:p>
+      <w:pPr>
+        <w:rPr>
+          <w:lang w:val="en-US"/>
+        </w:rPr>
+      </w:pPr>
+      <w:r>
+        <w:rPr>
+          <w:lang w:val="en-US"/>
+        </w:rPr>
+        <w:t>Abilities:</w:t>
+      </w:r>
+    </w:p>
+    <w:p>
+      <w:pPr>
+        <w:rPr>
+          <w:lang w:val="en-US"/>
+        </w:rPr>
+      </w:pPr>
+      <w:r>
+        <w:rPr>
+          <w:lang w:val="en-US"/>
+        </w:rPr>
+        <w:t>Personality:</w:t>
+      </w:r>
+    </w:p>
+    <w:p>
+      <w:pPr>
+        <w:rPr>
+          <w:lang w:val="en-US"/>
+        </w:rPr>
+      </w:pPr>
+      <w:r>
+        <w:rPr>
+          <w:lang w:val="en-US"/>
+        </w:rPr>
+        <w:br/>
+        <w:t>Synopsis:</w:t>
+      </w:r>
+    </w:p>
+    <w:p>
+      <w:pPr>
+        <w:rPr>
+          <w:lang w:val="en-US"/>
+        </w:rPr>
+      </w:pPr>
+    </w:p>
+    <w:p>
+      <w:pPr>
+        <w:pStyle w:val="berschrift2"/>
+        <w:rPr>
+          <w:lang w:val="en-US"/>
+        </w:rPr>
+      </w:pPr>
+      <w:r>
+        <w:rPr>
+          <w:noProof/>
+        </w:rPr>
+        <mc:AlternateContent>
+          <mc:Choice Requires="wps">
+            <w:drawing>
+              <wp:anchor distT="0" distB="0" distL="114300" distR="114300" simplePos="0" relativeHeight="251685888" behindDoc="0" locked="0" layoutInCell="1" allowOverlap="1" wp14:anchorId="0D38742E" wp14:editId="49CDC3C1">
+                <wp:simplePos x="0" y="0"/>
+                <wp:positionH relativeFrom="column">
+                  <wp:posOffset>0</wp:posOffset>
+                </wp:positionH>
+                <wp:positionV relativeFrom="paragraph">
+                  <wp:posOffset>386715</wp:posOffset>
+                </wp:positionV>
+                <wp:extent cx="2063750" cy="2679700"/>
+                <wp:effectExtent l="0" t="0" r="12700" b="25400"/>
+                <wp:wrapSquare wrapText="bothSides"/>
+                <wp:docPr id="609416461" name="Rechteck 2"/>
+                <wp:cNvGraphicFramePr/>
+                <a:graphic xmlns:a="http://schemas.openxmlformats.org/drawingml/2006/main">
+                  <a:graphicData uri="http://schemas.microsoft.com/office/word/2010/wordprocessingShape">
+                    <wps:wsp>
+                      <wps:cNvSpPr/>
+                      <wps:spPr>
+                        <a:xfrm>
+                          <a:off x="0" y="0"/>
+                          <a:ext cx="2063750" cy="2679700"/>
+                        </a:xfrm>
+                        <a:prstGeom prst="rect">
+                          <a:avLst/>
+                        </a:prstGeom>
+                      </wps:spPr>
+                      <wps:style>
+                        <a:lnRef idx="2">
+                          <a:schemeClr val="accent1">
+                            <a:shade val="15000"/>
+                          </a:schemeClr>
+                        </a:lnRef>
+                        <a:fillRef idx="1">
+                          <a:schemeClr val="accent1"/>
+                        </a:fillRef>
+                        <a:effectRef idx="0">
+                          <a:schemeClr val="accent1"/>
+                        </a:effectRef>
+                        <a:fontRef idx="minor">
+                          <a:schemeClr val="lt1"/>
+                        </a:fontRef>
+                      </wps:style>
+                      <wps:bodyPr rot="0" spcFirstLastPara="0" vertOverflow="overflow" horzOverflow="overflow" vert="horz" wrap="square" lIns="91440" tIns="45720" rIns="91440" bIns="45720" numCol="1" spcCol="0" rtlCol="0" fromWordArt="0" anchor="ctr" anchorCtr="0" forceAA="0" compatLnSpc="1">
+                        <a:prstTxWarp prst="textNoShape">
+                          <a:avLst/>
+                        </a:prstTxWarp>
+                        <a:noAutofit/>
+                      </wps:bodyPr>
+                    </wps:wsp>
+                  </a:graphicData>
+                </a:graphic>
+                <wp14:sizeRelH relativeFrom="margin">
+                  <wp14:pctWidth>0</wp14:pctWidth>
+                </wp14:sizeRelH>
+                <wp14:sizeRelV relativeFrom="margin">
+                  <wp14:pctHeight>0</wp14:pctHeight>
+                </wp14:sizeRelV>
+              </wp:anchor>
+            </w:drawing>
+          </mc:Choice>
+          <mc:Fallback>
+            <w:pict>
+              <v:rect w14:anchorId="3BFC6D49" id="Rechteck 2" o:spid="_x0000_s1026" style="position:absolute;margin-left:0;margin-top:30.45pt;width:162.5pt;height:211pt;z-index:251685888;visibility:visible;mso-wrap-style:square;mso-width-percent:0;mso-height-percent:0;mso-wrap-distance-left:9pt;mso-wrap-distance-top:0;mso-wrap-distance-right:9pt;mso-wrap-distance-bottom:0;mso-position-horizontal:absolute;mso-position-horizontal-relative:text;mso-position-vertical:absolute;mso-position-vertical-relative:text;mso-width-percent:0;mso-height-percent:0;mso-width-relative:margin;mso-height-relative:margin;v-text-anchor:middle" o:gfxdata="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" fillcolor="#4472c4 [3204]" strokecolor="#09101d [484]" strokeweight="1pt">
+                <w10:wrap type="square"/>
+              </v:rect>
+            </w:pict>
+          </mc:Fallback>
+        </mc:AlternateContent>
+      </w:r>
+      <w:r>
+        <w:rPr>
+          <w:lang w:val="en-US"/>
+        </w:rPr>
+        <w:t xml:space="preserve"> </w:t>
+      </w:r>
+      <w:r>
+        <w:rPr>
+          <w:lang w:val="en-US"/>
+        </w:rPr>
+        <w:t>Brod</w:t>
+      </w:r>
+    </w:p>
+    <w:p>
+      <w:pPr>
+        <w:rPr>
+          <w:lang w:val="en-US"/>
+        </w:rPr>
+      </w:pPr>
+      <w:r>
+        <w:rPr>
+          <w:lang w:val="en-US"/>
+        </w:rPr>
+        <w:t>Age/Birthday:</w:t>
+      </w:r>
+    </w:p>
+    <w:p>
+      <w:pPr>
+        <w:rPr>
+          <w:lang w:val="en-US"/>
+        </w:rPr>
+      </w:pPr>
+      <w:proofErr w:type="spellStart"/>
+      <w:r>
+        <w:rPr>
+          <w:lang w:val="en-US"/>
+        </w:rPr>
+        <w:t>Bodyform</w:t>
+      </w:r>
+      <w:proofErr w:type="spellEnd"/>
+      <w:r>
+        <w:rPr>
+          <w:lang w:val="en-US"/>
+        </w:rPr>
+        <w:t>:</w:t>
+      </w:r>
+    </w:p>
+    <w:p>
+      <w:pPr>
+        <w:rPr>
+          <w:lang w:val="en-US"/>
+        </w:rPr>
+      </w:pPr>
+      <w:r>
+        <w:rPr>
+          <w:lang w:val="en-US"/>
+        </w:rPr>
+        <w:t>Heritage:</w:t>
+      </w:r>
+    </w:p>
+    <w:p>
+      <w:pPr>
+        <w:rPr>
+          <w:lang w:val="en-US"/>
+        </w:rPr>
+      </w:pPr>
+      <w:r>
+        <w:rPr>
+          <w:lang w:val="en-US"/>
+        </w:rPr>
+        <w:t>Domicile:</w:t>
+      </w:r>
+    </w:p>
+    <w:p>
+      <w:pPr>
+        <w:rPr>
+          <w:lang w:val="en-US"/>
+        </w:rPr>
+      </w:pPr>
+      <w:r>
+        <w:rPr>
+          <w:lang w:val="en-US"/>
+        </w:rPr>
+        <w:t>Clothing:</w:t>
+      </w:r>
+    </w:p>
+    <w:p>
+      <w:pPr>
+        <w:rPr>
+          <w:lang w:val="en-US"/>
+        </w:rPr>
+      </w:pPr>
+      <w:r>
+        <w:rPr>
+          <w:lang w:val="en-US"/>
+        </w:rPr>
+        <w:t>Affiliation:</w:t>
+      </w:r>
+    </w:p>
+    <w:p>
+      <w:pPr>
+        <w:rPr>
+          <w:lang w:val="en-US"/>
+        </w:rPr>
+      </w:pPr>
+      <w:r>
+        <w:rPr>
+          <w:lang w:val="en-US"/>
+        </w:rPr>
+        <w:t>Abilities:</w:t>
+      </w:r>
+    </w:p>
+    <w:p>
+      <w:pPr>
+        <w:rPr>
+          <w:lang w:val="en-US"/>
+        </w:rPr>
+      </w:pPr>
+      <w:r>
+        <w:rPr>
+          <w:lang w:val="en-US"/>
+        </w:rPr>
+        <w:t>Personality:</w:t>
+      </w:r>
+    </w:p>
+    <w:p>
+      <w:pPr>
+        <w:rPr>
+          <w:lang w:val="en-US"/>
+        </w:rPr>
+      </w:pPr>
+      <w:r>
+        <w:rPr>
+          <w:lang w:val="en-US"/>
+        </w:rPr>
+        <w:br/>
+        <w:t>Synopsis:</w:t>
+      </w:r>
+    </w:p>
+    <w:p>
+      <w:pPr>
+        <w:rPr>
+          <w:lang w:val="en-US"/>
+        </w:rPr>
+      </w:pPr>
+    </w:p>
+    <w:p>
+      <w:pPr>
+        <w:pStyle w:val="berschrift2"/>
+        <w:rPr>
+          <w:lang w:val="en-US"/>
+        </w:rPr>
+      </w:pPr>
+      <w:r>
+        <w:rPr>
+          <w:noProof/>
+        </w:rPr>
+        <w:lastRenderedPageBreak/>
+        <mc:AlternateContent>
+          <mc:Choice Requires="wps">
+            <w:drawing>
+              <wp:anchor distT="0" distB="0" distL="114300" distR="114300" simplePos="0" relativeHeight="251687936" behindDoc="0" locked="0" layoutInCell="1" allowOverlap="1" wp14:anchorId="4D60D16C" wp14:editId="164EF900">
+                <wp:simplePos x="0" y="0"/>
+                <wp:positionH relativeFrom="column">
+                  <wp:posOffset>0</wp:posOffset>
+                </wp:positionH>
+                <wp:positionV relativeFrom="paragraph">
+                  <wp:posOffset>386715</wp:posOffset>
+                </wp:positionV>
+                <wp:extent cx="2063750" cy="2679700"/>
+                <wp:effectExtent l="0" t="0" r="12700" b="25400"/>
+                <wp:wrapSquare wrapText="bothSides"/>
+                <wp:docPr id="810036518" name="Rechteck 2"/>
+                <wp:cNvGraphicFramePr/>
+                <a:graphic xmlns:a="http://schemas.openxmlformats.org/drawingml/2006/main">
+                  <a:graphicData uri="http://schemas.microsoft.com/office/word/2010/wordprocessingShape">
+                    <wps:wsp>
+                      <wps:cNvSpPr/>
+                      <wps:spPr>
+                        <a:xfrm>
+                          <a:off x="0" y="0"/>
+                          <a:ext cx="2063750" cy="2679700"/>
+                        </a:xfrm>
+                        <a:prstGeom prst="rect">
+                          <a:avLst/>
+                        </a:prstGeom>
+                      </wps:spPr>
+                      <wps:style>
+                        <a:lnRef idx="2">
+                          <a:schemeClr val="accent1">
+                            <a:shade val="15000"/>
+                          </a:schemeClr>
+                        </a:lnRef>
+                        <a:fillRef idx="1">
+                          <a:schemeClr val="accent1"/>
+                        </a:fillRef>
+                        <a:effectRef idx="0">
+                          <a:schemeClr val="accent1"/>
+                        </a:effectRef>
+                        <a:fontRef idx="minor">
+                          <a:schemeClr val="lt1"/>
+                        </a:fontRef>
+                      </wps:style>
+                      <wps:bodyPr rot="0" spcFirstLastPara="0" vertOverflow="overflow" horzOverflow="overflow" vert="horz" wrap="square" lIns="91440" tIns="45720" rIns="91440" bIns="45720" numCol="1" spcCol="0" rtlCol="0" fromWordArt="0" anchor="ctr" anchorCtr="0" forceAA="0" compatLnSpc="1">
+                        <a:prstTxWarp prst="textNoShape">
+                          <a:avLst/>
+                        </a:prstTxWarp>
+                        <a:noAutofit/>
+                      </wps:bodyPr>
+                    </wps:wsp>
+                  </a:graphicData>
+                </a:graphic>
+                <wp14:sizeRelH relativeFrom="margin">
+                  <wp14:pctWidth>0</wp14:pctWidth>
+                </wp14:sizeRelH>
+                <wp14:sizeRelV relativeFrom="margin">
+                  <wp14:pctHeight>0</wp14:pctHeight>
+                </wp14:sizeRelV>
+              </wp:anchor>
+            </w:drawing>
+          </mc:Choice>
+          <mc:Fallback>
+            <w:pict>
+              <v:rect w14:anchorId="1718748D" id="Rechteck 2" o:spid="_x0000_s1026" style="position:absolute;margin-left:0;margin-top:30.45pt;width:162.5pt;height:211pt;z-index:251687936;visibility:visible;mso-wrap-style:square;mso-width-percent:0;mso-height-percent:0;mso-wrap-distance-left:9pt;mso-wrap-distance-top:0;mso-wrap-distance-right:9pt;mso-wrap-distance-bottom:0;mso-position-horizontal:absolute;mso-position-horizontal-relative:text;mso-position-vertical:absolute;mso-position-vertical-relative:text;mso-width-percent:0;mso-height-percent:0;mso-width-relative:margin;mso-height-relative:margin;v-text-anchor:middle" o:gfxdata="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" fillcolor="#4472c4 [3204]" strokecolor="#09101d [484]" strokeweight="1pt">
+                <w10:wrap type="square"/>
+              </v:rect>
+            </w:pict>
+          </mc:Fallback>
+        </mc:AlternateContent>
+      </w:r>
+      <w:r>
+        <w:rPr>
+          <w:lang w:val="en-US"/>
+        </w:rPr>
+        <w:t xml:space="preserve"> </w:t>
+      </w:r>
+      <w:r>
+        <w:rPr>
+          <w:lang w:val="en-US"/>
+        </w:rPr>
+        <w:t>Diianel</w:t>
+      </w:r>
+    </w:p>
+    <w:p>
+      <w:pPr>
+        <w:rPr>
+          <w:lang w:val="en-US"/>
+        </w:rPr>
+      </w:pPr>
+      <w:r>
+        <w:rPr>
+          <w:lang w:val="en-US"/>
+        </w:rPr>
+        <w:t>Age/Birthday:</w:t>
+      </w:r>
+    </w:p>
+    <w:p>
+      <w:pPr>
+        <w:rPr>
+          <w:lang w:val="en-US"/>
+        </w:rPr>
+      </w:pPr>
+      <w:proofErr w:type="spellStart"/>
+      <w:r>
+        <w:rPr>
+          <w:lang w:val="en-US"/>
+        </w:rPr>
+        <w:t>Bodyform</w:t>
+      </w:r>
+      <w:proofErr w:type="spellEnd"/>
+      <w:r>
+        <w:rPr>
+          <w:lang w:val="en-US"/>
+        </w:rPr>
+        <w:t>:</w:t>
+      </w:r>
+    </w:p>
+    <w:p>
+      <w:pPr>
+        <w:rPr>
+          <w:lang w:val="en-US"/>
+        </w:rPr>
+      </w:pPr>
+      <w:r>
+        <w:rPr>
+          <w:lang w:val="en-US"/>
+        </w:rPr>
+        <w:t>Heritage:</w:t>
+      </w:r>
+    </w:p>
+    <w:p>
+      <w:pPr>
+        <w:rPr>
+          <w:lang w:val="en-US"/>
+        </w:rPr>
+      </w:pPr>
+      <w:r>
+        <w:rPr>
+          <w:lang w:val="en-US"/>
+        </w:rPr>
+        <w:t>Domicile:</w:t>
+      </w:r>
+    </w:p>
+    <w:p>
+      <w:pPr>
+        <w:rPr>
+          <w:lang w:val="en-US"/>
+        </w:rPr>
+      </w:pPr>
+      <w:r>
+        <w:rPr>
+          <w:lang w:val="en-US"/>
+        </w:rPr>
+        <w:t>Clothing:</w:t>
+      </w:r>
+    </w:p>
+    <w:p>
+      <w:pPr>
+        <w:rPr>
+          <w:lang w:val="en-US"/>
+        </w:rPr>
+      </w:pPr>
+      <w:r>
+        <w:rPr>
+          <w:lang w:val="en-US"/>
+        </w:rPr>
+        <w:t>Affiliation:</w:t>
+      </w:r>
+    </w:p>
+    <w:p>
+      <w:pPr>
+        <w:rPr>
+          <w:lang w:val="en-US"/>
+        </w:rPr>
+      </w:pPr>
+      <w:r>
+        <w:rPr>
+          <w:lang w:val="en-US"/>
+        </w:rPr>
+        <w:t>Abilities:</w:t>
+      </w:r>
+    </w:p>
+    <w:p>
+      <w:pPr>
+        <w:rPr>
+          <w:lang w:val="en-US"/>
+        </w:rPr>
+      </w:pPr>
+      <w:r>
+        <w:rPr>
+          <w:lang w:val="en-US"/>
+        </w:rPr>
+        <w:t>Personality:</w:t>
+      </w:r>
+    </w:p>
+    <w:p>
+      <w:pPr>
+        <w:rPr>
+          <w:lang w:val="en-US"/>
+        </w:rPr>
+      </w:pPr>
+      <w:r>
+        <w:rPr>
+          <w:lang w:val="en-US"/>
+        </w:rPr>
+        <w:br/>
+        <w:t>Synopsis:</w:t>
+      </w:r>
+    </w:p>
+    <w:p>
+      <w:pPr>
+        <w:rPr>
+          <w:lang w:val="en-US"/>
+        </w:rPr>
+      </w:pPr>
+    </w:p>
+    <w:p>
+      <w:pPr>
+        <w:pStyle w:val="berschrift2"/>
+        <w:rPr>
+          <w:lang w:val="en-US"/>
+        </w:rPr>
+      </w:pPr>
+      <w:r>
+        <w:rPr>
+          <w:noProof/>
+        </w:rPr>
+        <mc:AlternateContent>
+          <mc:Choice Requires="wps">
+            <w:drawing>
+              <wp:anchor distT="0" distB="0" distL="114300" distR="114300" simplePos="0" relativeHeight="251689984" behindDoc="0" locked="0" layoutInCell="1" allowOverlap="1" wp14:anchorId="3E2519C4" wp14:editId="305A39BD">
+                <wp:simplePos x="0" y="0"/>
+                <wp:positionH relativeFrom="column">
+                  <wp:posOffset>0</wp:posOffset>
+                </wp:positionH>
+                <wp:positionV relativeFrom="paragraph">
+                  <wp:posOffset>386715</wp:posOffset>
+                </wp:positionV>
+                <wp:extent cx="2063750" cy="2679700"/>
+                <wp:effectExtent l="0" t="0" r="12700" b="25400"/>
+                <wp:wrapSquare wrapText="bothSides"/>
+                <wp:docPr id="1628128909" name="Rechteck 2"/>
+                <wp:cNvGraphicFramePr/>
+                <a:graphic xmlns:a="http://schemas.openxmlformats.org/drawingml/2006/main">
+                  <a:graphicData uri="http://schemas.microsoft.com/office/word/2010/wordprocessingShape">
+                    <wps:wsp>
+                      <wps:cNvSpPr/>
+                      <wps:spPr>
+                        <a:xfrm>
+                          <a:off x="0" y="0"/>
+                          <a:ext cx="2063750" cy="2679700"/>
+                        </a:xfrm>
+                        <a:prstGeom prst="rect">
+                          <a:avLst/>
+                        </a:prstGeom>
+                      </wps:spPr>
+                      <wps:style>
+                        <a:lnRef idx="2">
+                          <a:schemeClr val="accent1">
+                            <a:shade val="15000"/>
+                          </a:schemeClr>
+                        </a:lnRef>
+                        <a:fillRef idx="1">
+                          <a:schemeClr val="accent1"/>
+                        </a:fillRef>
+                        <a:effectRef idx="0">
+                          <a:schemeClr val="accent1"/>
+                        </a:effectRef>
+                        <a:fontRef idx="minor">
+                          <a:schemeClr val="lt1"/>
+                        </a:fontRef>
+                      </wps:style>
+                      <wps:bodyPr rot="0" spcFirstLastPara="0" vertOverflow="overflow" horzOverflow="overflow" vert="horz" wrap="square" lIns="91440" tIns="45720" rIns="91440" bIns="45720" numCol="1" spcCol="0" rtlCol="0" fromWordArt="0" anchor="ctr" anchorCtr="0" forceAA="0" compatLnSpc="1">
+                        <a:prstTxWarp prst="textNoShape">
+                          <a:avLst/>
+                        </a:prstTxWarp>
+                        <a:noAutofit/>
+                      </wps:bodyPr>
+                    </wps:wsp>
+                  </a:graphicData>
+                </a:graphic>
+                <wp14:sizeRelH relativeFrom="margin">
+                  <wp14:pctWidth>0</wp14:pctWidth>
+                </wp14:sizeRelH>
+                <wp14:sizeRelV relativeFrom="margin">
+                  <wp14:pctHeight>0</wp14:pctHeight>
+                </wp14:sizeRelV>
+              </wp:anchor>
+            </w:drawing>
+          </mc:Choice>
+          <mc:Fallback>
+            <w:pict>
+              <v:rect w14:anchorId="3F2FC50A" id="Rechteck 2" o:spid="_x0000_s1026" style="position:absolute;margin-left:0;margin-top:30.45pt;width:162.5pt;height:211pt;z-index:251689984;visibility:visible;mso-wrap-style:square;mso-width-percent:0;mso-height-percent:0;mso-wrap-distance-left:9pt;mso-wrap-distance-top:0;mso-wrap-distance-right:9pt;mso-wrap-distance-bottom:0;mso-position-horizontal:absolute;mso-position-horizontal-relative:text;mso-position-vertical:absolute;mso-position-vertical-relative:text;mso-width-percent:0;mso-height-percent:0;mso-width-relative:margin;mso-height-relative:margin;v-text-anchor:middle" o:gfxdata="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" fillcolor="#4472c4 [3204]" strokecolor="#09101d [484]" strokeweight="1pt">
+                <w10:wrap type="square"/>
+              </v:rect>
+            </w:pict>
+          </mc:Fallback>
+        </mc:AlternateContent>
+      </w:r>
+      <w:r>
+        <w:rPr>
+          <w:lang w:val="en-US"/>
+        </w:rPr>
+        <w:t xml:space="preserve"> </w:t>
+      </w:r>
+      <w:bookmarkStart w:id="0" w:name="_Hlk224676340"/>
+      <w:proofErr w:type="spellStart"/>
+      <w:r>
+        <w:rPr>
+          <w:lang w:val="en-US"/>
+        </w:rPr>
+        <w:t>Jazialilin</w:t>
+      </w:r>
+      <w:bookmarkEnd w:id="0"/>
+      <w:proofErr w:type="spellEnd"/>
+    </w:p>
+    <w:p>
+      <w:pPr>
+        <w:rPr>
+          <w:lang w:val="en-US"/>
+        </w:rPr>
+      </w:pPr>
+      <w:r>
+        <w:rPr>
+          <w:lang w:val="en-US"/>
+        </w:rPr>
+        <w:t>Age/Birthday:</w:t>
+      </w:r>
+    </w:p>
+    <w:p>
+      <w:pPr>
+        <w:rPr>
+          <w:lang w:val="en-US"/>
+        </w:rPr>
+      </w:pPr>
+      <w:proofErr w:type="spellStart"/>
+      <w:r>
+        <w:rPr>
+          <w:lang w:val="en-US"/>
+        </w:rPr>
+        <w:t>Bodyform</w:t>
+      </w:r>
+      <w:proofErr w:type="spellEnd"/>
+      <w:r>
+        <w:rPr>
+          <w:lang w:val="en-US"/>
+        </w:rPr>
+        <w:t>:</w:t>
+      </w:r>
+    </w:p>
+    <w:p>
+      <w:pPr>
+        <w:rPr>
+          <w:lang w:val="en-US"/>
+        </w:rPr>
+      </w:pPr>
+      <w:r>
+        <w:rPr>
+          <w:lang w:val="en-US"/>
+        </w:rPr>
+        <w:t>Heritage:</w:t>
+      </w:r>
+    </w:p>
+    <w:p>
+      <w:pPr>
+        <w:rPr>
+          <w:lang w:val="en-US"/>
+        </w:rPr>
+      </w:pPr>
+      <w:r>
+        <w:rPr>
+          <w:lang w:val="en-US"/>
+        </w:rPr>
+        <w:t>Domicile:</w:t>
+      </w:r>
+    </w:p>
+    <w:p>
+      <w:pPr>
+        <w:rPr>
+          <w:lang w:val="en-US"/>
+        </w:rPr>
+      </w:pPr>
+      <w:r>
+        <w:rPr>
+          <w:lang w:val="en-US"/>
+        </w:rPr>
+        <w:t>Clothing:</w:t>
+      </w:r>
+    </w:p>
+    <w:p>
+      <w:pPr>
+        <w:rPr>
+          <w:lang w:val="en-US"/>
+        </w:rPr>
+      </w:pPr>
+      <w:r>
+        <w:rPr>
+          <w:lang w:val="en-US"/>
+        </w:rPr>
+        <w:t>Affiliation:</w:t>
+      </w:r>
+    </w:p>
+    <w:p>
+      <w:pPr>
+        <w:rPr>
+          <w:lang w:val="en-US"/>
+        </w:rPr>
+      </w:pPr>
+      <w:r>
+        <w:rPr>
+          <w:lang w:val="en-US"/>
+        </w:rPr>
+        <w:t>Abilities:</w:t>
+      </w:r>
+    </w:p>
+    <w:p>
+      <w:pPr>
+        <w:rPr>
+          <w:lang w:val="en-US"/>
+        </w:rPr>
+      </w:pPr>
+      <w:r>
+        <w:rPr>
+          <w:lang w:val="en-US"/>
+        </w:rPr>
+        <w:t>Personality:</w:t>
+      </w:r>
+    </w:p>
+    <w:p>
+      <w:pPr>
+        <w:rPr>
+          <w:lang w:val="en-US"/>
+        </w:rPr>
+      </w:pPr>
+      <w:r>
+        <w:rPr>
+          <w:lang w:val="en-US"/>
+        </w:rPr>
+        <w:br/>
+        <w:t>Synopsis:</w:t>
+      </w:r>
     </w:p>
     <w:p>
       <w:pPr>
@@ -2475,7 +4255,7 @@
   <w:style w:type="paragraph" w:default="1" w:styleId="Standard">
     <w:name w:val="Normal"/>
     <w:qFormat/>
-    <w:rsid w:val="00DF0758"/>
+    <w:rsid w:val="00BD0D4F"/>
   </w:style>
   <w:style w:type="paragraph" w:styleId="berschrift1">
     <w:name w:val="heading 1"/>

</xml_diff>

<commit_message>
Deployed dba5279 with MkDocs version: 1.6.1
</commit_message>
<xml_diff>
--- a/Buch Camille Chronicles/Character-Bios.docx
+++ b/Buch Camille Chronicles/Character-Bios.docx
@@ -132,14 +132,12 @@
           <w:lang w:val="en-US"/>
         </w:rPr>
       </w:pPr>
-      <w:proofErr w:type="spellStart"/>
       <w:r>
         <w:rPr>
           <w:lang w:val="en-US"/>
         </w:rPr>
         <w:t>Bodyform</w:t>
       </w:r>
-      <w:proofErr w:type="spellEnd"/>
       <w:r>
         <w:rPr>
           <w:lang w:val="en-US"/>
@@ -392,19 +390,11 @@
           <w:lang w:val="en-US"/>
         </w:rPr>
       </w:pPr>
-      <w:proofErr w:type="spellStart"/>
-      <w:r>
-        <w:rPr>
-          <w:lang w:val="en-US"/>
-        </w:rPr>
-        <w:t>Bodyform</w:t>
-      </w:r>
-      <w:proofErr w:type="spellEnd"/>
-      <w:r>
-        <w:rPr>
-          <w:lang w:val="en-US"/>
-        </w:rPr>
-        <w:t>:</w:t>
+      <w:r>
+        <w:rPr>
+          <w:lang w:val="en-US"/>
+        </w:rPr>
+        <w:t>Bodyform:</w:t>
       </w:r>
       <w:r>
         <w:rPr>
@@ -469,14 +459,12 @@
         </w:rPr>
         <w:t xml:space="preserve"> </w:t>
       </w:r>
-      <w:proofErr w:type="spellStart"/>
       <w:r>
         <w:rPr>
           <w:lang w:val="en-US"/>
         </w:rPr>
         <w:t>Rintreahr</w:t>
       </w:r>
-      <w:proofErr w:type="spellEnd"/>
     </w:p>
     <w:p>
       <w:pPr>
@@ -526,16 +514,8 @@
         <w:rPr>
           <w:lang w:val="en-US"/>
         </w:rPr>
-        <w:t xml:space="preserve"> </w:t>
-      </w:r>
-      <w:proofErr w:type="spellStart"/>
-      <w:r>
-        <w:rPr>
-          <w:lang w:val="en-US"/>
-        </w:rPr>
-        <w:t>Bodymagic</w:t>
-      </w:r>
-      <w:proofErr w:type="spellEnd"/>
+        <w:t xml:space="preserve"> Bodymagic</w:t>
+      </w:r>
     </w:p>
     <w:p>
       <w:pPr>
@@ -649,28 +629,12 @@
           </mc:Fallback>
         </mc:AlternateContent>
       </w:r>
-      <w:proofErr w:type="spellStart"/>
-      <w:r>
-        <w:rPr>
-          <w:lang w:val="en-US"/>
-        </w:rPr>
-        <w:t>Herriar</w:t>
-      </w:r>
-      <w:proofErr w:type="spellEnd"/>
-      <w:r>
-        <w:rPr>
-          <w:lang w:val="en-US"/>
-        </w:rPr>
-        <w:t xml:space="preserve"> </w:t>
-      </w:r>
-      <w:proofErr w:type="spellStart"/>
-      <w:r>
-        <w:rPr>
-          <w:lang w:val="en-US"/>
-        </w:rPr>
-        <w:t>Ormarill</w:t>
-      </w:r>
-      <w:proofErr w:type="spellEnd"/>
+      <w:r>
+        <w:rPr>
+          <w:lang w:val="en-US"/>
+        </w:rPr>
+        <w:t>Herriar Ormarill</w:t>
+      </w:r>
     </w:p>
     <w:p>
       <w:pPr>
@@ -691,19 +655,11 @@
           <w:lang w:val="en-US"/>
         </w:rPr>
       </w:pPr>
-      <w:proofErr w:type="spellStart"/>
-      <w:r>
-        <w:rPr>
-          <w:lang w:val="en-US"/>
-        </w:rPr>
-        <w:t>Bodyform</w:t>
-      </w:r>
-      <w:proofErr w:type="spellEnd"/>
-      <w:r>
-        <w:rPr>
-          <w:lang w:val="en-US"/>
-        </w:rPr>
-        <w:t>:</w:t>
+      <w:r>
+        <w:rPr>
+          <w:lang w:val="en-US"/>
+        </w:rPr>
+        <w:t>Bodyform:</w:t>
       </w:r>
       <w:r>
         <w:rPr>
@@ -786,16 +742,8 @@
         <w:rPr>
           <w:lang w:val="en-US"/>
         </w:rPr>
-        <w:t xml:space="preserve"> </w:t>
-      </w:r>
-      <w:proofErr w:type="spellStart"/>
-      <w:r>
-        <w:rPr>
-          <w:lang w:val="en-US"/>
-        </w:rPr>
-        <w:t>Bodymagic</w:t>
-      </w:r>
-      <w:proofErr w:type="spellEnd"/>
+        <w:t xml:space="preserve"> Bodymagic</w:t>
+      </w:r>
     </w:p>
     <w:p>
       <w:pPr>
@@ -827,22 +775,440 @@
         <w:rPr>
           <w:lang w:val="en-US"/>
         </w:rPr>
-        <w:t xml:space="preserve"> The Soul that is bound to Camille, tells that he had died of old age so Camille could acquire </w:t>
-      </w:r>
-      <w:proofErr w:type="spellStart"/>
-      <w:r>
-        <w:rPr>
-          <w:lang w:val="en-US"/>
-        </w:rPr>
-        <w:t>Bodymagic</w:t>
-      </w:r>
-      <w:proofErr w:type="spellEnd"/>
-      <w:r>
-        <w:rPr>
-          <w:lang w:val="en-US"/>
-        </w:rPr>
-        <w:t xml:space="preserve"> (instead he had a heart attack while having sex with a prostitute)</w:t>
-      </w:r>
+        <w:t xml:space="preserve"> The Soul that is bound to Camille, tells that he had died of old age so Camille could acquire Bodymagic (instead he had a heart attack while having sex with a prostitute)</w:t>
+      </w:r>
+    </w:p>
+    <w:p>
+      <w:pPr>
+        <w:pStyle w:val="berschrift2"/>
+        <w:ind w:left="708" w:hanging="708"/>
+        <w:rPr>
+          <w:lang w:val="en-US"/>
+        </w:rPr>
+      </w:pPr>
+      <w:r>
+        <w:rPr>
+          <w:noProof/>
+        </w:rPr>
+        <mc:AlternateContent>
+          <mc:Choice Requires="wps">
+            <w:drawing>
+              <wp:anchor distT="0" distB="0" distL="114300" distR="114300" simplePos="0" relativeHeight="251700224" behindDoc="0" locked="0" layoutInCell="1" allowOverlap="1" wp14:anchorId="3AC3EAFE" wp14:editId="091AED2B">
+                <wp:simplePos x="0" y="0"/>
+                <wp:positionH relativeFrom="column">
+                  <wp:posOffset>0</wp:posOffset>
+                </wp:positionH>
+                <wp:positionV relativeFrom="paragraph">
+                  <wp:posOffset>386715</wp:posOffset>
+                </wp:positionV>
+                <wp:extent cx="2063750" cy="2679700"/>
+                <wp:effectExtent l="0" t="0" r="12700" b="25400"/>
+                <wp:wrapSquare wrapText="bothSides"/>
+                <wp:docPr id="1744019556" name="Rechteck 2"/>
+                <wp:cNvGraphicFramePr/>
+                <a:graphic xmlns:a="http://schemas.openxmlformats.org/drawingml/2006/main">
+                  <a:graphicData uri="http://schemas.microsoft.com/office/word/2010/wordprocessingShape">
+                    <wps:wsp>
+                      <wps:cNvSpPr/>
+                      <wps:spPr>
+                        <a:xfrm>
+                          <a:off x="0" y="0"/>
+                          <a:ext cx="2063750" cy="2679700"/>
+                        </a:xfrm>
+                        <a:prstGeom prst="rect">
+                          <a:avLst/>
+                        </a:prstGeom>
+                      </wps:spPr>
+                      <wps:style>
+                        <a:lnRef idx="2">
+                          <a:schemeClr val="accent1">
+                            <a:shade val="15000"/>
+                          </a:schemeClr>
+                        </a:lnRef>
+                        <a:fillRef idx="1">
+                          <a:schemeClr val="accent1"/>
+                        </a:fillRef>
+                        <a:effectRef idx="0">
+                          <a:schemeClr val="accent1"/>
+                        </a:effectRef>
+                        <a:fontRef idx="minor">
+                          <a:schemeClr val="lt1"/>
+                        </a:fontRef>
+                      </wps:style>
+                      <wps:bodyPr rot="0" spcFirstLastPara="0" vertOverflow="overflow" horzOverflow="overflow" vert="horz" wrap="square" lIns="91440" tIns="45720" rIns="91440" bIns="45720" numCol="1" spcCol="0" rtlCol="0" fromWordArt="0" anchor="ctr" anchorCtr="0" forceAA="0" compatLnSpc="1">
+                        <a:prstTxWarp prst="textNoShape">
+                          <a:avLst/>
+                        </a:prstTxWarp>
+                        <a:noAutofit/>
+                      </wps:bodyPr>
+                    </wps:wsp>
+                  </a:graphicData>
+                </a:graphic>
+                <wp14:sizeRelH relativeFrom="margin">
+                  <wp14:pctWidth>0</wp14:pctWidth>
+                </wp14:sizeRelH>
+                <wp14:sizeRelV relativeFrom="margin">
+                  <wp14:pctHeight>0</wp14:pctHeight>
+                </wp14:sizeRelV>
+              </wp:anchor>
+            </w:drawing>
+          </mc:Choice>
+          <mc:Fallback>
+            <w:pict>
+              <v:rect w14:anchorId="56349E76" id="Rechteck 2" o:spid="_x0000_s1026" style="position:absolute;margin-left:0;margin-top:30.45pt;width:162.5pt;height:211pt;z-index:251700224;visibility:visible;mso-wrap-style:square;mso-width-percent:0;mso-height-percent:0;mso-wrap-distance-left:9pt;mso-wrap-distance-top:0;mso-wrap-distance-right:9pt;mso-wrap-distance-bottom:0;mso-position-horizontal:absolute;mso-position-horizontal-relative:text;mso-position-vertical:absolute;mso-position-vertical-relative:text;mso-width-percent:0;mso-height-percent:0;mso-width-relative:margin;mso-height-relative:margin;v-text-anchor:middle" o:gfxdata="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" fillcolor="#4472c4 [3204]" strokecolor="#09101d [484]" strokeweight="1pt">
+                <w10:wrap type="square"/>
+              </v:rect>
+            </w:pict>
+          </mc:Fallback>
+        </mc:AlternateContent>
+      </w:r>
+      <w:r>
+        <w:rPr>
+          <w:lang w:val="en-US"/>
+        </w:rPr>
+        <w:t>Camille Mother</w:t>
+      </w:r>
+    </w:p>
+    <w:p>
+      <w:pPr>
+        <w:rPr>
+          <w:lang w:val="en-US"/>
+        </w:rPr>
+      </w:pPr>
+      <w:r>
+        <w:rPr>
+          <w:lang w:val="en-US"/>
+        </w:rPr>
+        <w:t>Age/Birthday:</w:t>
+      </w:r>
+    </w:p>
+    <w:p>
+      <w:pPr>
+        <w:rPr>
+          <w:lang w:val="en-US"/>
+        </w:rPr>
+      </w:pPr>
+      <w:r>
+        <w:rPr>
+          <w:lang w:val="en-US"/>
+        </w:rPr>
+        <w:t>Bodyform:</w:t>
+      </w:r>
+    </w:p>
+    <w:p>
+      <w:pPr>
+        <w:rPr>
+          <w:lang w:val="en-US"/>
+        </w:rPr>
+      </w:pPr>
+      <w:r>
+        <w:rPr>
+          <w:lang w:val="en-US"/>
+        </w:rPr>
+        <w:t>Heritage:</w:t>
+      </w:r>
+    </w:p>
+    <w:p>
+      <w:pPr>
+        <w:rPr>
+          <w:lang w:val="en-US"/>
+        </w:rPr>
+      </w:pPr>
+      <w:r>
+        <w:rPr>
+          <w:lang w:val="en-US"/>
+        </w:rPr>
+        <w:t>Domicile:</w:t>
+      </w:r>
+    </w:p>
+    <w:p>
+      <w:pPr>
+        <w:rPr>
+          <w:lang w:val="en-US"/>
+        </w:rPr>
+      </w:pPr>
+      <w:r>
+        <w:rPr>
+          <w:lang w:val="en-US"/>
+        </w:rPr>
+        <w:t>Clothing:</w:t>
+      </w:r>
+    </w:p>
+    <w:p>
+      <w:pPr>
+        <w:rPr>
+          <w:lang w:val="en-US"/>
+        </w:rPr>
+      </w:pPr>
+      <w:r>
+        <w:rPr>
+          <w:lang w:val="en-US"/>
+        </w:rPr>
+        <w:t>Affiliation:</w:t>
+      </w:r>
+    </w:p>
+    <w:p>
+      <w:pPr>
+        <w:rPr>
+          <w:lang w:val="en-US"/>
+        </w:rPr>
+      </w:pPr>
+      <w:r>
+        <w:rPr>
+          <w:lang w:val="en-US"/>
+        </w:rPr>
+        <w:t>Abilities:</w:t>
+      </w:r>
+      <w:r>
+        <w:rPr>
+          <w:lang w:val="en-US"/>
+        </w:rPr>
+        <w:t xml:space="preserve"> Mind Harmonist</w:t>
+      </w:r>
+    </w:p>
+    <w:p>
+      <w:pPr>
+        <w:rPr>
+          <w:lang w:val="en-US"/>
+        </w:rPr>
+      </w:pPr>
+      <w:r>
+        <w:rPr>
+          <w:lang w:val="en-US"/>
+        </w:rPr>
+        <w:t>Personality:</w:t>
+      </w:r>
+    </w:p>
+    <w:p>
+      <w:pPr>
+        <w:rPr>
+          <w:lang w:val="en-US"/>
+        </w:rPr>
+      </w:pPr>
+      <w:r>
+        <w:rPr>
+          <w:lang w:val="en-US"/>
+        </w:rPr>
+        <w:br/>
+        <w:t>Synopsis:</w:t>
+      </w:r>
+    </w:p>
+    <w:p>
+      <w:pPr>
+        <w:pStyle w:val="berschrift2"/>
+        <w:ind w:left="708" w:hanging="708"/>
+        <w:rPr>
+          <w:lang w:val="en-US"/>
+        </w:rPr>
+      </w:pPr>
+      <w:r>
+        <w:rPr>
+          <w:noProof/>
+        </w:rPr>
+        <w:lastRenderedPageBreak/>
+        <mc:AlternateContent>
+          <mc:Choice Requires="wps">
+            <w:drawing>
+              <wp:anchor distT="0" distB="0" distL="114300" distR="114300" simplePos="0" relativeHeight="251702272" behindDoc="0" locked="0" layoutInCell="1" allowOverlap="1" wp14:anchorId="501AAFAF" wp14:editId="2AD2A9B6">
+                <wp:simplePos x="0" y="0"/>
+                <wp:positionH relativeFrom="column">
+                  <wp:posOffset>0</wp:posOffset>
+                </wp:positionH>
+                <wp:positionV relativeFrom="paragraph">
+                  <wp:posOffset>386715</wp:posOffset>
+                </wp:positionV>
+                <wp:extent cx="2063750" cy="2679700"/>
+                <wp:effectExtent l="0" t="0" r="12700" b="25400"/>
+                <wp:wrapSquare wrapText="bothSides"/>
+                <wp:docPr id="1673652698" name="Rechteck 2"/>
+                <wp:cNvGraphicFramePr/>
+                <a:graphic xmlns:a="http://schemas.openxmlformats.org/drawingml/2006/main">
+                  <a:graphicData uri="http://schemas.microsoft.com/office/word/2010/wordprocessingShape">
+                    <wps:wsp>
+                      <wps:cNvSpPr/>
+                      <wps:spPr>
+                        <a:xfrm>
+                          <a:off x="0" y="0"/>
+                          <a:ext cx="2063750" cy="2679700"/>
+                        </a:xfrm>
+                        <a:prstGeom prst="rect">
+                          <a:avLst/>
+                        </a:prstGeom>
+                      </wps:spPr>
+                      <wps:style>
+                        <a:lnRef idx="2">
+                          <a:schemeClr val="accent1">
+                            <a:shade val="15000"/>
+                          </a:schemeClr>
+                        </a:lnRef>
+                        <a:fillRef idx="1">
+                          <a:schemeClr val="accent1"/>
+                        </a:fillRef>
+                        <a:effectRef idx="0">
+                          <a:schemeClr val="accent1"/>
+                        </a:effectRef>
+                        <a:fontRef idx="minor">
+                          <a:schemeClr val="lt1"/>
+                        </a:fontRef>
+                      </wps:style>
+                      <wps:bodyPr rot="0" spcFirstLastPara="0" vertOverflow="overflow" horzOverflow="overflow" vert="horz" wrap="square" lIns="91440" tIns="45720" rIns="91440" bIns="45720" numCol="1" spcCol="0" rtlCol="0" fromWordArt="0" anchor="ctr" anchorCtr="0" forceAA="0" compatLnSpc="1">
+                        <a:prstTxWarp prst="textNoShape">
+                          <a:avLst/>
+                        </a:prstTxWarp>
+                        <a:noAutofit/>
+                      </wps:bodyPr>
+                    </wps:wsp>
+                  </a:graphicData>
+                </a:graphic>
+                <wp14:sizeRelH relativeFrom="margin">
+                  <wp14:pctWidth>0</wp14:pctWidth>
+                </wp14:sizeRelH>
+                <wp14:sizeRelV relativeFrom="margin">
+                  <wp14:pctHeight>0</wp14:pctHeight>
+                </wp14:sizeRelV>
+              </wp:anchor>
+            </w:drawing>
+          </mc:Choice>
+          <mc:Fallback>
+            <w:pict>
+              <v:rect w14:anchorId="0C1F9BA0" id="Rechteck 2" o:spid="_x0000_s1026" style="position:absolute;margin-left:0;margin-top:30.45pt;width:162.5pt;height:211pt;z-index:251702272;visibility:visible;mso-wrap-style:square;mso-width-percent:0;mso-height-percent:0;mso-wrap-distance-left:9pt;mso-wrap-distance-top:0;mso-wrap-distance-right:9pt;mso-wrap-distance-bottom:0;mso-position-horizontal:absolute;mso-position-horizontal-relative:text;mso-position-vertical:absolute;mso-position-vertical-relative:text;mso-width-percent:0;mso-height-percent:0;mso-width-relative:margin;mso-height-relative:margin;v-text-anchor:middle" o:gfxdata="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" fillcolor="#4472c4 [3204]" strokecolor="#09101d [484]" strokeweight="1pt">
+                <w10:wrap type="square"/>
+              </v:rect>
+            </w:pict>
+          </mc:Fallback>
+        </mc:AlternateContent>
+      </w:r>
+      <w:r>
+        <w:rPr>
+          <w:lang w:val="en-US"/>
+        </w:rPr>
+        <w:t>Camilel Father</w:t>
+      </w:r>
+    </w:p>
+    <w:p>
+      <w:pPr>
+        <w:rPr>
+          <w:lang w:val="en-US"/>
+        </w:rPr>
+      </w:pPr>
+      <w:r>
+        <w:rPr>
+          <w:lang w:val="en-US"/>
+        </w:rPr>
+        <w:t>Age/Birthday:</w:t>
+      </w:r>
+    </w:p>
+    <w:p>
+      <w:pPr>
+        <w:rPr>
+          <w:lang w:val="en-US"/>
+        </w:rPr>
+      </w:pPr>
+      <w:r>
+        <w:rPr>
+          <w:lang w:val="en-US"/>
+        </w:rPr>
+        <w:t>Bodyform:</w:t>
+      </w:r>
+    </w:p>
+    <w:p>
+      <w:pPr>
+        <w:rPr>
+          <w:lang w:val="en-US"/>
+        </w:rPr>
+      </w:pPr>
+      <w:r>
+        <w:rPr>
+          <w:lang w:val="en-US"/>
+        </w:rPr>
+        <w:t>Heritage:</w:t>
+      </w:r>
+    </w:p>
+    <w:p>
+      <w:pPr>
+        <w:rPr>
+          <w:lang w:val="en-US"/>
+        </w:rPr>
+      </w:pPr>
+      <w:r>
+        <w:rPr>
+          <w:lang w:val="en-US"/>
+        </w:rPr>
+        <w:t>Domicile:</w:t>
+      </w:r>
+    </w:p>
+    <w:p>
+      <w:pPr>
+        <w:rPr>
+          <w:lang w:val="en-US"/>
+        </w:rPr>
+      </w:pPr>
+      <w:r>
+        <w:rPr>
+          <w:lang w:val="en-US"/>
+        </w:rPr>
+        <w:t>Clothing:</w:t>
+      </w:r>
+    </w:p>
+    <w:p>
+      <w:pPr>
+        <w:rPr>
+          <w:lang w:val="en-US"/>
+        </w:rPr>
+      </w:pPr>
+      <w:r>
+        <w:rPr>
+          <w:lang w:val="en-US"/>
+        </w:rPr>
+        <w:t>Affiliation:</w:t>
+      </w:r>
+    </w:p>
+    <w:p>
+      <w:pPr>
+        <w:rPr>
+          <w:lang w:val="en-US"/>
+        </w:rPr>
+      </w:pPr>
+      <w:r>
+        <w:rPr>
+          <w:lang w:val="en-US"/>
+        </w:rPr>
+        <w:t>Abilities:</w:t>
+      </w:r>
+    </w:p>
+    <w:p>
+      <w:pPr>
+        <w:rPr>
+          <w:lang w:val="en-US"/>
+        </w:rPr>
+      </w:pPr>
+      <w:r>
+        <w:rPr>
+          <w:lang w:val="en-US"/>
+        </w:rPr>
+        <w:t>Personality:</w:t>
+      </w:r>
+    </w:p>
+    <w:p>
+      <w:pPr>
+        <w:rPr>
+          <w:lang w:val="en-US"/>
+        </w:rPr>
+      </w:pPr>
+      <w:r>
+        <w:rPr>
+          <w:lang w:val="en-US"/>
+        </w:rPr>
+        <w:br/>
+        <w:t>Synopsis:</w:t>
+      </w:r>
+    </w:p>
+    <w:p>
+      <w:pPr>
+        <w:rPr>
+          <w:lang w:val="en-US"/>
+        </w:rPr>
+      </w:pPr>
     </w:p>
     <w:p>
       <w:pPr>
@@ -949,14 +1315,12 @@
           </mc:Fallback>
         </mc:AlternateContent>
       </w:r>
-      <w:proofErr w:type="spellStart"/>
       <w:r>
         <w:rPr>
           <w:lang w:val="en-US"/>
         </w:rPr>
         <w:t>Darior</w:t>
       </w:r>
-      <w:proofErr w:type="spellEnd"/>
     </w:p>
     <w:p>
       <w:pPr>
@@ -983,19 +1347,11 @@
           <w:lang w:val="en-US"/>
         </w:rPr>
       </w:pPr>
-      <w:proofErr w:type="spellStart"/>
-      <w:r>
-        <w:rPr>
-          <w:lang w:val="en-US"/>
-        </w:rPr>
-        <w:t>Bodyform</w:t>
-      </w:r>
-      <w:proofErr w:type="spellEnd"/>
-      <w:r>
-        <w:rPr>
-          <w:lang w:val="en-US"/>
-        </w:rPr>
-        <w:t>:</w:t>
+      <w:r>
+        <w:rPr>
+          <w:lang w:val="en-US"/>
+        </w:rPr>
+        <w:t>Bodyform:</w:t>
       </w:r>
       <w:r>
         <w:rPr>
@@ -1003,6 +1359,12 @@
         </w:rPr>
         <w:t xml:space="preserve"> strong, athletic, bald</w:t>
       </w:r>
+      <w:r>
+        <w:rPr>
+          <w:lang w:val="en-US"/>
+        </w:rPr>
+        <w:t>, scar lip</w:t>
+      </w:r>
     </w:p>
     <w:p>
       <w:pPr>
@@ -1078,16 +1440,8 @@
         <w:rPr>
           <w:lang w:val="en-US"/>
         </w:rPr>
-        <w:t xml:space="preserve"> </w:t>
-      </w:r>
-      <w:proofErr w:type="spellStart"/>
-      <w:r>
-        <w:rPr>
-          <w:lang w:val="en-US"/>
-        </w:rPr>
-        <w:t>Swordslinger</w:t>
-      </w:r>
-      <w:proofErr w:type="spellEnd"/>
+        <w:t xml:space="preserve"> Swordslinger</w:t>
+      </w:r>
     </w:p>
     <w:p>
       <w:pPr>
@@ -1207,14 +1561,12 @@
           </mc:Fallback>
         </mc:AlternateContent>
       </w:r>
-      <w:proofErr w:type="spellStart"/>
       <w:r>
         <w:rPr>
           <w:lang w:val="en-US"/>
         </w:rPr>
         <w:t>Clevar</w:t>
       </w:r>
-      <w:proofErr w:type="spellEnd"/>
     </w:p>
     <w:p>
       <w:pPr>
@@ -1241,19 +1593,11 @@
           <w:lang w:val="en-US"/>
         </w:rPr>
       </w:pPr>
-      <w:proofErr w:type="spellStart"/>
-      <w:r>
-        <w:rPr>
-          <w:lang w:val="en-US"/>
-        </w:rPr>
-        <w:t>Bodyform</w:t>
-      </w:r>
-      <w:proofErr w:type="spellEnd"/>
-      <w:r>
-        <w:rPr>
-          <w:lang w:val="en-US"/>
-        </w:rPr>
-        <w:t>:</w:t>
+      <w:r>
+        <w:rPr>
+          <w:lang w:val="en-US"/>
+        </w:rPr>
+        <w:t>Bodyform:</w:t>
       </w:r>
       <w:r>
         <w:rPr>
@@ -1336,16 +1680,8 @@
         <w:rPr>
           <w:lang w:val="en-US"/>
         </w:rPr>
-        <w:t xml:space="preserve"> </w:t>
-      </w:r>
-      <w:proofErr w:type="spellStart"/>
-      <w:r>
-        <w:rPr>
-          <w:lang w:val="en-US"/>
-        </w:rPr>
-        <w:t>Swordslinger</w:t>
-      </w:r>
-      <w:proofErr w:type="spellEnd"/>
+        <w:t xml:space="preserve"> Swordslinger</w:t>
+      </w:r>
     </w:p>
     <w:p>
       <w:pPr>
@@ -1505,14 +1841,14 @@
         </w:rPr>
         <w:t xml:space="preserve"> </w:t>
       </w:r>
-      <w:proofErr w:type="spellStart"/>
+      <w:bookmarkStart w:id="0" w:name="_Hlk226105738"/>
       <w:r>
         <w:rPr>
           <w:lang w:val="en-US"/>
         </w:rPr>
         <w:t>Bureaucratess</w:t>
       </w:r>
-      <w:proofErr w:type="spellEnd"/>
+      <w:bookmarkEnd w:id="0"/>
       <w:r>
         <w:rPr>
           <w:lang w:val="en-US"/>
@@ -1545,19 +1881,11 @@
           <w:lang w:val="en-US"/>
         </w:rPr>
       </w:pPr>
-      <w:proofErr w:type="spellStart"/>
-      <w:r>
-        <w:rPr>
-          <w:lang w:val="en-US"/>
-        </w:rPr>
-        <w:t>Bodyform</w:t>
-      </w:r>
-      <w:proofErr w:type="spellEnd"/>
-      <w:r>
-        <w:rPr>
-          <w:lang w:val="en-US"/>
-        </w:rPr>
-        <w:t>:</w:t>
+      <w:r>
+        <w:rPr>
+          <w:lang w:val="en-US"/>
+        </w:rPr>
+        <w:t>Bodyform:</w:t>
       </w:r>
       <w:r>
         <w:rPr>
@@ -1628,6 +1956,24 @@
           <w:lang w:val="en-US"/>
         </w:rPr>
         <w:t>Affiliation:</w:t>
+      </w:r>
+      <w:r>
+        <w:rPr>
+          <w:lang w:val="en-US"/>
+        </w:rPr>
+        <w:t xml:space="preserve"> </w:t>
+      </w:r>
+      <w:r>
+        <w:rPr>
+          <w:lang w:val="en-US"/>
+        </w:rPr>
+        <w:t>Bureaucra</w:t>
+      </w:r>
+      <w:r>
+        <w:rPr>
+          <w:lang w:val="en-US"/>
+        </w:rPr>
+        <w:t>dom</w:t>
       </w:r>
     </w:p>
     <w:p>
@@ -1674,6 +2020,12 @@
           <w:lang w:val="en-US"/>
         </w:rPr>
         <w:t xml:space="preserve"> Died during a bandit attack on her way to Asarat’s Peak</w:t>
+      </w:r>
+      <w:r>
+        <w:rPr>
+          <w:lang w:val="en-US"/>
+        </w:rPr>
+        <w:t>. Niece to the Consul.</w:t>
       </w:r>
     </w:p>
     <w:p>
@@ -1805,19 +2157,11 @@
           <w:lang w:val="en-US"/>
         </w:rPr>
       </w:pPr>
-      <w:proofErr w:type="spellStart"/>
-      <w:r>
-        <w:rPr>
-          <w:lang w:val="en-US"/>
-        </w:rPr>
-        <w:t>Bodyform</w:t>
-      </w:r>
-      <w:proofErr w:type="spellEnd"/>
-      <w:r>
-        <w:rPr>
-          <w:lang w:val="en-US"/>
-        </w:rPr>
-        <w:t>:</w:t>
+      <w:r>
+        <w:rPr>
+          <w:lang w:val="en-US"/>
+        </w:rPr>
+        <w:t>Bodyform:</w:t>
       </w:r>
       <w:r>
         <w:rPr>
@@ -1945,17 +2289,541 @@
     </w:p>
     <w:p>
       <w:pPr>
-        <w:rPr>
-          <w:lang w:val="en-US"/>
-        </w:rPr>
-      </w:pPr>
-    </w:p>
-    <w:p>
-      <w:pPr>
-        <w:rPr>
-          <w:lang w:val="en-US"/>
-        </w:rPr>
-      </w:pPr>
+        <w:pStyle w:val="berschrift1"/>
+        <w:rPr>
+          <w:lang w:val="en-US"/>
+        </w:rPr>
+      </w:pPr>
+      <w:r>
+        <w:rPr>
+          <w:lang w:val="en-US"/>
+        </w:rPr>
+        <w:t>Citizens of Asarat’s Peak</w:t>
+      </w:r>
+    </w:p>
+    <w:p>
+      <w:pPr>
+        <w:pStyle w:val="berschrift2"/>
+        <w:ind w:left="708" w:hanging="708"/>
+        <w:rPr>
+          <w:lang w:val="en-US"/>
+        </w:rPr>
+      </w:pPr>
+      <w:r>
+        <w:rPr>
+          <w:noProof/>
+        </w:rPr>
+        <mc:AlternateContent>
+          <mc:Choice Requires="wps">
+            <w:drawing>
+              <wp:anchor distT="0" distB="0" distL="114300" distR="114300" simplePos="0" relativeHeight="251692032" behindDoc="0" locked="0" layoutInCell="1" allowOverlap="1" wp14:anchorId="6E566FF0" wp14:editId="05114D2B">
+                <wp:simplePos x="0" y="0"/>
+                <wp:positionH relativeFrom="column">
+                  <wp:posOffset>0</wp:posOffset>
+                </wp:positionH>
+                <wp:positionV relativeFrom="paragraph">
+                  <wp:posOffset>386715</wp:posOffset>
+                </wp:positionV>
+                <wp:extent cx="2063750" cy="2679700"/>
+                <wp:effectExtent l="0" t="0" r="12700" b="25400"/>
+                <wp:wrapSquare wrapText="bothSides"/>
+                <wp:docPr id="1064175401" name="Rechteck 2"/>
+                <wp:cNvGraphicFramePr/>
+                <a:graphic xmlns:a="http://schemas.openxmlformats.org/drawingml/2006/main">
+                  <a:graphicData uri="http://schemas.microsoft.com/office/word/2010/wordprocessingShape">
+                    <wps:wsp>
+                      <wps:cNvSpPr/>
+                      <wps:spPr>
+                        <a:xfrm>
+                          <a:off x="0" y="0"/>
+                          <a:ext cx="2063750" cy="2679700"/>
+                        </a:xfrm>
+                        <a:prstGeom prst="rect">
+                          <a:avLst/>
+                        </a:prstGeom>
+                      </wps:spPr>
+                      <wps:style>
+                        <a:lnRef idx="2">
+                          <a:schemeClr val="accent1">
+                            <a:shade val="15000"/>
+                          </a:schemeClr>
+                        </a:lnRef>
+                        <a:fillRef idx="1">
+                          <a:schemeClr val="accent1"/>
+                        </a:fillRef>
+                        <a:effectRef idx="0">
+                          <a:schemeClr val="accent1"/>
+                        </a:effectRef>
+                        <a:fontRef idx="minor">
+                          <a:schemeClr val="lt1"/>
+                        </a:fontRef>
+                      </wps:style>
+                      <wps:bodyPr rot="0" spcFirstLastPara="0" vertOverflow="overflow" horzOverflow="overflow" vert="horz" wrap="square" lIns="91440" tIns="45720" rIns="91440" bIns="45720" numCol="1" spcCol="0" rtlCol="0" fromWordArt="0" anchor="ctr" anchorCtr="0" forceAA="0" compatLnSpc="1">
+                        <a:prstTxWarp prst="textNoShape">
+                          <a:avLst/>
+                        </a:prstTxWarp>
+                        <a:noAutofit/>
+                      </wps:bodyPr>
+                    </wps:wsp>
+                  </a:graphicData>
+                </a:graphic>
+                <wp14:sizeRelH relativeFrom="margin">
+                  <wp14:pctWidth>0</wp14:pctWidth>
+                </wp14:sizeRelH>
+                <wp14:sizeRelV relativeFrom="margin">
+                  <wp14:pctHeight>0</wp14:pctHeight>
+                </wp14:sizeRelV>
+              </wp:anchor>
+            </w:drawing>
+          </mc:Choice>
+          <mc:Fallback>
+            <w:pict>
+              <v:rect w14:anchorId="066C261D" id="Rechteck 2" o:spid="_x0000_s1026" style="position:absolute;margin-left:0;margin-top:30.45pt;width:162.5pt;height:211pt;z-index:251692032;visibility:visible;mso-wrap-style:square;mso-width-percent:0;mso-height-percent:0;mso-wrap-distance-left:9pt;mso-wrap-distance-top:0;mso-wrap-distance-right:9pt;mso-wrap-distance-bottom:0;mso-position-horizontal:absolute;mso-position-horizontal-relative:text;mso-position-vertical:absolute;mso-position-vertical-relative:text;mso-width-percent:0;mso-height-percent:0;mso-width-relative:margin;mso-height-relative:margin;v-text-anchor:middle" o:gfxdata="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" fillcolor="#4472c4 [3204]" strokecolor="#09101d [484]" strokeweight="1pt">
+                <w10:wrap type="square"/>
+              </v:rect>
+            </w:pict>
+          </mc:Fallback>
+        </mc:AlternateContent>
+      </w:r>
+      <w:r>
+        <w:rPr>
+          <w:lang w:val="en-US"/>
+        </w:rPr>
+        <w:t>Ubir</w:t>
+      </w:r>
+    </w:p>
+    <w:p>
+      <w:pPr>
+        <w:rPr>
+          <w:lang w:val="en-US"/>
+        </w:rPr>
+      </w:pPr>
+      <w:r>
+        <w:rPr>
+          <w:lang w:val="en-US"/>
+        </w:rPr>
+        <w:t>Age/Birthday:</w:t>
+      </w:r>
+      <w:r>
+        <w:rPr>
+          <w:lang w:val="en-US"/>
+        </w:rPr>
+        <w:t xml:space="preserve"> 40</w:t>
+      </w:r>
+    </w:p>
+    <w:p>
+      <w:pPr>
+        <w:rPr>
+          <w:lang w:val="en-US"/>
+        </w:rPr>
+      </w:pPr>
+      <w:r>
+        <w:rPr>
+          <w:lang w:val="en-US"/>
+        </w:rPr>
+        <w:t>Bodyform:</w:t>
+      </w:r>
+      <w:r>
+        <w:rPr>
+          <w:lang w:val="en-US"/>
+        </w:rPr>
+        <w:t xml:space="preserve"> long black hear, grey beard, tall, thin</w:t>
+      </w:r>
+    </w:p>
+    <w:p>
+      <w:pPr>
+        <w:rPr>
+          <w:lang w:val="en-US"/>
+        </w:rPr>
+      </w:pPr>
+      <w:r>
+        <w:rPr>
+          <w:lang w:val="en-US"/>
+        </w:rPr>
+        <w:t>Heritage:</w:t>
+      </w:r>
+      <w:r>
+        <w:rPr>
+          <w:lang w:val="en-US"/>
+        </w:rPr>
+        <w:t xml:space="preserve"> Mialkiir</w:t>
+      </w:r>
+    </w:p>
+    <w:p>
+      <w:pPr>
+        <w:rPr>
+          <w:lang w:val="en-US"/>
+        </w:rPr>
+      </w:pPr>
+      <w:r>
+        <w:rPr>
+          <w:lang w:val="en-US"/>
+        </w:rPr>
+        <w:t>Domicile:</w:t>
+      </w:r>
+      <w:r>
+        <w:rPr>
+          <w:lang w:val="en-US"/>
+        </w:rPr>
+        <w:t xml:space="preserve"> Asarat’s Peak</w:t>
+      </w:r>
+    </w:p>
+    <w:p>
+      <w:pPr>
+        <w:rPr>
+          <w:lang w:val="en-US"/>
+        </w:rPr>
+      </w:pPr>
+      <w:r>
+        <w:rPr>
+          <w:lang w:val="en-US"/>
+        </w:rPr>
+        <w:t>Clothing:</w:t>
+      </w:r>
+      <w:r>
+        <w:rPr>
+          <w:lang w:val="en-US"/>
+        </w:rPr>
+        <w:t xml:space="preserve"> brownish clothes with a </w:t>
+      </w:r>
+    </w:p>
+    <w:p>
+      <w:pPr>
+        <w:rPr>
+          <w:lang w:val="en-US"/>
+        </w:rPr>
+      </w:pPr>
+      <w:r>
+        <w:rPr>
+          <w:lang w:val="en-US"/>
+        </w:rPr>
+        <w:t>Affiliation:</w:t>
+      </w:r>
+    </w:p>
+    <w:p>
+      <w:pPr>
+        <w:rPr>
+          <w:lang w:val="en-US"/>
+        </w:rPr>
+      </w:pPr>
+      <w:r>
+        <w:rPr>
+          <w:lang w:val="en-US"/>
+        </w:rPr>
+        <w:t>Abilities:</w:t>
+      </w:r>
+    </w:p>
+    <w:p>
+      <w:pPr>
+        <w:rPr>
+          <w:lang w:val="en-US"/>
+        </w:rPr>
+      </w:pPr>
+      <w:r>
+        <w:rPr>
+          <w:lang w:val="en-US"/>
+        </w:rPr>
+        <w:t>Personality: first friendly, then flippish and angry, then humble</w:t>
+      </w:r>
+    </w:p>
+    <w:p>
+      <w:pPr>
+        <w:rPr>
+          <w:lang w:val="en-US"/>
+        </w:rPr>
+      </w:pPr>
+      <w:r>
+        <w:rPr>
+          <w:lang w:val="en-US"/>
+        </w:rPr>
+        <w:br/>
+        <w:t>Synopsis:</w:t>
+      </w:r>
+    </w:p>
+    <w:p>
+      <w:pPr>
+        <w:pStyle w:val="berschrift2"/>
+        <w:ind w:left="708" w:hanging="708"/>
+        <w:rPr>
+          <w:lang w:val="en-US"/>
+        </w:rPr>
+      </w:pPr>
+      <w:r>
+        <w:rPr>
+          <w:noProof/>
+        </w:rPr>
+        <w:lastRenderedPageBreak/>
+        <mc:AlternateContent>
+          <mc:Choice Requires="wps">
+            <w:drawing>
+              <wp:anchor distT="0" distB="0" distL="114300" distR="114300" simplePos="0" relativeHeight="251694080" behindDoc="0" locked="0" layoutInCell="1" allowOverlap="1" wp14:anchorId="200FC5CD" wp14:editId="18240DCF">
+                <wp:simplePos x="0" y="0"/>
+                <wp:positionH relativeFrom="column">
+                  <wp:posOffset>0</wp:posOffset>
+                </wp:positionH>
+                <wp:positionV relativeFrom="paragraph">
+                  <wp:posOffset>386715</wp:posOffset>
+                </wp:positionV>
+                <wp:extent cx="2063750" cy="2679700"/>
+                <wp:effectExtent l="0" t="0" r="12700" b="25400"/>
+                <wp:wrapSquare wrapText="bothSides"/>
+                <wp:docPr id="2071088021" name="Rechteck 2"/>
+                <wp:cNvGraphicFramePr/>
+                <a:graphic xmlns:a="http://schemas.openxmlformats.org/drawingml/2006/main">
+                  <a:graphicData uri="http://schemas.microsoft.com/office/word/2010/wordprocessingShape">
+                    <wps:wsp>
+                      <wps:cNvSpPr/>
+                      <wps:spPr>
+                        <a:xfrm>
+                          <a:off x="0" y="0"/>
+                          <a:ext cx="2063750" cy="2679700"/>
+                        </a:xfrm>
+                        <a:prstGeom prst="rect">
+                          <a:avLst/>
+                        </a:prstGeom>
+                      </wps:spPr>
+                      <wps:style>
+                        <a:lnRef idx="2">
+                          <a:schemeClr val="accent1">
+                            <a:shade val="15000"/>
+                          </a:schemeClr>
+                        </a:lnRef>
+                        <a:fillRef idx="1">
+                          <a:schemeClr val="accent1"/>
+                        </a:fillRef>
+                        <a:effectRef idx="0">
+                          <a:schemeClr val="accent1"/>
+                        </a:effectRef>
+                        <a:fontRef idx="minor">
+                          <a:schemeClr val="lt1"/>
+                        </a:fontRef>
+                      </wps:style>
+                      <wps:bodyPr rot="0" spcFirstLastPara="0" vertOverflow="overflow" horzOverflow="overflow" vert="horz" wrap="square" lIns="91440" tIns="45720" rIns="91440" bIns="45720" numCol="1" spcCol="0" rtlCol="0" fromWordArt="0" anchor="ctr" anchorCtr="0" forceAA="0" compatLnSpc="1">
+                        <a:prstTxWarp prst="textNoShape">
+                          <a:avLst/>
+                        </a:prstTxWarp>
+                        <a:noAutofit/>
+                      </wps:bodyPr>
+                    </wps:wsp>
+                  </a:graphicData>
+                </a:graphic>
+                <wp14:sizeRelH relativeFrom="margin">
+                  <wp14:pctWidth>0</wp14:pctWidth>
+                </wp14:sizeRelH>
+                <wp14:sizeRelV relativeFrom="margin">
+                  <wp14:pctHeight>0</wp14:pctHeight>
+                </wp14:sizeRelV>
+              </wp:anchor>
+            </w:drawing>
+          </mc:Choice>
+          <mc:Fallback>
+            <w:pict>
+              <v:rect w14:anchorId="29790F08" id="Rechteck 2" o:spid="_x0000_s1026" style="position:absolute;margin-left:0;margin-top:30.45pt;width:162.5pt;height:211pt;z-index:251694080;visibility:visible;mso-wrap-style:square;mso-width-percent:0;mso-height-percent:0;mso-wrap-distance-left:9pt;mso-wrap-distance-top:0;mso-wrap-distance-right:9pt;mso-wrap-distance-bottom:0;mso-position-horizontal:absolute;mso-position-horizontal-relative:text;mso-position-vertical:absolute;mso-position-vertical-relative:text;mso-width-percent:0;mso-height-percent:0;mso-width-relative:margin;mso-height-relative:margin;v-text-anchor:middle" o:gfxdata="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" fillcolor="#4472c4 [3204]" strokecolor="#09101d [484]" strokeweight="1pt">
+                <w10:wrap type="square"/>
+              </v:rect>
+            </w:pict>
+          </mc:Fallback>
+        </mc:AlternateContent>
+      </w:r>
+      <w:r>
+        <w:rPr>
+          <w:lang w:val="en-US"/>
+        </w:rPr>
+        <w:t>Merial</w:t>
+      </w:r>
+    </w:p>
+    <w:p>
+      <w:pPr>
+        <w:rPr>
+          <w:lang w:val="en-US"/>
+        </w:rPr>
+      </w:pPr>
+      <w:r>
+        <w:rPr>
+          <w:lang w:val="en-US"/>
+        </w:rPr>
+        <w:t>Age/Birthday:</w:t>
+      </w:r>
+      <w:r>
+        <w:rPr>
+          <w:lang w:val="en-US"/>
+        </w:rPr>
+        <w:t xml:space="preserve"> 35</w:t>
+      </w:r>
+    </w:p>
+    <w:p>
+      <w:pPr>
+        <w:rPr>
+          <w:lang w:val="en-US"/>
+        </w:rPr>
+      </w:pPr>
+      <w:r>
+        <w:rPr>
+          <w:lang w:val="en-US"/>
+        </w:rPr>
+        <w:t>Bodyform:</w:t>
+      </w:r>
+      <w:r>
+        <w:rPr>
+          <w:lang w:val="en-US"/>
+        </w:rPr>
+        <w:t xml:space="preserve"> blonde, green eyes, tall, broad</w:t>
+      </w:r>
+    </w:p>
+    <w:p>
+      <w:pPr>
+        <w:rPr>
+          <w:lang w:val="en-US"/>
+        </w:rPr>
+      </w:pPr>
+      <w:r>
+        <w:rPr>
+          <w:lang w:val="en-US"/>
+        </w:rPr>
+        <w:t>Heritage:</w:t>
+      </w:r>
+      <w:r>
+        <w:rPr>
+          <w:lang w:val="en-US"/>
+        </w:rPr>
+        <w:t xml:space="preserve"> Al</w:t>
+      </w:r>
+    </w:p>
+    <w:p>
+      <w:pPr>
+        <w:rPr>
+          <w:lang w:val="en-US"/>
+        </w:rPr>
+      </w:pPr>
+      <w:r>
+        <w:rPr>
+          <w:lang w:val="en-US"/>
+        </w:rPr>
+        <w:t>Domicile:</w:t>
+      </w:r>
+      <w:r>
+        <w:rPr>
+          <w:lang w:val="en-US"/>
+        </w:rPr>
+        <w:t xml:space="preserve"> Asarat’s Peak</w:t>
+      </w:r>
+    </w:p>
+    <w:p>
+      <w:pPr>
+        <w:rPr>
+          <w:lang w:val="en-US"/>
+        </w:rPr>
+      </w:pPr>
+      <w:r>
+        <w:rPr>
+          <w:lang w:val="en-US"/>
+        </w:rPr>
+        <w:t>Clothing:</w:t>
+      </w:r>
+      <w:r>
+        <w:rPr>
+          <w:lang w:val="en-US"/>
+        </w:rPr>
+        <w:t xml:space="preserve"> Special Guard uniform, blue with gold trim, tight fit</w:t>
+      </w:r>
+    </w:p>
+    <w:p>
+      <w:pPr>
+        <w:rPr>
+          <w:lang w:val="en-US"/>
+        </w:rPr>
+      </w:pPr>
+      <w:r>
+        <w:rPr>
+          <w:lang w:val="en-US"/>
+        </w:rPr>
+        <w:t>Affiliation:</w:t>
+      </w:r>
+      <w:r>
+        <w:rPr>
+          <w:lang w:val="en-US"/>
+        </w:rPr>
+        <w:t xml:space="preserve"> </w:t>
+      </w:r>
+      <w:r>
+        <w:rPr>
+          <w:lang w:val="en-US"/>
+        </w:rPr>
+        <w:t>Bureaurocradom</w:t>
+      </w:r>
+    </w:p>
+    <w:p>
+      <w:pPr>
+        <w:rPr>
+          <w:lang w:val="en-US"/>
+        </w:rPr>
+      </w:pPr>
+      <w:r>
+        <w:rPr>
+          <w:lang w:val="en-US"/>
+        </w:rPr>
+        <w:t>Abilities:</w:t>
+      </w:r>
+      <w:r>
+        <w:rPr>
+          <w:lang w:val="en-US"/>
+        </w:rPr>
+        <w:t xml:space="preserve"> Aikstice</w:t>
+      </w:r>
+    </w:p>
+    <w:p>
+      <w:pPr>
+        <w:rPr>
+          <w:lang w:val="en-US"/>
+        </w:rPr>
+      </w:pPr>
+      <w:r>
+        <w:rPr>
+          <w:lang w:val="en-US"/>
+        </w:rPr>
+        <w:t>Personality: brutal to friendly in a heartbeat</w:t>
+      </w:r>
+    </w:p>
+    <w:p>
+      <w:pPr>
+        <w:rPr>
+          <w:lang w:val="en-US"/>
+        </w:rPr>
+      </w:pPr>
+      <w:r>
+        <w:rPr>
+          <w:lang w:val="en-US"/>
+        </w:rPr>
+        <w:br/>
+        <w:t>Synopsis:</w:t>
+      </w:r>
+      <w:r>
+        <w:rPr>
+          <w:lang w:val="en-US"/>
+        </w:rPr>
+        <w:t xml:space="preserve"> Special Harmonist Guard (Sha) of Asarat’s Peak, captured the thief</w:t>
+      </w:r>
+    </w:p>
+    <w:p>
+      <w:pPr>
+        <w:rPr>
+          <w:lang w:val="en-US"/>
+        </w:rPr>
+      </w:pPr>
+    </w:p>
+    <w:p>
+      <w:pPr>
+        <w:pStyle w:val="berschrift1"/>
+        <w:rPr>
+          <w:lang w:val="en-US"/>
+        </w:rPr>
+      </w:pPr>
+      <w:r>
+        <w:rPr>
+          <w:lang w:val="en-US"/>
+        </w:rPr>
+        <w:t>Jor’s Group</w:t>
+      </w:r>
     </w:p>
     <w:p>
       <w:pPr>
@@ -2057,19 +2925,7 @@
         <w:rPr>
           <w:lang w:val="en-US"/>
         </w:rPr>
-        <w:t>Jor Mar-</w:t>
-      </w:r>
-      <w:r>
-        <w:rPr>
-          <w:lang w:val="en-US"/>
-        </w:rPr>
-        <w:t>L</w:t>
-      </w:r>
-      <w:r>
-        <w:rPr>
-          <w:lang w:val="en-US"/>
-        </w:rPr>
-        <w:t>or</w:t>
+        <w:t>Jor Mar-Lor</w:t>
       </w:r>
     </w:p>
     <w:p>
@@ -2091,19 +2947,11 @@
           <w:lang w:val="en-US"/>
         </w:rPr>
       </w:pPr>
-      <w:proofErr w:type="spellStart"/>
-      <w:r>
-        <w:rPr>
-          <w:lang w:val="en-US"/>
-        </w:rPr>
-        <w:t>Bodyform</w:t>
-      </w:r>
-      <w:proofErr w:type="spellEnd"/>
-      <w:r>
-        <w:rPr>
-          <w:lang w:val="en-US"/>
-        </w:rPr>
-        <w:t>:</w:t>
+      <w:r>
+        <w:rPr>
+          <w:lang w:val="en-US"/>
+        </w:rPr>
+        <w:t>Bodyform:</w:t>
       </w:r>
     </w:p>
     <w:p>
@@ -2299,7 +3147,13 @@
         <w:rPr>
           <w:lang w:val="en-US"/>
         </w:rPr>
-        <w:t>Jevan Dra-Gen</w:t>
+        <w:t>Jevan Dra-</w:t>
+      </w:r>
+      <w:r>
+        <w:rPr>
+          <w:lang w:val="en-US"/>
+        </w:rPr>
+        <w:t>N</w:t>
       </w:r>
     </w:p>
     <w:p>
@@ -2321,19 +3175,11 @@
           <w:lang w:val="en-US"/>
         </w:rPr>
       </w:pPr>
-      <w:proofErr w:type="spellStart"/>
-      <w:r>
-        <w:rPr>
-          <w:lang w:val="en-US"/>
-        </w:rPr>
-        <w:t>Bodyform</w:t>
-      </w:r>
-      <w:proofErr w:type="spellEnd"/>
-      <w:r>
-        <w:rPr>
-          <w:lang w:val="en-US"/>
-        </w:rPr>
-        <w:t>:</w:t>
+      <w:r>
+        <w:rPr>
+          <w:lang w:val="en-US"/>
+        </w:rPr>
+        <w:t>Bodyform:</w:t>
       </w:r>
     </w:p>
     <w:p>
@@ -2524,14 +3370,12 @@
         </w:rPr>
         <w:t xml:space="preserve"> </w:t>
       </w:r>
-      <w:proofErr w:type="spellStart"/>
       <w:r>
         <w:rPr>
           <w:lang w:val="en-US"/>
         </w:rPr>
         <w:t>Dormir</w:t>
       </w:r>
-      <w:proofErr w:type="spellEnd"/>
     </w:p>
     <w:p>
       <w:pPr>
@@ -2552,19 +3396,11 @@
           <w:lang w:val="en-US"/>
         </w:rPr>
       </w:pPr>
-      <w:proofErr w:type="spellStart"/>
-      <w:r>
-        <w:rPr>
-          <w:lang w:val="en-US"/>
-        </w:rPr>
-        <w:t>Bodyform</w:t>
-      </w:r>
-      <w:proofErr w:type="spellEnd"/>
-      <w:r>
-        <w:rPr>
-          <w:lang w:val="en-US"/>
-        </w:rPr>
-        <w:t>:</w:t>
+      <w:r>
+        <w:rPr>
+          <w:lang w:val="en-US"/>
+        </w:rPr>
+        <w:t>Bodyform:</w:t>
       </w:r>
     </w:p>
     <w:p>
@@ -2756,14 +3592,12 @@
         </w:rPr>
         <w:t xml:space="preserve"> </w:t>
       </w:r>
-      <w:proofErr w:type="spellStart"/>
       <w:r>
         <w:rPr>
           <w:lang w:val="en-US"/>
         </w:rPr>
         <w:t>Lanilor</w:t>
       </w:r>
-      <w:proofErr w:type="spellEnd"/>
     </w:p>
     <w:p>
       <w:pPr>
@@ -2784,19 +3618,11 @@
           <w:lang w:val="en-US"/>
         </w:rPr>
       </w:pPr>
-      <w:proofErr w:type="spellStart"/>
-      <w:r>
-        <w:rPr>
-          <w:lang w:val="en-US"/>
-        </w:rPr>
-        <w:t>Bodyform</w:t>
-      </w:r>
-      <w:proofErr w:type="spellEnd"/>
-      <w:r>
-        <w:rPr>
-          <w:lang w:val="en-US"/>
-        </w:rPr>
-        <w:t>:</w:t>
+      <w:r>
+        <w:rPr>
+          <w:lang w:val="en-US"/>
+        </w:rPr>
+        <w:t>Bodyform:</w:t>
       </w:r>
     </w:p>
     <w:p>
@@ -3013,19 +3839,11 @@
           <w:lang w:val="en-US"/>
         </w:rPr>
       </w:pPr>
-      <w:proofErr w:type="spellStart"/>
-      <w:r>
-        <w:rPr>
-          <w:lang w:val="en-US"/>
-        </w:rPr>
-        <w:t>Bodyform</w:t>
-      </w:r>
-      <w:proofErr w:type="spellEnd"/>
-      <w:r>
-        <w:rPr>
-          <w:lang w:val="en-US"/>
-        </w:rPr>
-        <w:t>:</w:t>
+      <w:r>
+        <w:rPr>
+          <w:lang w:val="en-US"/>
+        </w:rPr>
+        <w:t>Bodyform:</w:t>
       </w:r>
     </w:p>
     <w:p>
@@ -3243,19 +4061,11 @@
           <w:lang w:val="en-US"/>
         </w:rPr>
       </w:pPr>
-      <w:proofErr w:type="spellStart"/>
-      <w:r>
-        <w:rPr>
-          <w:lang w:val="en-US"/>
-        </w:rPr>
-        <w:t>Bodyform</w:t>
-      </w:r>
-      <w:proofErr w:type="spellEnd"/>
-      <w:r>
-        <w:rPr>
-          <w:lang w:val="en-US"/>
-        </w:rPr>
-        <w:t>:</w:t>
+      <w:r>
+        <w:rPr>
+          <w:lang w:val="en-US"/>
+        </w:rPr>
+        <w:t>Bodyform:</w:t>
       </w:r>
     </w:p>
     <w:p>
@@ -3446,16 +4256,14 @@
         </w:rPr>
         <w:t xml:space="preserve"> </w:t>
       </w:r>
-      <w:bookmarkStart w:id="0" w:name="_Hlk224676340"/>
-      <w:proofErr w:type="spellStart"/>
+      <w:bookmarkStart w:id="1" w:name="_Hlk224676340"/>
       <w:r>
         <w:rPr>
           <w:lang w:val="en-US"/>
         </w:rPr>
         <w:t>Jazialilin</w:t>
       </w:r>
-      <w:bookmarkEnd w:id="0"/>
-      <w:proofErr w:type="spellEnd"/>
+      <w:bookmarkEnd w:id="1"/>
     </w:p>
     <w:p>
       <w:pPr>
@@ -3476,19 +4284,11 @@
           <w:lang w:val="en-US"/>
         </w:rPr>
       </w:pPr>
-      <w:proofErr w:type="spellStart"/>
-      <w:r>
-        <w:rPr>
-          <w:lang w:val="en-US"/>
-        </w:rPr>
-        <w:t>Bodyform</w:t>
-      </w:r>
-      <w:proofErr w:type="spellEnd"/>
-      <w:r>
-        <w:rPr>
-          <w:lang w:val="en-US"/>
-        </w:rPr>
-        <w:t>:</w:t>
+      <w:r>
+        <w:rPr>
+          <w:lang w:val="en-US"/>
+        </w:rPr>
+        <w:t>Bodyform:</w:t>
       </w:r>
     </w:p>
     <w:p>
@@ -3596,6 +4396,536 @@
           <w:lang w:val="en-US"/>
         </w:rPr>
       </w:pPr>
+    </w:p>
+    <w:p>
+      <w:pPr>
+        <w:pStyle w:val="berschrift2"/>
+        <w:rPr>
+          <w:lang w:val="en-US"/>
+        </w:rPr>
+      </w:pPr>
+      <w:r>
+        <w:rPr>
+          <w:lang w:val="en-US"/>
+        </w:rPr>
+        <w:lastRenderedPageBreak/>
+        <w:t>Priests of Sun and Moon</w:t>
+      </w:r>
+    </w:p>
+    <w:p>
+      <w:pPr>
+        <w:pStyle w:val="berschrift2"/>
+        <w:ind w:left="708" w:hanging="708"/>
+        <w:rPr>
+          <w:lang w:val="en-US"/>
+        </w:rPr>
+      </w:pPr>
+      <w:r>
+        <w:rPr>
+          <w:noProof/>
+        </w:rPr>
+        <mc:AlternateContent>
+          <mc:Choice Requires="wps">
+            <w:drawing>
+              <wp:anchor distT="0" distB="0" distL="114300" distR="114300" simplePos="0" relativeHeight="251696128" behindDoc="0" locked="0" layoutInCell="1" allowOverlap="1" wp14:anchorId="3A46EC44" wp14:editId="4DE2C857">
+                <wp:simplePos x="0" y="0"/>
+                <wp:positionH relativeFrom="column">
+                  <wp:posOffset>0</wp:posOffset>
+                </wp:positionH>
+                <wp:positionV relativeFrom="paragraph">
+                  <wp:posOffset>386715</wp:posOffset>
+                </wp:positionV>
+                <wp:extent cx="2063750" cy="2679700"/>
+                <wp:effectExtent l="0" t="0" r="12700" b="25400"/>
+                <wp:wrapSquare wrapText="bothSides"/>
+                <wp:docPr id="145831076" name="Rechteck 2"/>
+                <wp:cNvGraphicFramePr/>
+                <a:graphic xmlns:a="http://schemas.openxmlformats.org/drawingml/2006/main">
+                  <a:graphicData uri="http://schemas.microsoft.com/office/word/2010/wordprocessingShape">
+                    <wps:wsp>
+                      <wps:cNvSpPr/>
+                      <wps:spPr>
+                        <a:xfrm>
+                          <a:off x="0" y="0"/>
+                          <a:ext cx="2063750" cy="2679700"/>
+                        </a:xfrm>
+                        <a:prstGeom prst="rect">
+                          <a:avLst/>
+                        </a:prstGeom>
+                      </wps:spPr>
+                      <wps:style>
+                        <a:lnRef idx="2">
+                          <a:schemeClr val="accent1">
+                            <a:shade val="15000"/>
+                          </a:schemeClr>
+                        </a:lnRef>
+                        <a:fillRef idx="1">
+                          <a:schemeClr val="accent1"/>
+                        </a:fillRef>
+                        <a:effectRef idx="0">
+                          <a:schemeClr val="accent1"/>
+                        </a:effectRef>
+                        <a:fontRef idx="minor">
+                          <a:schemeClr val="lt1"/>
+                        </a:fontRef>
+                      </wps:style>
+                      <wps:bodyPr rot="0" spcFirstLastPara="0" vertOverflow="overflow" horzOverflow="overflow" vert="horz" wrap="square" lIns="91440" tIns="45720" rIns="91440" bIns="45720" numCol="1" spcCol="0" rtlCol="0" fromWordArt="0" anchor="ctr" anchorCtr="0" forceAA="0" compatLnSpc="1">
+                        <a:prstTxWarp prst="textNoShape">
+                          <a:avLst/>
+                        </a:prstTxWarp>
+                        <a:noAutofit/>
+                      </wps:bodyPr>
+                    </wps:wsp>
+                  </a:graphicData>
+                </a:graphic>
+                <wp14:sizeRelH relativeFrom="margin">
+                  <wp14:pctWidth>0</wp14:pctWidth>
+                </wp14:sizeRelH>
+                <wp14:sizeRelV relativeFrom="margin">
+                  <wp14:pctHeight>0</wp14:pctHeight>
+                </wp14:sizeRelV>
+              </wp:anchor>
+            </w:drawing>
+          </mc:Choice>
+          <mc:Fallback>
+            <w:pict>
+              <v:rect w14:anchorId="2C4D4873" id="Rechteck 2" o:spid="_x0000_s1026" style="position:absolute;margin-left:0;margin-top:30.45pt;width:162.5pt;height:211pt;z-index:251696128;visibility:visible;mso-wrap-style:square;mso-width-percent:0;mso-height-percent:0;mso-wrap-distance-left:9pt;mso-wrap-distance-top:0;mso-wrap-distance-right:9pt;mso-wrap-distance-bottom:0;mso-position-horizontal:absolute;mso-position-horizontal-relative:text;mso-position-vertical:absolute;mso-position-vertical-relative:text;mso-width-percent:0;mso-height-percent:0;mso-width-relative:margin;mso-height-relative:margin;v-text-anchor:middle" o:gfxdata="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" fillcolor="#4472c4 [3204]" strokecolor="#09101d [484]" strokeweight="1pt">
+                <w10:wrap type="square"/>
+              </v:rect>
+            </w:pict>
+          </mc:Fallback>
+        </mc:AlternateContent>
+      </w:r>
+      <w:r>
+        <w:rPr>
+          <w:lang w:val="en-US"/>
+        </w:rPr>
+        <w:t xml:space="preserve"> </w:t>
+      </w:r>
+      <w:r>
+        <w:rPr>
+          <w:lang w:val="en-US"/>
+        </w:rPr>
+        <w:t>Kavair Trelid</w:t>
+      </w:r>
+    </w:p>
+    <w:p>
+      <w:pPr>
+        <w:rPr>
+          <w:lang w:val="en-US"/>
+        </w:rPr>
+      </w:pPr>
+      <w:r>
+        <w:rPr>
+          <w:lang w:val="en-US"/>
+        </w:rPr>
+        <w:t>Age/Birthday:</w:t>
+      </w:r>
+    </w:p>
+    <w:p>
+      <w:pPr>
+        <w:rPr>
+          <w:lang w:val="en-US"/>
+        </w:rPr>
+      </w:pPr>
+      <w:r>
+        <w:rPr>
+          <w:lang w:val="en-US"/>
+        </w:rPr>
+        <w:t>Bodyform:</w:t>
+      </w:r>
+    </w:p>
+    <w:p>
+      <w:pPr>
+        <w:rPr>
+          <w:lang w:val="en-US"/>
+        </w:rPr>
+      </w:pPr>
+      <w:r>
+        <w:rPr>
+          <w:lang w:val="en-US"/>
+        </w:rPr>
+        <w:t>Heritage:</w:t>
+      </w:r>
+      <w:r>
+        <w:rPr>
+          <w:lang w:val="en-US"/>
+        </w:rPr>
+        <w:t xml:space="preserve"> Married to Siinal Trelid (holy last name)</w:t>
+      </w:r>
+    </w:p>
+    <w:p>
+      <w:pPr>
+        <w:rPr>
+          <w:lang w:val="en-US"/>
+        </w:rPr>
+      </w:pPr>
+      <w:r>
+        <w:rPr>
+          <w:lang w:val="en-US"/>
+        </w:rPr>
+        <w:t>Domicile:</w:t>
+      </w:r>
+      <w:r>
+        <w:rPr>
+          <w:lang w:val="en-US"/>
+        </w:rPr>
+        <w:t xml:space="preserve"> Temple of Sun and Moon</w:t>
+      </w:r>
+    </w:p>
+    <w:p>
+      <w:pPr>
+        <w:rPr>
+          <w:lang w:val="en-US"/>
+        </w:rPr>
+      </w:pPr>
+      <w:r>
+        <w:rPr>
+          <w:lang w:val="en-US"/>
+        </w:rPr>
+        <w:t>Clothing:</w:t>
+      </w:r>
+      <w:r>
+        <w:rPr>
+          <w:lang w:val="en-US"/>
+        </w:rPr>
+        <w:t xml:space="preserve"> Robes of Temple of Sun and Moon</w:t>
+      </w:r>
+    </w:p>
+    <w:p>
+      <w:pPr>
+        <w:rPr>
+          <w:lang w:val="en-US"/>
+        </w:rPr>
+      </w:pPr>
+      <w:r>
+        <w:rPr>
+          <w:lang w:val="en-US"/>
+        </w:rPr>
+        <w:t>Affiliation:</w:t>
+      </w:r>
+      <w:r>
+        <w:rPr>
+          <w:lang w:val="en-US"/>
+        </w:rPr>
+        <w:t xml:space="preserve"> Temple of Sun and Moon</w:t>
+      </w:r>
+    </w:p>
+    <w:p>
+      <w:pPr>
+        <w:rPr>
+          <w:lang w:val="en-US"/>
+        </w:rPr>
+      </w:pPr>
+      <w:r>
+        <w:rPr>
+          <w:lang w:val="en-US"/>
+        </w:rPr>
+        <w:t>Abilities:</w:t>
+      </w:r>
+      <w:r>
+        <w:rPr>
+          <w:lang w:val="en-US"/>
+        </w:rPr>
+        <w:t xml:space="preserve"> </w:t>
+      </w:r>
+      <w:r>
+        <w:rPr>
+          <w:lang w:val="en-US"/>
+        </w:rPr>
+        <w:t>Shistice</w:t>
+      </w:r>
+    </w:p>
+    <w:p>
+      <w:pPr>
+        <w:rPr>
+          <w:lang w:val="en-US"/>
+        </w:rPr>
+      </w:pPr>
+      <w:r>
+        <w:rPr>
+          <w:lang w:val="en-US"/>
+        </w:rPr>
+        <w:t>Personality:</w:t>
+      </w:r>
+    </w:p>
+    <w:p>
+      <w:pPr>
+        <w:rPr>
+          <w:lang w:val="en-US"/>
+        </w:rPr>
+      </w:pPr>
+      <w:r>
+        <w:rPr>
+          <w:lang w:val="en-US"/>
+        </w:rPr>
+        <w:br/>
+        <w:t>Synopsis:</w:t>
+      </w:r>
+      <w:r>
+        <w:rPr>
+          <w:lang w:val="en-US"/>
+        </w:rPr>
+        <w:t xml:space="preserve"> has had visions of Camille months before the first book, telling him to slowly degrade her and make her miserable. Didn’t know why, but kept faith in his religion and the Immortal Oracle</w:t>
+      </w:r>
+    </w:p>
+    <w:p>
+      <w:pPr>
+        <w:rPr>
+          <w:lang w:val="en-US"/>
+        </w:rPr>
+      </w:pPr>
+    </w:p>
+    <w:p>
+      <w:pPr>
+        <w:pStyle w:val="berschrift2"/>
+        <w:ind w:left="708" w:hanging="708"/>
+        <w:rPr>
+          <w:lang w:val="en-US"/>
+        </w:rPr>
+      </w:pPr>
+      <w:r>
+        <w:rPr>
+          <w:noProof/>
+        </w:rPr>
+        <mc:AlternateContent>
+          <mc:Choice Requires="wps">
+            <w:drawing>
+              <wp:anchor distT="0" distB="0" distL="114300" distR="114300" simplePos="0" relativeHeight="251698176" behindDoc="0" locked="0" layoutInCell="1" allowOverlap="1" wp14:anchorId="617CE5E6" wp14:editId="0F8C9DF8">
+                <wp:simplePos x="0" y="0"/>
+                <wp:positionH relativeFrom="column">
+                  <wp:posOffset>0</wp:posOffset>
+                </wp:positionH>
+                <wp:positionV relativeFrom="paragraph">
+                  <wp:posOffset>386715</wp:posOffset>
+                </wp:positionV>
+                <wp:extent cx="2063750" cy="2679700"/>
+                <wp:effectExtent l="0" t="0" r="12700" b="25400"/>
+                <wp:wrapSquare wrapText="bothSides"/>
+                <wp:docPr id="1304401918" name="Rechteck 2"/>
+                <wp:cNvGraphicFramePr/>
+                <a:graphic xmlns:a="http://schemas.openxmlformats.org/drawingml/2006/main">
+                  <a:graphicData uri="http://schemas.microsoft.com/office/word/2010/wordprocessingShape">
+                    <wps:wsp>
+                      <wps:cNvSpPr/>
+                      <wps:spPr>
+                        <a:xfrm>
+                          <a:off x="0" y="0"/>
+                          <a:ext cx="2063750" cy="2679700"/>
+                        </a:xfrm>
+                        <a:prstGeom prst="rect">
+                          <a:avLst/>
+                        </a:prstGeom>
+                      </wps:spPr>
+                      <wps:style>
+                        <a:lnRef idx="2">
+                          <a:schemeClr val="accent1">
+                            <a:shade val="15000"/>
+                          </a:schemeClr>
+                        </a:lnRef>
+                        <a:fillRef idx="1">
+                          <a:schemeClr val="accent1"/>
+                        </a:fillRef>
+                        <a:effectRef idx="0">
+                          <a:schemeClr val="accent1"/>
+                        </a:effectRef>
+                        <a:fontRef idx="minor">
+                          <a:schemeClr val="lt1"/>
+                        </a:fontRef>
+                      </wps:style>
+                      <wps:bodyPr rot="0" spcFirstLastPara="0" vertOverflow="overflow" horzOverflow="overflow" vert="horz" wrap="square" lIns="91440" tIns="45720" rIns="91440" bIns="45720" numCol="1" spcCol="0" rtlCol="0" fromWordArt="0" anchor="ctr" anchorCtr="0" forceAA="0" compatLnSpc="1">
+                        <a:prstTxWarp prst="textNoShape">
+                          <a:avLst/>
+                        </a:prstTxWarp>
+                        <a:noAutofit/>
+                      </wps:bodyPr>
+                    </wps:wsp>
+                  </a:graphicData>
+                </a:graphic>
+                <wp14:sizeRelH relativeFrom="margin">
+                  <wp14:pctWidth>0</wp14:pctWidth>
+                </wp14:sizeRelH>
+                <wp14:sizeRelV relativeFrom="margin">
+                  <wp14:pctHeight>0</wp14:pctHeight>
+                </wp14:sizeRelV>
+              </wp:anchor>
+            </w:drawing>
+          </mc:Choice>
+          <mc:Fallback>
+            <w:pict>
+              <v:rect w14:anchorId="43CC589D" id="Rechteck 2" o:spid="_x0000_s1026" style="position:absolute;margin-left:0;margin-top:30.45pt;width:162.5pt;height:211pt;z-index:251698176;visibility:visible;mso-wrap-style:square;mso-width-percent:0;mso-height-percent:0;mso-wrap-distance-left:9pt;mso-wrap-distance-top:0;mso-wrap-distance-right:9pt;mso-wrap-distance-bottom:0;mso-position-horizontal:absolute;mso-position-horizontal-relative:text;mso-position-vertical:absolute;mso-position-vertical-relative:text;mso-width-percent:0;mso-height-percent:0;mso-width-relative:margin;mso-height-relative:margin;v-text-anchor:middle" o:gfxdata="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" fillcolor="#4472c4 [3204]" strokecolor="#09101d [484]" strokeweight="1pt">
+                <w10:wrap type="square"/>
+              </v:rect>
+            </w:pict>
+          </mc:Fallback>
+        </mc:AlternateContent>
+      </w:r>
+      <w:r>
+        <w:rPr>
+          <w:lang w:val="en-US"/>
+        </w:rPr>
+        <w:t>Siinal Trelid</w:t>
+      </w:r>
+    </w:p>
+    <w:p>
+      <w:pPr>
+        <w:rPr>
+          <w:lang w:val="en-US"/>
+        </w:rPr>
+      </w:pPr>
+      <w:r>
+        <w:rPr>
+          <w:lang w:val="en-US"/>
+        </w:rPr>
+        <w:t>Age/Birthday:</w:t>
+      </w:r>
+    </w:p>
+    <w:p>
+      <w:pPr>
+        <w:rPr>
+          <w:lang w:val="en-US"/>
+        </w:rPr>
+      </w:pPr>
+      <w:r>
+        <w:rPr>
+          <w:lang w:val="en-US"/>
+        </w:rPr>
+        <w:t>Bodyform:</w:t>
+      </w:r>
+    </w:p>
+    <w:p>
+      <w:pPr>
+        <w:rPr>
+          <w:lang w:val="en-US"/>
+        </w:rPr>
+      </w:pPr>
+      <w:r>
+        <w:rPr>
+          <w:lang w:val="en-US"/>
+        </w:rPr>
+        <w:t>Heritage:</w:t>
+      </w:r>
+      <w:r>
+        <w:rPr>
+          <w:lang w:val="en-US"/>
+        </w:rPr>
+        <w:t xml:space="preserve"> Married to Kaviar Trelid (holy last name)</w:t>
+      </w:r>
+    </w:p>
+    <w:p>
+      <w:pPr>
+        <w:rPr>
+          <w:lang w:val="en-US"/>
+        </w:rPr>
+      </w:pPr>
+      <w:r>
+        <w:rPr>
+          <w:lang w:val="en-US"/>
+        </w:rPr>
+        <w:t>Domicile:</w:t>
+      </w:r>
+      <w:r>
+        <w:rPr>
+          <w:lang w:val="en-US"/>
+        </w:rPr>
+        <w:t xml:space="preserve"> Temple of Sun and Moon</w:t>
+      </w:r>
+    </w:p>
+    <w:p>
+      <w:pPr>
+        <w:rPr>
+          <w:lang w:val="en-US"/>
+        </w:rPr>
+      </w:pPr>
+      <w:r>
+        <w:rPr>
+          <w:lang w:val="en-US"/>
+        </w:rPr>
+        <w:t>Clothing:</w:t>
+      </w:r>
+      <w:r>
+        <w:rPr>
+          <w:lang w:val="en-US"/>
+        </w:rPr>
+        <w:t xml:space="preserve"> Robes of Temple of Sun and Moon</w:t>
+      </w:r>
+    </w:p>
+    <w:p>
+      <w:pPr>
+        <w:rPr>
+          <w:lang w:val="en-US"/>
+        </w:rPr>
+      </w:pPr>
+      <w:r>
+        <w:rPr>
+          <w:lang w:val="en-US"/>
+        </w:rPr>
+        <w:t>Affiliation:</w:t>
+      </w:r>
+      <w:r>
+        <w:rPr>
+          <w:lang w:val="en-US"/>
+        </w:rPr>
+        <w:t xml:space="preserve"> Temple of Sun and Moon</w:t>
+      </w:r>
+    </w:p>
+    <w:p>
+      <w:pPr>
+        <w:rPr>
+          <w:lang w:val="en-US"/>
+        </w:rPr>
+      </w:pPr>
+      <w:r>
+        <w:rPr>
+          <w:lang w:val="en-US"/>
+        </w:rPr>
+        <w:t>Abilities:</w:t>
+      </w:r>
+      <w:r>
+        <w:rPr>
+          <w:lang w:val="en-US"/>
+        </w:rPr>
+        <w:t xml:space="preserve"> </w:t>
+      </w:r>
+      <w:r>
+        <w:rPr>
+          <w:lang w:val="en-US"/>
+        </w:rPr>
+        <w:t>Shaikstice</w:t>
+      </w:r>
+    </w:p>
+    <w:p>
+      <w:pPr>
+        <w:rPr>
+          <w:lang w:val="en-US"/>
+        </w:rPr>
+      </w:pPr>
+      <w:r>
+        <w:rPr>
+          <w:lang w:val="en-US"/>
+        </w:rPr>
+        <w:t>Personality:</w:t>
+      </w:r>
+    </w:p>
+    <w:p>
+      <w:pPr>
+        <w:rPr>
+          <w:lang w:val="en-US"/>
+        </w:rPr>
+      </w:pPr>
+      <w:r>
+        <w:rPr>
+          <w:lang w:val="en-US"/>
+        </w:rPr>
+        <w:br/>
+        <w:t>Synopsis:</w:t>
+      </w:r>
+      <w:r>
+        <w:rPr>
+          <w:lang w:val="en-US"/>
+        </w:rPr>
+        <w:t xml:space="preserve"> Believes her husbands visions and follows him into the fight</w:t>
+      </w:r>
     </w:p>
     <w:p>
       <w:pPr>
@@ -4255,7 +5585,7 @@
   <w:style w:type="paragraph" w:default="1" w:styleId="Standard">
     <w:name w:val="Normal"/>
     <w:qFormat/>
-    <w:rsid w:val="00BD0D4F"/>
+    <w:rsid w:val="001749A0"/>
   </w:style>
   <w:style w:type="paragraph" w:styleId="berschrift1">
     <w:name w:val="heading 1"/>

</xml_diff>

<commit_message>
Deployed 1489681 with MkDocs version: 1.6.1
</commit_message>
<xml_diff>
--- a/Buch Camille Chronicles/Character-Bios.docx
+++ b/Buch Camille Chronicles/Character-Bios.docx
@@ -132,12 +132,14 @@
           <w:lang w:val="en-US"/>
         </w:rPr>
       </w:pPr>
+      <w:proofErr w:type="spellStart"/>
       <w:r>
         <w:rPr>
           <w:lang w:val="en-US"/>
         </w:rPr>
         <w:t>Bodyform</w:t>
       </w:r>
+      <w:proofErr w:type="spellEnd"/>
       <w:r>
         <w:rPr>
           <w:lang w:val="en-US"/>
@@ -390,11 +392,19 @@
           <w:lang w:val="en-US"/>
         </w:rPr>
       </w:pPr>
-      <w:r>
-        <w:rPr>
-          <w:lang w:val="en-US"/>
-        </w:rPr>
-        <w:t>Bodyform:</w:t>
+      <w:proofErr w:type="spellStart"/>
+      <w:r>
+        <w:rPr>
+          <w:lang w:val="en-US"/>
+        </w:rPr>
+        <w:t>Bodyform</w:t>
+      </w:r>
+      <w:proofErr w:type="spellEnd"/>
+      <w:r>
+        <w:rPr>
+          <w:lang w:val="en-US"/>
+        </w:rPr>
+        <w:t>:</w:t>
       </w:r>
       <w:r>
         <w:rPr>
@@ -459,12 +469,14 @@
         </w:rPr>
         <w:t xml:space="preserve"> </w:t>
       </w:r>
+      <w:proofErr w:type="spellStart"/>
       <w:r>
         <w:rPr>
           <w:lang w:val="en-US"/>
         </w:rPr>
         <w:t>Rintreahr</w:t>
       </w:r>
+      <w:proofErr w:type="spellEnd"/>
     </w:p>
     <w:p>
       <w:pPr>
@@ -514,8 +526,16 @@
         <w:rPr>
           <w:lang w:val="en-US"/>
         </w:rPr>
-        <w:t xml:space="preserve"> Bodymagic</w:t>
-      </w:r>
+        <w:t xml:space="preserve"> </w:t>
+      </w:r>
+      <w:proofErr w:type="spellStart"/>
+      <w:r>
+        <w:rPr>
+          <w:lang w:val="en-US"/>
+        </w:rPr>
+        <w:t>Bodymagic</w:t>
+      </w:r>
+      <w:proofErr w:type="spellEnd"/>
     </w:p>
     <w:p>
       <w:pPr>
@@ -629,12 +649,28 @@
           </mc:Fallback>
         </mc:AlternateContent>
       </w:r>
-      <w:r>
-        <w:rPr>
-          <w:lang w:val="en-US"/>
-        </w:rPr>
-        <w:t>Herriar Ormarill</w:t>
-      </w:r>
+      <w:proofErr w:type="spellStart"/>
+      <w:r>
+        <w:rPr>
+          <w:lang w:val="en-US"/>
+        </w:rPr>
+        <w:t>Herriar</w:t>
+      </w:r>
+      <w:proofErr w:type="spellEnd"/>
+      <w:r>
+        <w:rPr>
+          <w:lang w:val="en-US"/>
+        </w:rPr>
+        <w:t xml:space="preserve"> </w:t>
+      </w:r>
+      <w:proofErr w:type="spellStart"/>
+      <w:r>
+        <w:rPr>
+          <w:lang w:val="en-US"/>
+        </w:rPr>
+        <w:t>Ormarill</w:t>
+      </w:r>
+      <w:proofErr w:type="spellEnd"/>
     </w:p>
     <w:p>
       <w:pPr>
@@ -655,11 +691,19 @@
           <w:lang w:val="en-US"/>
         </w:rPr>
       </w:pPr>
-      <w:r>
-        <w:rPr>
-          <w:lang w:val="en-US"/>
-        </w:rPr>
-        <w:t>Bodyform:</w:t>
+      <w:proofErr w:type="spellStart"/>
+      <w:r>
+        <w:rPr>
+          <w:lang w:val="en-US"/>
+        </w:rPr>
+        <w:t>Bodyform</w:t>
+      </w:r>
+      <w:proofErr w:type="spellEnd"/>
+      <w:r>
+        <w:rPr>
+          <w:lang w:val="en-US"/>
+        </w:rPr>
+        <w:t>:</w:t>
       </w:r>
       <w:r>
         <w:rPr>
@@ -742,8 +786,16 @@
         <w:rPr>
           <w:lang w:val="en-US"/>
         </w:rPr>
-        <w:t xml:space="preserve"> Bodymagic</w:t>
-      </w:r>
+        <w:t xml:space="preserve"> </w:t>
+      </w:r>
+      <w:proofErr w:type="spellStart"/>
+      <w:r>
+        <w:rPr>
+          <w:lang w:val="en-US"/>
+        </w:rPr>
+        <w:t>Bodymagic</w:t>
+      </w:r>
+      <w:proofErr w:type="spellEnd"/>
     </w:p>
     <w:p>
       <w:pPr>
@@ -775,7 +827,33 @@
         <w:rPr>
           <w:lang w:val="en-US"/>
         </w:rPr>
-        <w:t xml:space="preserve"> The Soul that is bound to Camille, tells that he had died of old age so Camille could acquire Bodymagic (instead he had a heart attack while having sex with a prostitute)</w:t>
+        <w:t xml:space="preserve"> The Soul that is bound to Camille, tells that he had died of old age </w:t>
+      </w:r>
+      <w:r>
+        <w:rPr>
+          <w:lang w:val="en-US"/>
+        </w:rPr>
+        <w:t xml:space="preserve">at 76 </w:t>
+      </w:r>
+      <w:r>
+        <w:rPr>
+          <w:lang w:val="en-US"/>
+        </w:rPr>
+        <w:t xml:space="preserve">so Camille could acquire </w:t>
+      </w:r>
+      <w:proofErr w:type="spellStart"/>
+      <w:r>
+        <w:rPr>
+          <w:lang w:val="en-US"/>
+        </w:rPr>
+        <w:t>Bodymagic</w:t>
+      </w:r>
+      <w:proofErr w:type="spellEnd"/>
+      <w:r>
+        <w:rPr>
+          <w:lang w:val="en-US"/>
+        </w:rPr>
+        <w:t xml:space="preserve"> (instead he had a heart attack while having sex with a prostitute)</w:t>
       </w:r>
     </w:p>
     <w:p>
@@ -888,11 +966,19 @@
           <w:lang w:val="en-US"/>
         </w:rPr>
       </w:pPr>
-      <w:r>
-        <w:rPr>
-          <w:lang w:val="en-US"/>
-        </w:rPr>
-        <w:t>Bodyform:</w:t>
+      <w:proofErr w:type="spellStart"/>
+      <w:r>
+        <w:rPr>
+          <w:lang w:val="en-US"/>
+        </w:rPr>
+        <w:t>Bodyform</w:t>
+      </w:r>
+      <w:proofErr w:type="spellEnd"/>
+      <w:r>
+        <w:rPr>
+          <w:lang w:val="en-US"/>
+        </w:rPr>
+        <w:t>:</w:t>
       </w:r>
     </w:p>
     <w:p>
@@ -1078,11 +1164,19 @@
           </mc:Fallback>
         </mc:AlternateContent>
       </w:r>
-      <w:r>
-        <w:rPr>
-          <w:lang w:val="en-US"/>
-        </w:rPr>
-        <w:t>Camilel Father</w:t>
+      <w:proofErr w:type="spellStart"/>
+      <w:r>
+        <w:rPr>
+          <w:lang w:val="en-US"/>
+        </w:rPr>
+        <w:t>Camilel</w:t>
+      </w:r>
+      <w:proofErr w:type="spellEnd"/>
+      <w:r>
+        <w:rPr>
+          <w:lang w:val="en-US"/>
+        </w:rPr>
+        <w:t xml:space="preserve"> Father</w:t>
       </w:r>
     </w:p>
     <w:p>
@@ -1104,11 +1198,19 @@
           <w:lang w:val="en-US"/>
         </w:rPr>
       </w:pPr>
-      <w:r>
-        <w:rPr>
-          <w:lang w:val="en-US"/>
-        </w:rPr>
-        <w:t>Bodyform:</w:t>
+      <w:proofErr w:type="spellStart"/>
+      <w:r>
+        <w:rPr>
+          <w:lang w:val="en-US"/>
+        </w:rPr>
+        <w:t>Bodyform</w:t>
+      </w:r>
+      <w:proofErr w:type="spellEnd"/>
+      <w:r>
+        <w:rPr>
+          <w:lang w:val="en-US"/>
+        </w:rPr>
+        <w:t>:</w:t>
       </w:r>
     </w:p>
     <w:p>
@@ -1224,11 +1326,19 @@
           <w:lang w:val="en-US"/>
         </w:rPr>
       </w:pPr>
-      <w:r>
-        <w:rPr>
-          <w:lang w:val="en-US"/>
-        </w:rPr>
-        <w:t>Camille Mercenary band</w:t>
+      <w:proofErr w:type="spellStart"/>
+      <w:r>
+        <w:rPr>
+          <w:lang w:val="en-US"/>
+        </w:rPr>
+        <w:t>Darior</w:t>
+      </w:r>
+      <w:proofErr w:type="spellEnd"/>
+      <w:r>
+        <w:rPr>
+          <w:lang w:val="en-US"/>
+        </w:rPr>
+        <w:t xml:space="preserve"> Mercenary band</w:t>
       </w:r>
     </w:p>
     <w:p>
@@ -1315,12 +1425,14 @@
           </mc:Fallback>
         </mc:AlternateContent>
       </w:r>
+      <w:proofErr w:type="spellStart"/>
       <w:r>
         <w:rPr>
           <w:lang w:val="en-US"/>
         </w:rPr>
         <w:t>Darior</w:t>
       </w:r>
+      <w:proofErr w:type="spellEnd"/>
     </w:p>
     <w:p>
       <w:pPr>
@@ -1347,11 +1459,19 @@
           <w:lang w:val="en-US"/>
         </w:rPr>
       </w:pPr>
-      <w:r>
-        <w:rPr>
-          <w:lang w:val="en-US"/>
-        </w:rPr>
-        <w:t>Bodyform:</w:t>
+      <w:proofErr w:type="spellStart"/>
+      <w:r>
+        <w:rPr>
+          <w:lang w:val="en-US"/>
+        </w:rPr>
+        <w:t>Bodyform</w:t>
+      </w:r>
+      <w:proofErr w:type="spellEnd"/>
+      <w:r>
+        <w:rPr>
+          <w:lang w:val="en-US"/>
+        </w:rPr>
+        <w:t>:</w:t>
       </w:r>
       <w:r>
         <w:rPr>
@@ -1440,20 +1560,40 @@
         <w:rPr>
           <w:lang w:val="en-US"/>
         </w:rPr>
-        <w:t xml:space="preserve"> Swordslinger</w:t>
-      </w:r>
-    </w:p>
-    <w:p>
-      <w:pPr>
-        <w:rPr>
-          <w:lang w:val="en-US"/>
-        </w:rPr>
-      </w:pPr>
-      <w:r>
-        <w:rPr>
-          <w:lang w:val="en-US"/>
-        </w:rPr>
-        <w:t>Personality: thoughtful, stern, slow to decide</w:t>
+        <w:t xml:space="preserve"> </w:t>
+      </w:r>
+      <w:proofErr w:type="spellStart"/>
+      <w:r>
+        <w:rPr>
+          <w:lang w:val="en-US"/>
+        </w:rPr>
+        <w:t>Mishstice</w:t>
+      </w:r>
+      <w:proofErr w:type="spellEnd"/>
+    </w:p>
+    <w:p>
+      <w:pPr>
+        <w:rPr>
+          <w:lang w:val="en-US"/>
+        </w:rPr>
+      </w:pPr>
+      <w:r>
+        <w:rPr>
+          <w:lang w:val="en-US"/>
+        </w:rPr>
+        <w:t xml:space="preserve">Personality: thoughtful, stern, </w:t>
+      </w:r>
+      <w:r>
+        <w:rPr>
+          <w:lang w:val="en-US"/>
+        </w:rPr>
+        <w:t xml:space="preserve">quick </w:t>
+      </w:r>
+      <w:r>
+        <w:rPr>
+          <w:lang w:val="en-US"/>
+        </w:rPr>
+        <w:t>to decide</w:t>
       </w:r>
     </w:p>
     <w:p>
@@ -1561,12 +1701,14 @@
           </mc:Fallback>
         </mc:AlternateContent>
       </w:r>
+      <w:proofErr w:type="spellStart"/>
       <w:r>
         <w:rPr>
           <w:lang w:val="en-US"/>
         </w:rPr>
         <w:t>Clevar</w:t>
       </w:r>
+      <w:proofErr w:type="spellEnd"/>
     </w:p>
     <w:p>
       <w:pPr>
@@ -1593,17 +1735,31 @@
           <w:lang w:val="en-US"/>
         </w:rPr>
       </w:pPr>
-      <w:r>
-        <w:rPr>
-          <w:lang w:val="en-US"/>
-        </w:rPr>
-        <w:t>Bodyform:</w:t>
-      </w:r>
-      <w:r>
-        <w:rPr>
-          <w:lang w:val="en-US"/>
-        </w:rPr>
-        <w:t xml:space="preserve"> strong, athletic, bald</w:t>
+      <w:proofErr w:type="spellStart"/>
+      <w:r>
+        <w:rPr>
+          <w:lang w:val="en-US"/>
+        </w:rPr>
+        <w:t>Bodyform</w:t>
+      </w:r>
+      <w:proofErr w:type="spellEnd"/>
+      <w:r>
+        <w:rPr>
+          <w:lang w:val="en-US"/>
+        </w:rPr>
+        <w:t>:</w:t>
+      </w:r>
+      <w:r>
+        <w:rPr>
+          <w:lang w:val="en-US"/>
+        </w:rPr>
+        <w:t xml:space="preserve"> </w:t>
+      </w:r>
+      <w:r>
+        <w:rPr>
+          <w:lang w:val="en-US"/>
+        </w:rPr>
+        <w:t>dark tan, dark curly hair, bearded</w:t>
       </w:r>
     </w:p>
     <w:p>
@@ -1618,6 +1774,20 @@
         </w:rPr>
         <w:t>Heritage:</w:t>
       </w:r>
+      <w:r>
+        <w:rPr>
+          <w:lang w:val="en-US"/>
+        </w:rPr>
+        <w:t xml:space="preserve"> no </w:t>
+      </w:r>
+      <w:proofErr w:type="spellStart"/>
+      <w:r>
+        <w:rPr>
+          <w:lang w:val="en-US"/>
+        </w:rPr>
+        <w:t>Miakliir</w:t>
+      </w:r>
+      <w:proofErr w:type="spellEnd"/>
     </w:p>
     <w:p>
       <w:pPr>
@@ -1648,7 +1818,13 @@
         <w:rPr>
           <w:lang w:val="en-US"/>
         </w:rPr>
-        <w:t xml:space="preserve"> practical, leathery, not too heavy</w:t>
+        <w:t xml:space="preserve"> </w:t>
+      </w:r>
+      <w:r>
+        <w:rPr>
+          <w:lang w:val="en-US"/>
+        </w:rPr>
+        <w:t>vest, bear chest or very loose coat, very loose trousers</w:t>
       </w:r>
     </w:p>
     <w:p>
@@ -1680,20 +1856,28 @@
         <w:rPr>
           <w:lang w:val="en-US"/>
         </w:rPr>
-        <w:t xml:space="preserve"> Swordslinger</w:t>
-      </w:r>
-    </w:p>
-    <w:p>
-      <w:pPr>
-        <w:rPr>
-          <w:lang w:val="en-US"/>
-        </w:rPr>
-      </w:pPr>
-      <w:r>
-        <w:rPr>
-          <w:lang w:val="en-US"/>
-        </w:rPr>
-        <w:t>Personality: thoughtful, stern, slow to decide</w:t>
+        <w:t xml:space="preserve"> </w:t>
+      </w:r>
+      <w:proofErr w:type="spellStart"/>
+      <w:r>
+        <w:rPr>
+          <w:lang w:val="en-US"/>
+        </w:rPr>
+        <w:t>Vaostice</w:t>
+      </w:r>
+      <w:proofErr w:type="spellEnd"/>
+    </w:p>
+    <w:p>
+      <w:pPr>
+        <w:rPr>
+          <w:lang w:val="en-US"/>
+        </w:rPr>
+      </w:pPr>
+      <w:r>
+        <w:rPr>
+          <w:lang w:val="en-US"/>
+        </w:rPr>
+        <w:t xml:space="preserve">Personality: </w:t>
       </w:r>
     </w:p>
     <w:p>
@@ -1713,7 +1897,232 @@
         <w:rPr>
           <w:lang w:val="en-US"/>
         </w:rPr>
-        <w:t xml:space="preserve"> leader of the mercenary band Camille was in, throws her out after another job gone wrong</w:t>
+        <w:t xml:space="preserve"> </w:t>
+      </w:r>
+    </w:p>
+    <w:p>
+      <w:pPr>
+        <w:pStyle w:val="berschrift2"/>
+        <w:ind w:left="708" w:hanging="708"/>
+        <w:rPr>
+          <w:lang w:val="en-US"/>
+        </w:rPr>
+      </w:pPr>
+      <w:r>
+        <w:rPr>
+          <w:noProof/>
+        </w:rPr>
+        <mc:AlternateContent>
+          <mc:Choice Requires="wps">
+            <w:drawing>
+              <wp:anchor distT="0" distB="0" distL="114300" distR="114300" simplePos="0" relativeHeight="251710464" behindDoc="0" locked="0" layoutInCell="1" allowOverlap="1" wp14:anchorId="5CD3F3C5" wp14:editId="4A3BAC06">
+                <wp:simplePos x="0" y="0"/>
+                <wp:positionH relativeFrom="column">
+                  <wp:posOffset>0</wp:posOffset>
+                </wp:positionH>
+                <wp:positionV relativeFrom="paragraph">
+                  <wp:posOffset>386715</wp:posOffset>
+                </wp:positionV>
+                <wp:extent cx="2063750" cy="2679700"/>
+                <wp:effectExtent l="0" t="0" r="12700" b="25400"/>
+                <wp:wrapSquare wrapText="bothSides"/>
+                <wp:docPr id="2111264695" name="Rechteck 2"/>
+                <wp:cNvGraphicFramePr/>
+                <a:graphic xmlns:a="http://schemas.openxmlformats.org/drawingml/2006/main">
+                  <a:graphicData uri="http://schemas.microsoft.com/office/word/2010/wordprocessingShape">
+                    <wps:wsp>
+                      <wps:cNvSpPr/>
+                      <wps:spPr>
+                        <a:xfrm>
+                          <a:off x="0" y="0"/>
+                          <a:ext cx="2063750" cy="2679700"/>
+                        </a:xfrm>
+                        <a:prstGeom prst="rect">
+                          <a:avLst/>
+                        </a:prstGeom>
+                      </wps:spPr>
+                      <wps:style>
+                        <a:lnRef idx="2">
+                          <a:schemeClr val="accent1">
+                            <a:shade val="15000"/>
+                          </a:schemeClr>
+                        </a:lnRef>
+                        <a:fillRef idx="1">
+                          <a:schemeClr val="accent1"/>
+                        </a:fillRef>
+                        <a:effectRef idx="0">
+                          <a:schemeClr val="accent1"/>
+                        </a:effectRef>
+                        <a:fontRef idx="minor">
+                          <a:schemeClr val="lt1"/>
+                        </a:fontRef>
+                      </wps:style>
+                      <wps:bodyPr rot="0" spcFirstLastPara="0" vertOverflow="overflow" horzOverflow="overflow" vert="horz" wrap="square" lIns="91440" tIns="45720" rIns="91440" bIns="45720" numCol="1" spcCol="0" rtlCol="0" fromWordArt="0" anchor="ctr" anchorCtr="0" forceAA="0" compatLnSpc="1">
+                        <a:prstTxWarp prst="textNoShape">
+                          <a:avLst/>
+                        </a:prstTxWarp>
+                        <a:noAutofit/>
+                      </wps:bodyPr>
+                    </wps:wsp>
+                  </a:graphicData>
+                </a:graphic>
+                <wp14:sizeRelH relativeFrom="margin">
+                  <wp14:pctWidth>0</wp14:pctWidth>
+                </wp14:sizeRelH>
+                <wp14:sizeRelV relativeFrom="margin">
+                  <wp14:pctHeight>0</wp14:pctHeight>
+                </wp14:sizeRelV>
+              </wp:anchor>
+            </w:drawing>
+          </mc:Choice>
+          <mc:Fallback>
+            <w:pict>
+              <v:rect w14:anchorId="589228E6" id="Rechteck 2" o:spid="_x0000_s1026" style="position:absolute;margin-left:0;margin-top:30.45pt;width:162.5pt;height:211pt;z-index:251710464;visibility:visible;mso-wrap-style:square;mso-width-percent:0;mso-height-percent:0;mso-wrap-distance-left:9pt;mso-wrap-distance-top:0;mso-wrap-distance-right:9pt;mso-wrap-distance-bottom:0;mso-position-horizontal:absolute;mso-position-horizontal-relative:text;mso-position-vertical:absolute;mso-position-vertical-relative:text;mso-width-percent:0;mso-height-percent:0;mso-width-relative:margin;mso-height-relative:margin;v-text-anchor:middle" o:gfxdata="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" fillcolor="#4472c4 [3204]" strokecolor="#09101d [484]" strokeweight="1pt">
+                <w10:wrap type="square"/>
+              </v:rect>
+            </w:pict>
+          </mc:Fallback>
+        </mc:AlternateContent>
+      </w:r>
+      <w:proofErr w:type="spellStart"/>
+      <w:r>
+        <w:rPr>
+          <w:lang w:val="en-US"/>
+        </w:rPr>
+        <w:t>Aikstice</w:t>
+      </w:r>
+      <w:proofErr w:type="spellEnd"/>
+      <w:r>
+        <w:rPr>
+          <w:lang w:val="en-US"/>
+        </w:rPr>
+        <w:t xml:space="preserve"> lady</w:t>
+      </w:r>
+    </w:p>
+    <w:p>
+      <w:pPr>
+        <w:rPr>
+          <w:lang w:val="en-US"/>
+        </w:rPr>
+      </w:pPr>
+      <w:r>
+        <w:rPr>
+          <w:lang w:val="en-US"/>
+        </w:rPr>
+        <w:t>Age/Birthday:</w:t>
+      </w:r>
+    </w:p>
+    <w:p>
+      <w:pPr>
+        <w:rPr>
+          <w:lang w:val="en-US"/>
+        </w:rPr>
+      </w:pPr>
+      <w:proofErr w:type="spellStart"/>
+      <w:r>
+        <w:rPr>
+          <w:lang w:val="en-US"/>
+        </w:rPr>
+        <w:t>Bodyform</w:t>
+      </w:r>
+      <w:proofErr w:type="spellEnd"/>
+      <w:r>
+        <w:rPr>
+          <w:lang w:val="en-US"/>
+        </w:rPr>
+        <w:t>:</w:t>
+      </w:r>
+    </w:p>
+    <w:p>
+      <w:pPr>
+        <w:rPr>
+          <w:lang w:val="en-US"/>
+        </w:rPr>
+      </w:pPr>
+      <w:r>
+        <w:rPr>
+          <w:lang w:val="en-US"/>
+        </w:rPr>
+        <w:t>Heritage:</w:t>
+      </w:r>
+    </w:p>
+    <w:p>
+      <w:pPr>
+        <w:rPr>
+          <w:lang w:val="en-US"/>
+        </w:rPr>
+      </w:pPr>
+      <w:r>
+        <w:rPr>
+          <w:lang w:val="en-US"/>
+        </w:rPr>
+        <w:t>Domicile:</w:t>
+      </w:r>
+    </w:p>
+    <w:p>
+      <w:pPr>
+        <w:rPr>
+          <w:lang w:val="en-US"/>
+        </w:rPr>
+      </w:pPr>
+      <w:r>
+        <w:rPr>
+          <w:lang w:val="en-US"/>
+        </w:rPr>
+        <w:t>Clothing:</w:t>
+      </w:r>
+    </w:p>
+    <w:p>
+      <w:pPr>
+        <w:rPr>
+          <w:lang w:val="en-US"/>
+        </w:rPr>
+      </w:pPr>
+      <w:r>
+        <w:rPr>
+          <w:lang w:val="en-US"/>
+        </w:rPr>
+        <w:t>Affiliation:</w:t>
+      </w:r>
+    </w:p>
+    <w:p>
+      <w:pPr>
+        <w:rPr>
+          <w:lang w:val="en-US"/>
+        </w:rPr>
+      </w:pPr>
+      <w:r>
+        <w:rPr>
+          <w:lang w:val="en-US"/>
+        </w:rPr>
+        <w:t>Abilities:</w:t>
+      </w:r>
+    </w:p>
+    <w:p>
+      <w:pPr>
+        <w:rPr>
+          <w:lang w:val="en-US"/>
+        </w:rPr>
+      </w:pPr>
+      <w:r>
+        <w:rPr>
+          <w:lang w:val="en-US"/>
+        </w:rPr>
+        <w:t>Personality:</w:t>
+      </w:r>
+    </w:p>
+    <w:p>
+      <w:pPr>
+        <w:rPr>
+          <w:lang w:val="en-US"/>
+        </w:rPr>
+      </w:pPr>
+      <w:r>
+        <w:rPr>
+          <w:lang w:val="en-US"/>
+        </w:rPr>
+        <w:br/>
+        <w:t>Synopsis:</w:t>
       </w:r>
     </w:p>
     <w:p>
@@ -1748,6 +2157,7 @@
         <w:rPr>
           <w:lang w:val="en-US"/>
         </w:rPr>
+        <w:lastRenderedPageBreak/>
         <w:t>Bureaucrats</w:t>
       </w:r>
     </w:p>
@@ -1842,6 +2252,7 @@
         <w:t xml:space="preserve"> </w:t>
       </w:r>
       <w:bookmarkStart w:id="0" w:name="_Hlk226105738"/>
+      <w:proofErr w:type="spellStart"/>
       <w:r>
         <w:rPr>
           <w:lang w:val="en-US"/>
@@ -1849,6 +2260,7 @@
         <w:t>Bureaucratess</w:t>
       </w:r>
       <w:bookmarkEnd w:id="0"/>
+      <w:proofErr w:type="spellEnd"/>
       <w:r>
         <w:rPr>
           <w:lang w:val="en-US"/>
@@ -1881,11 +2293,19 @@
           <w:lang w:val="en-US"/>
         </w:rPr>
       </w:pPr>
-      <w:r>
-        <w:rPr>
-          <w:lang w:val="en-US"/>
-        </w:rPr>
-        <w:t>Bodyform:</w:t>
+      <w:proofErr w:type="spellStart"/>
+      <w:r>
+        <w:rPr>
+          <w:lang w:val="en-US"/>
+        </w:rPr>
+        <w:t>Bodyform</w:t>
+      </w:r>
+      <w:proofErr w:type="spellEnd"/>
+      <w:r>
+        <w:rPr>
+          <w:lang w:val="en-US"/>
+        </w:rPr>
+        <w:t>:</w:t>
       </w:r>
       <w:r>
         <w:rPr>
@@ -1963,6 +2383,7 @@
         </w:rPr>
         <w:t xml:space="preserve"> </w:t>
       </w:r>
+      <w:proofErr w:type="spellStart"/>
       <w:r>
         <w:rPr>
           <w:lang w:val="en-US"/>
@@ -1975,6 +2396,7 @@
         </w:rPr>
         <w:t>dom</w:t>
       </w:r>
+      <w:proofErr w:type="spellEnd"/>
     </w:p>
     <w:p>
       <w:pPr>
@@ -2040,7 +2462,6 @@
         <w:rPr>
           <w:noProof/>
         </w:rPr>
-        <w:lastRenderedPageBreak/>
         <mc:AlternateContent>
           <mc:Choice Requires="wps">
             <w:drawing>
@@ -2157,11 +2578,19 @@
           <w:lang w:val="en-US"/>
         </w:rPr>
       </w:pPr>
-      <w:r>
-        <w:rPr>
-          <w:lang w:val="en-US"/>
-        </w:rPr>
-        <w:t>Bodyform:</w:t>
+      <w:proofErr w:type="spellStart"/>
+      <w:r>
+        <w:rPr>
+          <w:lang w:val="en-US"/>
+        </w:rPr>
+        <w:t>Bodyform</w:t>
+      </w:r>
+      <w:proofErr w:type="spellEnd"/>
+      <w:r>
+        <w:rPr>
+          <w:lang w:val="en-US"/>
+        </w:rPr>
+        <w:t>:</w:t>
       </w:r>
       <w:r>
         <w:rPr>
@@ -2298,6 +2727,7 @@
         <w:rPr>
           <w:lang w:val="en-US"/>
         </w:rPr>
+        <w:lastRenderedPageBreak/>
         <w:t>Citizens of Asarat’s Peak</w:t>
       </w:r>
     </w:p>
@@ -2385,12 +2815,42 @@
           </mc:Fallback>
         </mc:AlternateContent>
       </w:r>
+      <w:proofErr w:type="spellStart"/>
       <w:r>
         <w:rPr>
           <w:lang w:val="en-US"/>
         </w:rPr>
         <w:t>Ubir</w:t>
       </w:r>
+      <w:proofErr w:type="spellEnd"/>
+      <w:r>
+        <w:rPr>
+          <w:lang w:val="en-US"/>
+        </w:rPr>
+        <w:t xml:space="preserve">, owner of </w:t>
+      </w:r>
+      <w:proofErr w:type="spellStart"/>
+      <w:r>
+        <w:rPr>
+          <w:lang w:val="en-US"/>
+        </w:rPr>
+        <w:t>Ubir</w:t>
+      </w:r>
+      <w:proofErr w:type="spellEnd"/>
+      <w:r>
+        <w:rPr>
+          <w:lang w:val="en-US"/>
+        </w:rPr>
+        <w:t xml:space="preserve"> </w:t>
+      </w:r>
+      <w:proofErr w:type="spellStart"/>
+      <w:r>
+        <w:rPr>
+          <w:lang w:val="en-US"/>
+        </w:rPr>
+        <w:t>Ubar</w:t>
+      </w:r>
+      <w:proofErr w:type="spellEnd"/>
     </w:p>
     <w:p>
       <w:pPr>
@@ -2417,17 +2877,39 @@
           <w:lang w:val="en-US"/>
         </w:rPr>
       </w:pPr>
-      <w:r>
-        <w:rPr>
-          <w:lang w:val="en-US"/>
-        </w:rPr>
-        <w:t>Bodyform:</w:t>
-      </w:r>
-      <w:r>
-        <w:rPr>
-          <w:lang w:val="en-US"/>
-        </w:rPr>
-        <w:t xml:space="preserve"> long black hear, grey beard, tall, thin</w:t>
+      <w:proofErr w:type="spellStart"/>
+      <w:r>
+        <w:rPr>
+          <w:lang w:val="en-US"/>
+        </w:rPr>
+        <w:t>Bodyform</w:t>
+      </w:r>
+      <w:proofErr w:type="spellEnd"/>
+      <w:r>
+        <w:rPr>
+          <w:lang w:val="en-US"/>
+        </w:rPr>
+        <w:t>:</w:t>
+      </w:r>
+      <w:r>
+        <w:rPr>
+          <w:lang w:val="en-US"/>
+        </w:rPr>
+        <w:t xml:space="preserve"> long black </w:t>
+      </w:r>
+      <w:proofErr w:type="gramStart"/>
+      <w:r>
+        <w:rPr>
+          <w:lang w:val="en-US"/>
+        </w:rPr>
+        <w:t>hear</w:t>
+      </w:r>
+      <w:proofErr w:type="gramEnd"/>
+      <w:r>
+        <w:rPr>
+          <w:lang w:val="en-US"/>
+        </w:rPr>
+        <w:t>, grey beard, tall, thin</w:t>
       </w:r>
     </w:p>
     <w:p>
@@ -2446,8 +2928,16 @@
         <w:rPr>
           <w:lang w:val="en-US"/>
         </w:rPr>
-        <w:t xml:space="preserve"> Mialkiir</w:t>
-      </w:r>
+        <w:t xml:space="preserve"> </w:t>
+      </w:r>
+      <w:proofErr w:type="spellStart"/>
+      <w:r>
+        <w:rPr>
+          <w:lang w:val="en-US"/>
+        </w:rPr>
+        <w:t>Mialkiir</w:t>
+      </w:r>
+      <w:proofErr w:type="spellEnd"/>
     </w:p>
     <w:p>
       <w:pPr>
@@ -2523,7 +3013,21 @@
         <w:rPr>
           <w:lang w:val="en-US"/>
         </w:rPr>
-        <w:t>Personality: first friendly, then flippish and angry, then humble</w:t>
+        <w:t xml:space="preserve">Personality: first friendly, then </w:t>
+      </w:r>
+      <w:proofErr w:type="spellStart"/>
+      <w:r>
+        <w:rPr>
+          <w:lang w:val="en-US"/>
+        </w:rPr>
+        <w:t>flippish</w:t>
+      </w:r>
+      <w:proofErr w:type="spellEnd"/>
+      <w:r>
+        <w:rPr>
+          <w:lang w:val="en-US"/>
+        </w:rPr>
+        <w:t xml:space="preserve"> and angry, then humble</w:t>
       </w:r>
     </w:p>
     <w:p>
@@ -2552,7 +3056,6 @@
         <w:rPr>
           <w:noProof/>
         </w:rPr>
-        <w:lastRenderedPageBreak/>
         <mc:AlternateContent>
           <mc:Choice Requires="wps">
             <w:drawing>
@@ -2631,6 +3134,12 @@
         </w:rPr>
         <w:t>Merial</w:t>
       </w:r>
+      <w:r>
+        <w:rPr>
+          <w:lang w:val="en-US"/>
+        </w:rPr>
+        <w:t>, Sha officer</w:t>
+      </w:r>
     </w:p>
     <w:p>
       <w:pPr>
@@ -2657,11 +3166,19 @@
           <w:lang w:val="en-US"/>
         </w:rPr>
       </w:pPr>
-      <w:r>
-        <w:rPr>
-          <w:lang w:val="en-US"/>
-        </w:rPr>
-        <w:t>Bodyform:</w:t>
+      <w:proofErr w:type="spellStart"/>
+      <w:r>
+        <w:rPr>
+          <w:lang w:val="en-US"/>
+        </w:rPr>
+        <w:t>Bodyform</w:t>
+      </w:r>
+      <w:proofErr w:type="spellEnd"/>
+      <w:r>
+        <w:rPr>
+          <w:lang w:val="en-US"/>
+        </w:rPr>
+        <w:t>:</w:t>
       </w:r>
       <w:r>
         <w:rPr>
@@ -2745,12 +3262,14 @@
         </w:rPr>
         <w:t xml:space="preserve"> </w:t>
       </w:r>
+      <w:proofErr w:type="spellStart"/>
       <w:r>
         <w:rPr>
           <w:lang w:val="en-US"/>
         </w:rPr>
         <w:t>Bureaurocradom</w:t>
       </w:r>
+      <w:proofErr w:type="spellEnd"/>
     </w:p>
     <w:p>
       <w:pPr>
@@ -2768,8 +3287,16 @@
         <w:rPr>
           <w:lang w:val="en-US"/>
         </w:rPr>
-        <w:t xml:space="preserve"> Aikstice</w:t>
-      </w:r>
+        <w:t xml:space="preserve"> </w:t>
+      </w:r>
+      <w:proofErr w:type="spellStart"/>
+      <w:r>
+        <w:rPr>
+          <w:lang w:val="en-US"/>
+        </w:rPr>
+        <w:t>Aikstice</w:t>
+      </w:r>
+      <w:proofErr w:type="spellEnd"/>
     </w:p>
     <w:p>
       <w:pPr>
@@ -2802,6 +3329,765 @@
           <w:lang w:val="en-US"/>
         </w:rPr>
         <w:t xml:space="preserve"> Special Harmonist Guard (Sha) of Asarat’s Peak, captured the thief</w:t>
+      </w:r>
+    </w:p>
+    <w:p>
+      <w:pPr>
+        <w:pStyle w:val="berschrift2"/>
+        <w:ind w:left="708" w:hanging="708"/>
+        <w:rPr>
+          <w:lang w:val="en-US"/>
+        </w:rPr>
+      </w:pPr>
+      <w:r>
+        <w:rPr>
+          <w:noProof/>
+        </w:rPr>
+        <w:lastRenderedPageBreak/>
+        <mc:AlternateContent>
+          <mc:Choice Requires="wps">
+            <w:drawing>
+              <wp:anchor distT="0" distB="0" distL="114300" distR="114300" simplePos="0" relativeHeight="251704320" behindDoc="0" locked="0" layoutInCell="1" allowOverlap="1" wp14:anchorId="31203CE0" wp14:editId="3CCC28AE">
+                <wp:simplePos x="0" y="0"/>
+                <wp:positionH relativeFrom="column">
+                  <wp:posOffset>0</wp:posOffset>
+                </wp:positionH>
+                <wp:positionV relativeFrom="paragraph">
+                  <wp:posOffset>386715</wp:posOffset>
+                </wp:positionV>
+                <wp:extent cx="2063750" cy="2679700"/>
+                <wp:effectExtent l="0" t="0" r="12700" b="25400"/>
+                <wp:wrapSquare wrapText="bothSides"/>
+                <wp:docPr id="844803240" name="Rechteck 2"/>
+                <wp:cNvGraphicFramePr/>
+                <a:graphic xmlns:a="http://schemas.openxmlformats.org/drawingml/2006/main">
+                  <a:graphicData uri="http://schemas.microsoft.com/office/word/2010/wordprocessingShape">
+                    <wps:wsp>
+                      <wps:cNvSpPr/>
+                      <wps:spPr>
+                        <a:xfrm>
+                          <a:off x="0" y="0"/>
+                          <a:ext cx="2063750" cy="2679700"/>
+                        </a:xfrm>
+                        <a:prstGeom prst="rect">
+                          <a:avLst/>
+                        </a:prstGeom>
+                      </wps:spPr>
+                      <wps:style>
+                        <a:lnRef idx="2">
+                          <a:schemeClr val="accent1">
+                            <a:shade val="15000"/>
+                          </a:schemeClr>
+                        </a:lnRef>
+                        <a:fillRef idx="1">
+                          <a:schemeClr val="accent1"/>
+                        </a:fillRef>
+                        <a:effectRef idx="0">
+                          <a:schemeClr val="accent1"/>
+                        </a:effectRef>
+                        <a:fontRef idx="minor">
+                          <a:schemeClr val="lt1"/>
+                        </a:fontRef>
+                      </wps:style>
+                      <wps:bodyPr rot="0" spcFirstLastPara="0" vertOverflow="overflow" horzOverflow="overflow" vert="horz" wrap="square" lIns="91440" tIns="45720" rIns="91440" bIns="45720" numCol="1" spcCol="0" rtlCol="0" fromWordArt="0" anchor="ctr" anchorCtr="0" forceAA="0" compatLnSpc="1">
+                        <a:prstTxWarp prst="textNoShape">
+                          <a:avLst/>
+                        </a:prstTxWarp>
+                        <a:noAutofit/>
+                      </wps:bodyPr>
+                    </wps:wsp>
+                  </a:graphicData>
+                </a:graphic>
+                <wp14:sizeRelH relativeFrom="margin">
+                  <wp14:pctWidth>0</wp14:pctWidth>
+                </wp14:sizeRelH>
+                <wp14:sizeRelV relativeFrom="margin">
+                  <wp14:pctHeight>0</wp14:pctHeight>
+                </wp14:sizeRelV>
+              </wp:anchor>
+            </w:drawing>
+          </mc:Choice>
+          <mc:Fallback>
+            <w:pict>
+              <v:rect w14:anchorId="7CEE3880" id="Rechteck 2" o:spid="_x0000_s1026" style="position:absolute;margin-left:0;margin-top:30.45pt;width:162.5pt;height:211pt;z-index:251704320;visibility:visible;mso-wrap-style:square;mso-width-percent:0;mso-height-percent:0;mso-wrap-distance-left:9pt;mso-wrap-distance-top:0;mso-wrap-distance-right:9pt;mso-wrap-distance-bottom:0;mso-position-horizontal:absolute;mso-position-horizontal-relative:text;mso-position-vertical:absolute;mso-position-vertical-relative:text;mso-width-percent:0;mso-height-percent:0;mso-width-relative:margin;mso-height-relative:margin;v-text-anchor:middle" o:gfxdata="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" fillcolor="#4472c4 [3204]" strokecolor="#09101d [484]" strokeweight="1pt">
+                <w10:wrap type="square"/>
+              </v:rect>
+            </w:pict>
+          </mc:Fallback>
+        </mc:AlternateContent>
+      </w:r>
+      <w:r>
+        <w:rPr>
+          <w:lang w:val="en-US"/>
+        </w:rPr>
+        <w:t xml:space="preserve">Trella, </w:t>
+      </w:r>
+      <w:r>
+        <w:rPr>
+          <w:lang w:val="en-US"/>
+        </w:rPr>
+        <w:t>Arena organizer</w:t>
+      </w:r>
+    </w:p>
+    <w:p>
+      <w:pPr>
+        <w:rPr>
+          <w:lang w:val="en-US"/>
+        </w:rPr>
+      </w:pPr>
+      <w:r>
+        <w:rPr>
+          <w:lang w:val="en-US"/>
+        </w:rPr>
+        <w:t>Age/Birthday:</w:t>
+      </w:r>
+    </w:p>
+    <w:p>
+      <w:pPr>
+        <w:rPr>
+          <w:lang w:val="en-US"/>
+        </w:rPr>
+      </w:pPr>
+      <w:proofErr w:type="spellStart"/>
+      <w:r>
+        <w:rPr>
+          <w:lang w:val="en-US"/>
+        </w:rPr>
+        <w:t>Bodyform</w:t>
+      </w:r>
+      <w:proofErr w:type="spellEnd"/>
+      <w:r>
+        <w:rPr>
+          <w:lang w:val="en-US"/>
+        </w:rPr>
+        <w:t>:</w:t>
+      </w:r>
+    </w:p>
+    <w:p>
+      <w:pPr>
+        <w:rPr>
+          <w:lang w:val="en-US"/>
+        </w:rPr>
+      </w:pPr>
+      <w:r>
+        <w:rPr>
+          <w:lang w:val="en-US"/>
+        </w:rPr>
+        <w:t>Heritage:</w:t>
+      </w:r>
+    </w:p>
+    <w:p>
+      <w:pPr>
+        <w:rPr>
+          <w:lang w:val="en-US"/>
+        </w:rPr>
+      </w:pPr>
+      <w:r>
+        <w:rPr>
+          <w:lang w:val="en-US"/>
+        </w:rPr>
+        <w:t>Domicile:</w:t>
+      </w:r>
+    </w:p>
+    <w:p>
+      <w:pPr>
+        <w:rPr>
+          <w:lang w:val="en-US"/>
+        </w:rPr>
+      </w:pPr>
+      <w:r>
+        <w:rPr>
+          <w:lang w:val="en-US"/>
+        </w:rPr>
+        <w:t>Clothing:</w:t>
+      </w:r>
+    </w:p>
+    <w:p>
+      <w:pPr>
+        <w:rPr>
+          <w:lang w:val="en-US"/>
+        </w:rPr>
+      </w:pPr>
+      <w:r>
+        <w:rPr>
+          <w:lang w:val="en-US"/>
+        </w:rPr>
+        <w:t>Affiliation:</w:t>
+      </w:r>
+    </w:p>
+    <w:p>
+      <w:pPr>
+        <w:rPr>
+          <w:lang w:val="en-US"/>
+        </w:rPr>
+      </w:pPr>
+      <w:r>
+        <w:rPr>
+          <w:lang w:val="en-US"/>
+        </w:rPr>
+        <w:t>Abilities:</w:t>
+      </w:r>
+    </w:p>
+    <w:p>
+      <w:pPr>
+        <w:rPr>
+          <w:lang w:val="en-US"/>
+        </w:rPr>
+      </w:pPr>
+      <w:r>
+        <w:rPr>
+          <w:lang w:val="en-US"/>
+        </w:rPr>
+        <w:t>Personality:</w:t>
+      </w:r>
+    </w:p>
+    <w:p>
+      <w:pPr>
+        <w:rPr>
+          <w:lang w:val="en-US"/>
+        </w:rPr>
+      </w:pPr>
+      <w:r>
+        <w:rPr>
+          <w:lang w:val="en-US"/>
+        </w:rPr>
+        <w:br/>
+        <w:t>Synopsis:</w:t>
+      </w:r>
+    </w:p>
+    <w:p>
+      <w:pPr>
+        <w:rPr>
+          <w:lang w:val="en-US"/>
+        </w:rPr>
+      </w:pPr>
+    </w:p>
+    <w:p>
+      <w:pPr>
+        <w:pStyle w:val="berschrift2"/>
+        <w:ind w:left="708" w:hanging="708"/>
+        <w:rPr>
+          <w:lang w:val="en-US"/>
+        </w:rPr>
+      </w:pPr>
+      <w:r>
+        <w:rPr>
+          <w:noProof/>
+        </w:rPr>
+        <mc:AlternateContent>
+          <mc:Choice Requires="wps">
+            <w:drawing>
+              <wp:anchor distT="0" distB="0" distL="114300" distR="114300" simplePos="0" relativeHeight="251706368" behindDoc="0" locked="0" layoutInCell="1" allowOverlap="1" wp14:anchorId="37440048" wp14:editId="46CB8FEA">
+                <wp:simplePos x="0" y="0"/>
+                <wp:positionH relativeFrom="column">
+                  <wp:posOffset>0</wp:posOffset>
+                </wp:positionH>
+                <wp:positionV relativeFrom="paragraph">
+                  <wp:posOffset>386715</wp:posOffset>
+                </wp:positionV>
+                <wp:extent cx="2063750" cy="2679700"/>
+                <wp:effectExtent l="0" t="0" r="12700" b="25400"/>
+                <wp:wrapSquare wrapText="bothSides"/>
+                <wp:docPr id="1113294630" name="Rechteck 2"/>
+                <wp:cNvGraphicFramePr/>
+                <a:graphic xmlns:a="http://schemas.openxmlformats.org/drawingml/2006/main">
+                  <a:graphicData uri="http://schemas.microsoft.com/office/word/2010/wordprocessingShape">
+                    <wps:wsp>
+                      <wps:cNvSpPr/>
+                      <wps:spPr>
+                        <a:xfrm>
+                          <a:off x="0" y="0"/>
+                          <a:ext cx="2063750" cy="2679700"/>
+                        </a:xfrm>
+                        <a:prstGeom prst="rect">
+                          <a:avLst/>
+                        </a:prstGeom>
+                      </wps:spPr>
+                      <wps:style>
+                        <a:lnRef idx="2">
+                          <a:schemeClr val="accent1">
+                            <a:shade val="15000"/>
+                          </a:schemeClr>
+                        </a:lnRef>
+                        <a:fillRef idx="1">
+                          <a:schemeClr val="accent1"/>
+                        </a:fillRef>
+                        <a:effectRef idx="0">
+                          <a:schemeClr val="accent1"/>
+                        </a:effectRef>
+                        <a:fontRef idx="minor">
+                          <a:schemeClr val="lt1"/>
+                        </a:fontRef>
+                      </wps:style>
+                      <wps:bodyPr rot="0" spcFirstLastPara="0" vertOverflow="overflow" horzOverflow="overflow" vert="horz" wrap="square" lIns="91440" tIns="45720" rIns="91440" bIns="45720" numCol="1" spcCol="0" rtlCol="0" fromWordArt="0" anchor="ctr" anchorCtr="0" forceAA="0" compatLnSpc="1">
+                        <a:prstTxWarp prst="textNoShape">
+                          <a:avLst/>
+                        </a:prstTxWarp>
+                        <a:noAutofit/>
+                      </wps:bodyPr>
+                    </wps:wsp>
+                  </a:graphicData>
+                </a:graphic>
+                <wp14:sizeRelH relativeFrom="margin">
+                  <wp14:pctWidth>0</wp14:pctWidth>
+                </wp14:sizeRelH>
+                <wp14:sizeRelV relativeFrom="margin">
+                  <wp14:pctHeight>0</wp14:pctHeight>
+                </wp14:sizeRelV>
+              </wp:anchor>
+            </w:drawing>
+          </mc:Choice>
+          <mc:Fallback>
+            <w:pict>
+              <v:rect w14:anchorId="6F50556F" id="Rechteck 2" o:spid="_x0000_s1026" style="position:absolute;margin-left:0;margin-top:30.45pt;width:162.5pt;height:211pt;z-index:251706368;visibility:visible;mso-wrap-style:square;mso-width-percent:0;mso-height-percent:0;mso-wrap-distance-left:9pt;mso-wrap-distance-top:0;mso-wrap-distance-right:9pt;mso-wrap-distance-bottom:0;mso-position-horizontal:absolute;mso-position-horizontal-relative:text;mso-position-vertical:absolute;mso-position-vertical-relative:text;mso-width-percent:0;mso-height-percent:0;mso-width-relative:margin;mso-height-relative:margin;v-text-anchor:middle" o:gfxdata="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" fillcolor="#4472c4 [3204]" strokecolor="#09101d [484]" strokeweight="1pt">
+                <w10:wrap type="square"/>
+              </v:rect>
+            </w:pict>
+          </mc:Fallback>
+        </mc:AlternateContent>
+      </w:r>
+      <w:proofErr w:type="spellStart"/>
+      <w:r>
+        <w:rPr>
+          <w:lang w:val="en-US"/>
+        </w:rPr>
+        <w:t>Jeraiil</w:t>
+      </w:r>
+      <w:proofErr w:type="spellEnd"/>
+      <w:r>
+        <w:rPr>
+          <w:lang w:val="en-US"/>
+        </w:rPr>
+        <w:t xml:space="preserve">, </w:t>
+      </w:r>
+      <w:r>
+        <w:rPr>
+          <w:lang w:val="en-US"/>
+        </w:rPr>
+        <w:t>Camille’s first opponent</w:t>
+      </w:r>
+    </w:p>
+    <w:p>
+      <w:pPr>
+        <w:rPr>
+          <w:lang w:val="en-US"/>
+        </w:rPr>
+      </w:pPr>
+      <w:r>
+        <w:rPr>
+          <w:lang w:val="en-US"/>
+        </w:rPr>
+        <w:t>Age/Birthday:</w:t>
+      </w:r>
+    </w:p>
+    <w:p>
+      <w:pPr>
+        <w:rPr>
+          <w:lang w:val="en-US"/>
+        </w:rPr>
+      </w:pPr>
+      <w:proofErr w:type="spellStart"/>
+      <w:r>
+        <w:rPr>
+          <w:lang w:val="en-US"/>
+        </w:rPr>
+        <w:t>Bodyform</w:t>
+      </w:r>
+      <w:proofErr w:type="spellEnd"/>
+      <w:r>
+        <w:rPr>
+          <w:lang w:val="en-US"/>
+        </w:rPr>
+        <w:t>:</w:t>
+      </w:r>
+    </w:p>
+    <w:p>
+      <w:pPr>
+        <w:rPr>
+          <w:lang w:val="en-US"/>
+        </w:rPr>
+      </w:pPr>
+      <w:r>
+        <w:rPr>
+          <w:lang w:val="en-US"/>
+        </w:rPr>
+        <w:t>Heritage:</w:t>
+      </w:r>
+    </w:p>
+    <w:p>
+      <w:pPr>
+        <w:rPr>
+          <w:lang w:val="en-US"/>
+        </w:rPr>
+      </w:pPr>
+      <w:r>
+        <w:rPr>
+          <w:lang w:val="en-US"/>
+        </w:rPr>
+        <w:t>Domicile:</w:t>
+      </w:r>
+    </w:p>
+    <w:p>
+      <w:pPr>
+        <w:rPr>
+          <w:lang w:val="en-US"/>
+        </w:rPr>
+      </w:pPr>
+      <w:r>
+        <w:rPr>
+          <w:lang w:val="en-US"/>
+        </w:rPr>
+        <w:t>Clothing:</w:t>
+      </w:r>
+    </w:p>
+    <w:p>
+      <w:pPr>
+        <w:rPr>
+          <w:lang w:val="en-US"/>
+        </w:rPr>
+      </w:pPr>
+      <w:r>
+        <w:rPr>
+          <w:lang w:val="en-US"/>
+        </w:rPr>
+        <w:t>Affiliation:</w:t>
+      </w:r>
+    </w:p>
+    <w:p>
+      <w:pPr>
+        <w:rPr>
+          <w:lang w:val="en-US"/>
+        </w:rPr>
+      </w:pPr>
+      <w:r>
+        <w:rPr>
+          <w:lang w:val="en-US"/>
+        </w:rPr>
+        <w:t>Abilities:</w:t>
+      </w:r>
+      <w:r>
+        <w:rPr>
+          <w:lang w:val="en-US"/>
+        </w:rPr>
+        <w:t xml:space="preserve"> </w:t>
+      </w:r>
+      <w:proofErr w:type="spellStart"/>
+      <w:r>
+        <w:rPr>
+          <w:lang w:val="en-US"/>
+        </w:rPr>
+        <w:t>Ruistice</w:t>
+      </w:r>
+      <w:proofErr w:type="spellEnd"/>
+    </w:p>
+    <w:p>
+      <w:pPr>
+        <w:rPr>
+          <w:lang w:val="en-US"/>
+        </w:rPr>
+      </w:pPr>
+      <w:r>
+        <w:rPr>
+          <w:lang w:val="en-US"/>
+        </w:rPr>
+        <w:t>Personality:</w:t>
+      </w:r>
+    </w:p>
+    <w:p>
+      <w:pPr>
+        <w:rPr>
+          <w:lang w:val="en-US"/>
+        </w:rPr>
+      </w:pPr>
+      <w:r>
+        <w:rPr>
+          <w:lang w:val="en-US"/>
+        </w:rPr>
+        <w:br/>
+        <w:t>Synopsis:</w:t>
+      </w:r>
+    </w:p>
+    <w:p>
+      <w:pPr>
+        <w:rPr>
+          <w:lang w:val="en-US"/>
+        </w:rPr>
+      </w:pPr>
+    </w:p>
+    <w:p>
+      <w:pPr>
+        <w:pStyle w:val="berschrift2"/>
+        <w:ind w:left="708" w:hanging="708"/>
+        <w:rPr>
+          <w:lang w:val="en-US"/>
+        </w:rPr>
+      </w:pPr>
+      <w:r>
+        <w:rPr>
+          <w:noProof/>
+        </w:rPr>
+        <w:lastRenderedPageBreak/>
+        <mc:AlternateContent>
+          <mc:Choice Requires="wps">
+            <w:drawing>
+              <wp:anchor distT="0" distB="0" distL="114300" distR="114300" simplePos="0" relativeHeight="251708416" behindDoc="0" locked="0" layoutInCell="1" allowOverlap="1" wp14:anchorId="612DB2B4" wp14:editId="312D9DE6">
+                <wp:simplePos x="0" y="0"/>
+                <wp:positionH relativeFrom="column">
+                  <wp:posOffset>0</wp:posOffset>
+                </wp:positionH>
+                <wp:positionV relativeFrom="paragraph">
+                  <wp:posOffset>386715</wp:posOffset>
+                </wp:positionV>
+                <wp:extent cx="2063750" cy="2679700"/>
+                <wp:effectExtent l="0" t="0" r="12700" b="25400"/>
+                <wp:wrapSquare wrapText="bothSides"/>
+                <wp:docPr id="1334468840" name="Rechteck 2"/>
+                <wp:cNvGraphicFramePr/>
+                <a:graphic xmlns:a="http://schemas.openxmlformats.org/drawingml/2006/main">
+                  <a:graphicData uri="http://schemas.microsoft.com/office/word/2010/wordprocessingShape">
+                    <wps:wsp>
+                      <wps:cNvSpPr/>
+                      <wps:spPr>
+                        <a:xfrm>
+                          <a:off x="0" y="0"/>
+                          <a:ext cx="2063750" cy="2679700"/>
+                        </a:xfrm>
+                        <a:prstGeom prst="rect">
+                          <a:avLst/>
+                        </a:prstGeom>
+                      </wps:spPr>
+                      <wps:style>
+                        <a:lnRef idx="2">
+                          <a:schemeClr val="accent1">
+                            <a:shade val="15000"/>
+                          </a:schemeClr>
+                        </a:lnRef>
+                        <a:fillRef idx="1">
+                          <a:schemeClr val="accent1"/>
+                        </a:fillRef>
+                        <a:effectRef idx="0">
+                          <a:schemeClr val="accent1"/>
+                        </a:effectRef>
+                        <a:fontRef idx="minor">
+                          <a:schemeClr val="lt1"/>
+                        </a:fontRef>
+                      </wps:style>
+                      <wps:bodyPr rot="0" spcFirstLastPara="0" vertOverflow="overflow" horzOverflow="overflow" vert="horz" wrap="square" lIns="91440" tIns="45720" rIns="91440" bIns="45720" numCol="1" spcCol="0" rtlCol="0" fromWordArt="0" anchor="ctr" anchorCtr="0" forceAA="0" compatLnSpc="1">
+                        <a:prstTxWarp prst="textNoShape">
+                          <a:avLst/>
+                        </a:prstTxWarp>
+                        <a:noAutofit/>
+                      </wps:bodyPr>
+                    </wps:wsp>
+                  </a:graphicData>
+                </a:graphic>
+                <wp14:sizeRelH relativeFrom="margin">
+                  <wp14:pctWidth>0</wp14:pctWidth>
+                </wp14:sizeRelH>
+                <wp14:sizeRelV relativeFrom="margin">
+                  <wp14:pctHeight>0</wp14:pctHeight>
+                </wp14:sizeRelV>
+              </wp:anchor>
+            </w:drawing>
+          </mc:Choice>
+          <mc:Fallback>
+            <w:pict>
+              <v:rect w14:anchorId="7D6FE7DD" id="Rechteck 2" o:spid="_x0000_s1026" style="position:absolute;margin-left:0;margin-top:30.45pt;width:162.5pt;height:211pt;z-index:251708416;visibility:visible;mso-wrap-style:square;mso-width-percent:0;mso-height-percent:0;mso-wrap-distance-left:9pt;mso-wrap-distance-top:0;mso-wrap-distance-right:9pt;mso-wrap-distance-bottom:0;mso-position-horizontal:absolute;mso-position-horizontal-relative:text;mso-position-vertical:absolute;mso-position-vertical-relative:text;mso-width-percent:0;mso-height-percent:0;mso-width-relative:margin;mso-height-relative:margin;v-text-anchor:middle" o:gfxdata="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" fillcolor="#4472c4 [3204]" strokecolor="#09101d [484]" strokeweight="1pt">
+                <w10:wrap type="square"/>
+              </v:rect>
+            </w:pict>
+          </mc:Fallback>
+        </mc:AlternateContent>
+      </w:r>
+      <w:proofErr w:type="spellStart"/>
+      <w:r>
+        <w:rPr>
+          <w:lang w:val="en-US"/>
+        </w:rPr>
+        <w:t>Natrai</w:t>
+      </w:r>
+      <w:r>
+        <w:rPr>
+          <w:lang w:val="en-US"/>
+        </w:rPr>
+        <w:t>r</w:t>
+      </w:r>
+      <w:proofErr w:type="spellEnd"/>
+      <w:r>
+        <w:rPr>
+          <w:lang w:val="en-US"/>
+        </w:rPr>
+        <w:t>, famous pit fighter</w:t>
+      </w:r>
+    </w:p>
+    <w:p>
+      <w:pPr>
+        <w:rPr>
+          <w:lang w:val="en-US"/>
+        </w:rPr>
+      </w:pPr>
+      <w:r>
+        <w:rPr>
+          <w:lang w:val="en-US"/>
+        </w:rPr>
+        <w:t>Age/Birthday:</w:t>
+      </w:r>
+      <w:r>
+        <w:rPr>
+          <w:lang w:val="en-US"/>
+        </w:rPr>
+        <w:t xml:space="preserve"> 35</w:t>
+      </w:r>
+    </w:p>
+    <w:p>
+      <w:pPr>
+        <w:rPr>
+          <w:lang w:val="en-US"/>
+        </w:rPr>
+      </w:pPr>
+      <w:proofErr w:type="spellStart"/>
+      <w:r>
+        <w:rPr>
+          <w:lang w:val="en-US"/>
+        </w:rPr>
+        <w:t>Bodyform</w:t>
+      </w:r>
+      <w:proofErr w:type="spellEnd"/>
+      <w:r>
+        <w:rPr>
+          <w:lang w:val="en-US"/>
+        </w:rPr>
+        <w:t>:</w:t>
+      </w:r>
+      <w:r>
+        <w:rPr>
+          <w:lang w:val="en-US"/>
+        </w:rPr>
+        <w:t xml:space="preserve"> fit, muscular, tall and broad</w:t>
+      </w:r>
+    </w:p>
+    <w:p>
+      <w:pPr>
+        <w:rPr>
+          <w:lang w:val="en-US"/>
+        </w:rPr>
+      </w:pPr>
+      <w:r>
+        <w:rPr>
+          <w:lang w:val="en-US"/>
+        </w:rPr>
+        <w:t>Heritage:</w:t>
+      </w:r>
+      <w:r>
+        <w:rPr>
+          <w:lang w:val="en-US"/>
+        </w:rPr>
+        <w:t xml:space="preserve"> Asarat’s Peak</w:t>
+      </w:r>
+    </w:p>
+    <w:p>
+      <w:pPr>
+        <w:rPr>
+          <w:lang w:val="en-US"/>
+        </w:rPr>
+      </w:pPr>
+      <w:r>
+        <w:rPr>
+          <w:lang w:val="en-US"/>
+        </w:rPr>
+        <w:t>Domicile:</w:t>
+      </w:r>
+      <w:r>
+        <w:rPr>
+          <w:lang w:val="en-US"/>
+        </w:rPr>
+        <w:t xml:space="preserve"> Asarat’s Peak</w:t>
+      </w:r>
+    </w:p>
+    <w:p>
+      <w:pPr>
+        <w:rPr>
+          <w:lang w:val="en-US"/>
+        </w:rPr>
+      </w:pPr>
+      <w:r>
+        <w:rPr>
+          <w:lang w:val="en-US"/>
+        </w:rPr>
+        <w:t>Clothing:</w:t>
+      </w:r>
+    </w:p>
+    <w:p>
+      <w:pPr>
+        <w:rPr>
+          <w:lang w:val="en-US"/>
+        </w:rPr>
+      </w:pPr>
+      <w:r>
+        <w:rPr>
+          <w:lang w:val="en-US"/>
+        </w:rPr>
+        <w:t>Affiliation:</w:t>
+      </w:r>
+      <w:r>
+        <w:rPr>
+          <w:lang w:val="en-US"/>
+        </w:rPr>
+        <w:t xml:space="preserve"> Arena</w:t>
+      </w:r>
+    </w:p>
+    <w:p>
+      <w:pPr>
+        <w:rPr>
+          <w:lang w:val="en-US"/>
+        </w:rPr>
+      </w:pPr>
+      <w:r>
+        <w:rPr>
+          <w:lang w:val="en-US"/>
+        </w:rPr>
+        <w:t>Abilities:</w:t>
+      </w:r>
+      <w:r>
+        <w:rPr>
+          <w:lang w:val="en-US"/>
+        </w:rPr>
+        <w:t xml:space="preserve"> </w:t>
+      </w:r>
+      <w:proofErr w:type="spellStart"/>
+      <w:r>
+        <w:rPr>
+          <w:lang w:val="en-US"/>
+        </w:rPr>
+        <w:t>Kerstice</w:t>
+      </w:r>
+      <w:proofErr w:type="spellEnd"/>
+    </w:p>
+    <w:p>
+      <w:pPr>
+        <w:rPr>
+          <w:lang w:val="en-US"/>
+        </w:rPr>
+      </w:pPr>
+      <w:r>
+        <w:rPr>
+          <w:lang w:val="en-US"/>
+        </w:rPr>
+        <w:t>Personality: happy go lucky, looking for a good fight to win</w:t>
+      </w:r>
+    </w:p>
+    <w:p>
+      <w:pPr>
+        <w:rPr>
+          <w:lang w:val="en-US"/>
+        </w:rPr>
+      </w:pPr>
+      <w:r>
+        <w:rPr>
+          <w:lang w:val="en-US"/>
+        </w:rPr>
+        <w:br/>
+        <w:t>Synopsis:</w:t>
       </w:r>
     </w:p>
     <w:p>
@@ -2947,11 +4233,19 @@
           <w:lang w:val="en-US"/>
         </w:rPr>
       </w:pPr>
-      <w:r>
-        <w:rPr>
-          <w:lang w:val="en-US"/>
-        </w:rPr>
-        <w:t>Bodyform:</w:t>
+      <w:proofErr w:type="spellStart"/>
+      <w:r>
+        <w:rPr>
+          <w:lang w:val="en-US"/>
+        </w:rPr>
+        <w:t>Bodyform</w:t>
+      </w:r>
+      <w:proofErr w:type="spellEnd"/>
+      <w:r>
+        <w:rPr>
+          <w:lang w:val="en-US"/>
+        </w:rPr>
+        <w:t>:</w:t>
       </w:r>
     </w:p>
     <w:p>
@@ -3175,11 +4469,19 @@
           <w:lang w:val="en-US"/>
         </w:rPr>
       </w:pPr>
-      <w:r>
-        <w:rPr>
-          <w:lang w:val="en-US"/>
-        </w:rPr>
-        <w:t>Bodyform:</w:t>
+      <w:proofErr w:type="spellStart"/>
+      <w:r>
+        <w:rPr>
+          <w:lang w:val="en-US"/>
+        </w:rPr>
+        <w:t>Bodyform</w:t>
+      </w:r>
+      <w:proofErr w:type="spellEnd"/>
+      <w:r>
+        <w:rPr>
+          <w:lang w:val="en-US"/>
+        </w:rPr>
+        <w:t>:</w:t>
       </w:r>
     </w:p>
     <w:p>
@@ -3370,12 +4672,14 @@
         </w:rPr>
         <w:t xml:space="preserve"> </w:t>
       </w:r>
+      <w:proofErr w:type="spellStart"/>
       <w:r>
         <w:rPr>
           <w:lang w:val="en-US"/>
         </w:rPr>
         <w:t>Dormir</w:t>
       </w:r>
+      <w:proofErr w:type="spellEnd"/>
     </w:p>
     <w:p>
       <w:pPr>
@@ -3396,11 +4700,19 @@
           <w:lang w:val="en-US"/>
         </w:rPr>
       </w:pPr>
-      <w:r>
-        <w:rPr>
-          <w:lang w:val="en-US"/>
-        </w:rPr>
-        <w:t>Bodyform:</w:t>
+      <w:proofErr w:type="spellStart"/>
+      <w:r>
+        <w:rPr>
+          <w:lang w:val="en-US"/>
+        </w:rPr>
+        <w:t>Bodyform</w:t>
+      </w:r>
+      <w:proofErr w:type="spellEnd"/>
+      <w:r>
+        <w:rPr>
+          <w:lang w:val="en-US"/>
+        </w:rPr>
+        <w:t>:</w:t>
       </w:r>
     </w:p>
     <w:p>
@@ -3592,12 +4904,14 @@
         </w:rPr>
         <w:t xml:space="preserve"> </w:t>
       </w:r>
+      <w:proofErr w:type="spellStart"/>
       <w:r>
         <w:rPr>
           <w:lang w:val="en-US"/>
         </w:rPr>
         <w:t>Lanilor</w:t>
       </w:r>
+      <w:proofErr w:type="spellEnd"/>
     </w:p>
     <w:p>
       <w:pPr>
@@ -3618,11 +4932,19 @@
           <w:lang w:val="en-US"/>
         </w:rPr>
       </w:pPr>
-      <w:r>
-        <w:rPr>
-          <w:lang w:val="en-US"/>
-        </w:rPr>
-        <w:t>Bodyform:</w:t>
+      <w:proofErr w:type="spellStart"/>
+      <w:r>
+        <w:rPr>
+          <w:lang w:val="en-US"/>
+        </w:rPr>
+        <w:t>Bodyform</w:t>
+      </w:r>
+      <w:proofErr w:type="spellEnd"/>
+      <w:r>
+        <w:rPr>
+          <w:lang w:val="en-US"/>
+        </w:rPr>
+        <w:t>:</w:t>
       </w:r>
     </w:p>
     <w:p>
@@ -3813,12 +5135,20 @@
         </w:rPr>
         <w:t xml:space="preserve"> </w:t>
       </w:r>
+      <w:proofErr w:type="spellStart"/>
       <w:r>
         <w:rPr>
           <w:lang w:val="en-US"/>
         </w:rPr>
         <w:t>Brod</w:t>
       </w:r>
+      <w:r>
+        <w:rPr>
+          <w:lang w:val="en-US"/>
+        </w:rPr>
+        <w:t>r</w:t>
+      </w:r>
+      <w:proofErr w:type="spellEnd"/>
     </w:p>
     <w:p>
       <w:pPr>
@@ -3839,11 +5169,19 @@
           <w:lang w:val="en-US"/>
         </w:rPr>
       </w:pPr>
-      <w:r>
-        <w:rPr>
-          <w:lang w:val="en-US"/>
-        </w:rPr>
-        <w:t>Bodyform:</w:t>
+      <w:proofErr w:type="spellStart"/>
+      <w:r>
+        <w:rPr>
+          <w:lang w:val="en-US"/>
+        </w:rPr>
+        <w:t>Bodyform</w:t>
+      </w:r>
+      <w:proofErr w:type="spellEnd"/>
+      <w:r>
+        <w:rPr>
+          <w:lang w:val="en-US"/>
+        </w:rPr>
+        <w:t>:</w:t>
       </w:r>
     </w:p>
     <w:p>
@@ -4061,11 +5399,19 @@
           <w:lang w:val="en-US"/>
         </w:rPr>
       </w:pPr>
-      <w:r>
-        <w:rPr>
-          <w:lang w:val="en-US"/>
-        </w:rPr>
-        <w:t>Bodyform:</w:t>
+      <w:proofErr w:type="spellStart"/>
+      <w:r>
+        <w:rPr>
+          <w:lang w:val="en-US"/>
+        </w:rPr>
+        <w:t>Bodyform</w:t>
+      </w:r>
+      <w:proofErr w:type="spellEnd"/>
+      <w:r>
+        <w:rPr>
+          <w:lang w:val="en-US"/>
+        </w:rPr>
+        <w:t>:</w:t>
       </w:r>
     </w:p>
     <w:p>
@@ -4132,6 +5478,20 @@
         </w:rPr>
         <w:t>Abilities:</w:t>
       </w:r>
+      <w:r>
+        <w:rPr>
+          <w:lang w:val="en-US"/>
+        </w:rPr>
+        <w:t xml:space="preserve"> </w:t>
+      </w:r>
+      <w:proofErr w:type="spellStart"/>
+      <w:r>
+        <w:rPr>
+          <w:lang w:val="en-US"/>
+        </w:rPr>
+        <w:t>Tristice</w:t>
+      </w:r>
+      <w:proofErr w:type="spellEnd"/>
     </w:p>
     <w:p>
       <w:pPr>
@@ -4257,13 +5617,15 @@
         <w:t xml:space="preserve"> </w:t>
       </w:r>
       <w:bookmarkStart w:id="1" w:name="_Hlk224676340"/>
-      <w:r>
-        <w:rPr>
-          <w:lang w:val="en-US"/>
-        </w:rPr>
-        <w:t>Jazialilin</w:t>
+      <w:proofErr w:type="spellStart"/>
+      <w:r>
+        <w:rPr>
+          <w:lang w:val="en-US"/>
+        </w:rPr>
+        <w:t>Jazialin</w:t>
       </w:r>
       <w:bookmarkEnd w:id="1"/>
+      <w:proofErr w:type="spellEnd"/>
     </w:p>
     <w:p>
       <w:pPr>
@@ -4284,11 +5646,19 @@
           <w:lang w:val="en-US"/>
         </w:rPr>
       </w:pPr>
-      <w:r>
-        <w:rPr>
-          <w:lang w:val="en-US"/>
-        </w:rPr>
-        <w:t>Bodyform:</w:t>
+      <w:proofErr w:type="spellStart"/>
+      <w:r>
+        <w:rPr>
+          <w:lang w:val="en-US"/>
+        </w:rPr>
+        <w:t>Bodyform</w:t>
+      </w:r>
+      <w:proofErr w:type="spellEnd"/>
+      <w:r>
+        <w:rPr>
+          <w:lang w:val="en-US"/>
+        </w:rPr>
+        <w:t>:</w:t>
       </w:r>
     </w:p>
     <w:p>
@@ -4354,6 +5724,26 @@
           <w:lang w:val="en-US"/>
         </w:rPr>
         <w:t>Abilities:</w:t>
+      </w:r>
+      <w:r>
+        <w:rPr>
+          <w:lang w:val="en-US"/>
+        </w:rPr>
+        <w:t xml:space="preserve"> </w:t>
+      </w:r>
+      <w:proofErr w:type="spellStart"/>
+      <w:r>
+        <w:rPr>
+          <w:lang w:val="en-US"/>
+        </w:rPr>
+        <w:t>Knive</w:t>
+      </w:r>
+      <w:proofErr w:type="spellEnd"/>
+      <w:r>
+        <w:rPr>
+          <w:lang w:val="en-US"/>
+        </w:rPr>
+        <w:t xml:space="preserve"> fighter</w:t>
       </w:r>
     </w:p>
     <w:p>
@@ -4502,12 +5892,28 @@
         </w:rPr>
         <w:t xml:space="preserve"> </w:t>
       </w:r>
-      <w:r>
-        <w:rPr>
-          <w:lang w:val="en-US"/>
-        </w:rPr>
-        <w:t>Kavair Trelid</w:t>
-      </w:r>
+      <w:proofErr w:type="spellStart"/>
+      <w:r>
+        <w:rPr>
+          <w:lang w:val="en-US"/>
+        </w:rPr>
+        <w:t>Kavair</w:t>
+      </w:r>
+      <w:proofErr w:type="spellEnd"/>
+      <w:r>
+        <w:rPr>
+          <w:lang w:val="en-US"/>
+        </w:rPr>
+        <w:t xml:space="preserve"> </w:t>
+      </w:r>
+      <w:proofErr w:type="spellStart"/>
+      <w:r>
+        <w:rPr>
+          <w:lang w:val="en-US"/>
+        </w:rPr>
+        <w:t>Trelid</w:t>
+      </w:r>
+      <w:proofErr w:type="spellEnd"/>
     </w:p>
     <w:p>
       <w:pPr>
@@ -4528,11 +5934,19 @@
           <w:lang w:val="en-US"/>
         </w:rPr>
       </w:pPr>
-      <w:r>
-        <w:rPr>
-          <w:lang w:val="en-US"/>
-        </w:rPr>
-        <w:t>Bodyform:</w:t>
+      <w:proofErr w:type="spellStart"/>
+      <w:r>
+        <w:rPr>
+          <w:lang w:val="en-US"/>
+        </w:rPr>
+        <w:t>Bodyform</w:t>
+      </w:r>
+      <w:proofErr w:type="spellEnd"/>
+      <w:r>
+        <w:rPr>
+          <w:lang w:val="en-US"/>
+        </w:rPr>
+        <w:t>:</w:t>
       </w:r>
     </w:p>
     <w:p>
@@ -4551,7 +5965,35 @@
         <w:rPr>
           <w:lang w:val="en-US"/>
         </w:rPr>
-        <w:t xml:space="preserve"> Married to Siinal Trelid (holy last name)</w:t>
+        <w:t xml:space="preserve"> Married to </w:t>
+      </w:r>
+      <w:proofErr w:type="spellStart"/>
+      <w:r>
+        <w:rPr>
+          <w:lang w:val="en-US"/>
+        </w:rPr>
+        <w:t>Siinal</w:t>
+      </w:r>
+      <w:proofErr w:type="spellEnd"/>
+      <w:r>
+        <w:rPr>
+          <w:lang w:val="en-US"/>
+        </w:rPr>
+        <w:t xml:space="preserve"> </w:t>
+      </w:r>
+      <w:proofErr w:type="spellStart"/>
+      <w:r>
+        <w:rPr>
+          <w:lang w:val="en-US"/>
+        </w:rPr>
+        <w:t>Trelid</w:t>
+      </w:r>
+      <w:proofErr w:type="spellEnd"/>
+      <w:r>
+        <w:rPr>
+          <w:lang w:val="en-US"/>
+        </w:rPr>
+        <w:t xml:space="preserve"> (holy last name)</w:t>
       </w:r>
     </w:p>
     <w:p>
@@ -4629,12 +6071,14 @@
         </w:rPr>
         <w:t xml:space="preserve"> </w:t>
       </w:r>
+      <w:proofErr w:type="spellStart"/>
       <w:r>
         <w:rPr>
           <w:lang w:val="en-US"/>
         </w:rPr>
         <w:t>Shistice</w:t>
       </w:r>
+      <w:proofErr w:type="spellEnd"/>
     </w:p>
     <w:p>
       <w:pPr>
@@ -4760,12 +6204,28 @@
           </mc:Fallback>
         </mc:AlternateContent>
       </w:r>
-      <w:r>
-        <w:rPr>
-          <w:lang w:val="en-US"/>
-        </w:rPr>
-        <w:t>Siinal Trelid</w:t>
-      </w:r>
+      <w:proofErr w:type="spellStart"/>
+      <w:r>
+        <w:rPr>
+          <w:lang w:val="en-US"/>
+        </w:rPr>
+        <w:t>Siinal</w:t>
+      </w:r>
+      <w:proofErr w:type="spellEnd"/>
+      <w:r>
+        <w:rPr>
+          <w:lang w:val="en-US"/>
+        </w:rPr>
+        <w:t xml:space="preserve"> </w:t>
+      </w:r>
+      <w:proofErr w:type="spellStart"/>
+      <w:r>
+        <w:rPr>
+          <w:lang w:val="en-US"/>
+        </w:rPr>
+        <w:t>Trelid</w:t>
+      </w:r>
+      <w:proofErr w:type="spellEnd"/>
     </w:p>
     <w:p>
       <w:pPr>
@@ -4786,11 +6246,19 @@
           <w:lang w:val="en-US"/>
         </w:rPr>
       </w:pPr>
-      <w:r>
-        <w:rPr>
-          <w:lang w:val="en-US"/>
-        </w:rPr>
-        <w:t>Bodyform:</w:t>
+      <w:proofErr w:type="spellStart"/>
+      <w:r>
+        <w:rPr>
+          <w:lang w:val="en-US"/>
+        </w:rPr>
+        <w:t>Bodyform</w:t>
+      </w:r>
+      <w:proofErr w:type="spellEnd"/>
+      <w:r>
+        <w:rPr>
+          <w:lang w:val="en-US"/>
+        </w:rPr>
+        <w:t>:</w:t>
       </w:r>
     </w:p>
     <w:p>
@@ -4809,7 +6277,35 @@
         <w:rPr>
           <w:lang w:val="en-US"/>
         </w:rPr>
-        <w:t xml:space="preserve"> Married to Kaviar Trelid (holy last name)</w:t>
+        <w:t xml:space="preserve"> Married to </w:t>
+      </w:r>
+      <w:proofErr w:type="spellStart"/>
+      <w:r>
+        <w:rPr>
+          <w:lang w:val="en-US"/>
+        </w:rPr>
+        <w:t>Kaviar</w:t>
+      </w:r>
+      <w:proofErr w:type="spellEnd"/>
+      <w:r>
+        <w:rPr>
+          <w:lang w:val="en-US"/>
+        </w:rPr>
+        <w:t xml:space="preserve"> </w:t>
+      </w:r>
+      <w:proofErr w:type="spellStart"/>
+      <w:r>
+        <w:rPr>
+          <w:lang w:val="en-US"/>
+        </w:rPr>
+        <w:t>Trelid</w:t>
+      </w:r>
+      <w:proofErr w:type="spellEnd"/>
+      <w:r>
+        <w:rPr>
+          <w:lang w:val="en-US"/>
+        </w:rPr>
+        <w:t xml:space="preserve"> (holy last name)</w:t>
       </w:r>
     </w:p>
     <w:p>
@@ -4887,12 +6383,14 @@
         </w:rPr>
         <w:t xml:space="preserve"> </w:t>
       </w:r>
+      <w:proofErr w:type="spellStart"/>
       <w:r>
         <w:rPr>
           <w:lang w:val="en-US"/>
         </w:rPr>
         <w:t>Shaikstice</w:t>
       </w:r>
+      <w:proofErr w:type="spellEnd"/>
     </w:p>
     <w:p>
       <w:pPr>
@@ -4924,7 +6422,21 @@
         <w:rPr>
           <w:lang w:val="en-US"/>
         </w:rPr>
-        <w:t xml:space="preserve"> Believes her husbands visions and follows him into the fight</w:t>
+        <w:t xml:space="preserve"> Believes her </w:t>
+      </w:r>
+      <w:proofErr w:type="spellStart"/>
+      <w:r>
+        <w:rPr>
+          <w:lang w:val="en-US"/>
+        </w:rPr>
+        <w:t>husbands</w:t>
+      </w:r>
+      <w:proofErr w:type="spellEnd"/>
+      <w:r>
+        <w:rPr>
+          <w:lang w:val="en-US"/>
+        </w:rPr>
+        <w:t xml:space="preserve"> visions and follows him into the fight</w:t>
       </w:r>
     </w:p>
     <w:p>
@@ -5585,7 +7097,7 @@
   <w:style w:type="paragraph" w:default="1" w:styleId="Standard">
     <w:name w:val="Normal"/>
     <w:qFormat/>
-    <w:rsid w:val="001749A0"/>
+    <w:rsid w:val="005A75EA"/>
   </w:style>
   <w:style w:type="paragraph" w:styleId="berschrift1">
     <w:name w:val="heading 1"/>

</xml_diff>

<commit_message>
Deployed c2a7976 with MkDocs version: 1.6.1
</commit_message>
<xml_diff>
--- a/Buch Camille Chronicles/Character-Bios.docx
+++ b/Buch Camille Chronicles/Character-Bios.docx
@@ -273,7 +273,7 @@
         <w:rPr>
           <w:lang w:val="en-US"/>
         </w:rPr>
-        <w:t>Camille and family</w:t>
+        <w:t>Camill and family</w:t>
       </w:r>
     </w:p>
     <w:p>
@@ -364,7 +364,7 @@
         <w:rPr>
           <w:lang w:val="en-US"/>
         </w:rPr>
-        <w:t>Camille Bulwer</w:t>
+        <w:t>Camill Bulwer</w:t>
       </w:r>
     </w:p>
     <w:p>
@@ -547,7 +547,19 @@
         <w:rPr>
           <w:lang w:val="en-US"/>
         </w:rPr>
-        <w:t>Personality: Springy, snappy, caring, selfless arrogant</w:t>
+        <w:t>Personality: Springy, snappy, caring, selfless</w:t>
+      </w:r>
+      <w:r>
+        <w:rPr>
+          <w:lang w:val="en-US"/>
+        </w:rPr>
+        <w:t>ly</w:t>
+      </w:r>
+      <w:r>
+        <w:rPr>
+          <w:lang w:val="en-US"/>
+        </w:rPr>
+        <w:t xml:space="preserve"> arrogant</w:t>
       </w:r>
     </w:p>
     <w:p>
@@ -724,6 +736,26 @@
         </w:rPr>
         <w:t>Heritage:</w:t>
       </w:r>
+      <w:r>
+        <w:rPr>
+          <w:lang w:val="en-US"/>
+        </w:rPr>
+        <w:t xml:space="preserve"> </w:t>
+      </w:r>
+      <w:proofErr w:type="spellStart"/>
+      <w:r>
+        <w:rPr>
+          <w:lang w:val="en-US"/>
+        </w:rPr>
+        <w:t>Tresmor’s</w:t>
+      </w:r>
+      <w:proofErr w:type="spellEnd"/>
+      <w:r>
+        <w:rPr>
+          <w:lang w:val="en-US"/>
+        </w:rPr>
+        <w:t xml:space="preserve"> Venture</w:t>
+      </w:r>
     </w:p>
     <w:p>
       <w:pPr>
@@ -737,6 +769,12 @@
         </w:rPr>
         <w:t>Domicile:</w:t>
       </w:r>
+      <w:r>
+        <w:rPr>
+          <w:lang w:val="en-US"/>
+        </w:rPr>
+        <w:t xml:space="preserve"> Camill’s mind</w:t>
+      </w:r>
     </w:p>
     <w:p>
       <w:pPr>
@@ -787,6 +825,12 @@
           <w:lang w:val="en-US"/>
         </w:rPr>
         <w:t xml:space="preserve"> </w:t>
+      </w:r>
+      <w:r>
+        <w:rPr>
+          <w:lang w:val="en-US"/>
+        </w:rPr>
+        <w:t xml:space="preserve">Farming, </w:t>
       </w:r>
       <w:proofErr w:type="spellStart"/>
       <w:r>
@@ -827,7 +871,7 @@
         <w:rPr>
           <w:lang w:val="en-US"/>
         </w:rPr>
-        <w:t xml:space="preserve"> The Soul that is bound to Camille, tells that he had died of old age </w:t>
+        <w:t xml:space="preserve"> The Soul that is bound to Camill, tells that he had died of old age </w:t>
       </w:r>
       <w:r>
         <w:rPr>
@@ -839,7 +883,7 @@
         <w:rPr>
           <w:lang w:val="en-US"/>
         </w:rPr>
-        <w:t xml:space="preserve">so Camille could acquire </w:t>
+        <w:t xml:space="preserve">so Camill could acquire </w:t>
       </w:r>
       <w:proofErr w:type="spellStart"/>
       <w:r>
@@ -944,7 +988,7 @@
         <w:rPr>
           <w:lang w:val="en-US"/>
         </w:rPr>
-        <w:t>Camille Mother</w:t>
+        <w:t>Camill Mother</w:t>
       </w:r>
     </w:p>
     <w:p>
@@ -1164,19 +1208,11 @@
           </mc:Fallback>
         </mc:AlternateContent>
       </w:r>
-      <w:proofErr w:type="spellStart"/>
-      <w:r>
-        <w:rPr>
-          <w:lang w:val="en-US"/>
-        </w:rPr>
-        <w:t>Camilel</w:t>
-      </w:r>
-      <w:proofErr w:type="spellEnd"/>
-      <w:r>
-        <w:rPr>
-          <w:lang w:val="en-US"/>
-        </w:rPr>
-        <w:t xml:space="preserve"> Father</w:t>
+      <w:r>
+        <w:rPr>
+          <w:lang w:val="en-US"/>
+        </w:rPr>
+        <w:t>Camill Father</w:t>
       </w:r>
     </w:p>
     <w:p>
@@ -3420,7 +3456,7 @@
         <w:rPr>
           <w:lang w:val="en-US"/>
         </w:rPr>
-        <w:t xml:space="preserve">Trella, </w:t>
+        <w:t xml:space="preserve">Trell, </w:t>
       </w:r>
       <w:r>
         <w:rPr>
@@ -4441,13 +4477,13 @@
         <w:rPr>
           <w:lang w:val="en-US"/>
         </w:rPr>
-        <w:t>Jevan Dra-</w:t>
-      </w:r>
-      <w:r>
-        <w:rPr>
-          <w:lang w:val="en-US"/>
-        </w:rPr>
-        <w:t>N</w:t>
+        <w:t>Jevan Dra</w:t>
+      </w:r>
+      <w:r>
+        <w:rPr>
+          <w:lang w:val="en-US"/>
+        </w:rPr>
+        <w:t>g-N</w:t>
       </w:r>
     </w:p>
     <w:p>
@@ -4547,6 +4583,12 @@
           <w:lang w:val="en-US"/>
         </w:rPr>
         <w:t>Abilities:</w:t>
+      </w:r>
+      <w:r>
+        <w:rPr>
+          <w:lang w:val="en-US"/>
+        </w:rPr>
+        <w:t xml:space="preserve"> </w:t>
       </w:r>
     </w:p>
     <w:p>
@@ -4574,6 +4616,26 @@
         </w:rPr>
         <w:br/>
         <w:t>Synopsis:</w:t>
+      </w:r>
+      <w:r>
+        <w:rPr>
+          <w:lang w:val="en-US"/>
+        </w:rPr>
+        <w:t xml:space="preserve"> His Stice is Jeril Ormarill, former wife of </w:t>
+      </w:r>
+      <w:proofErr w:type="spellStart"/>
+      <w:r>
+        <w:rPr>
+          <w:lang w:val="en-US"/>
+        </w:rPr>
+        <w:t>Herriar</w:t>
+      </w:r>
+      <w:proofErr w:type="spellEnd"/>
+      <w:r>
+        <w:rPr>
+          <w:lang w:val="en-US"/>
+        </w:rPr>
+        <w:t xml:space="preserve"> that had died in a house fire</w:t>
       </w:r>
     </w:p>
     <w:p>
@@ -5519,6 +5581,12 @@
         <w:br/>
         <w:t>Synopsis:</w:t>
       </w:r>
+      <w:r>
+        <w:rPr>
+          <w:lang w:val="en-US"/>
+        </w:rPr>
+        <w:t xml:space="preserve"> Was also fighting in the arena until debt had overcome her in the days that Camillw as on the street.</w:t>
+      </w:r>
     </w:p>
     <w:p>
       <w:pPr>
@@ -5885,12 +5953,6 @@
             </w:pict>
           </mc:Fallback>
         </mc:AlternateContent>
-      </w:r>
-      <w:r>
-        <w:rPr>
-          <w:lang w:val="en-US"/>
-        </w:rPr>
-        <w:t xml:space="preserve"> </w:t>
       </w:r>
       <w:proofErr w:type="spellStart"/>
       <w:r>

</xml_diff>